<commit_message>
2nd Version of Adversarial Quiz
</commit_message>
<xml_diff>
--- a/Quiz.docx
+++ b/Quiz.docx
@@ -41,7 +41,13 @@
     </w:p>
     <w:p>
       <w:r>
-        <w:t xml:space="preserve">Question 1: In the context of the Vanilla Saliency (Integrated Gradients) approach, which rule states that </w:t>
+        <w:t xml:space="preserve">Question 1: In the context of </w:t>
+      </w:r>
+      <w:r>
+        <w:t>attribution methods such as the</w:t>
+      </w:r>
+      <w:r>
+        <w:t xml:space="preserve"> Vanilla Saliency (Integrated Gradients) approach, which rule states that </w:t>
       </w:r>
       <w:r>
         <w:t>attribution should be identical for two neural networks that are functionally equivalent, regardless of their internal architectures</w:t>
@@ -62,10 +68,19 @@
         <w:t>Sensitivity</w:t>
       </w:r>
       <w:r>
-        <w:t xml:space="preserve"> – This </w:t>
-      </w:r>
-      <w:r>
-        <w:t>focuses on the input-output relationship (If a feature changes the output, it should receive non-zero attribution), not model equivalence</w:t>
+        <w:t xml:space="preserve"> – </w:t>
+      </w:r>
+      <w:r>
+        <w:t>Sensitivity</w:t>
+      </w:r>
+      <w:r>
+        <w:t xml:space="preserve"> </w:t>
+      </w:r>
+      <w:r>
+        <w:t xml:space="preserve">focuses on the input-output relationship (If a feature changes the output, it should receive non-zero attribution), not </w:t>
+      </w:r>
+      <w:r>
+        <w:t>whether two models give similar attributions</w:t>
       </w:r>
     </w:p>
     <w:p>
@@ -83,10 +98,16 @@
         <w:t xml:space="preserve"> - </w:t>
       </w:r>
       <w:r>
-        <w:t xml:space="preserve"> This focuses on the amount of attribution that is assigned </w:t>
-      </w:r>
-      <w:r>
-        <w:t>overall not whether two models give the same explanation</w:t>
+        <w:t xml:space="preserve"> This focuses on the </w:t>
+      </w:r>
+      <w:r>
+        <w:t xml:space="preserve">total </w:t>
+      </w:r>
+      <w:r>
+        <w:t xml:space="preserve">amount of attribution that is assigned </w:t>
+      </w:r>
+      <w:r>
+        <w:t>overall</w:t>
       </w:r>
     </w:p>
     <w:p>
@@ -119,10 +140,22 @@
         <w:t>Input Invariance</w:t>
       </w:r>
       <w:r>
-        <w:t xml:space="preserve"> – This deals </w:t>
-      </w:r>
-      <w:r>
-        <w:t>with input transformations (If the input is transformed in a way that doesn’t affect predictions, attribution shouldn’t change) and not the transformation of the model.</w:t>
+        <w:t xml:space="preserve"> – </w:t>
+      </w:r>
+      <w:r>
+        <w:t xml:space="preserve">This rule </w:t>
+      </w:r>
+      <w:r>
+        <w:t>relates to the fact that if</w:t>
+      </w:r>
+      <w:r>
+        <w:t xml:space="preserve"> the input is transformed in a way that doesn’t affect predictions, </w:t>
+      </w:r>
+      <w:r>
+        <w:t xml:space="preserve">the </w:t>
+      </w:r>
+      <w:r>
+        <w:t xml:space="preserve">attribution shouldn’t change </w:t>
       </w:r>
     </w:p>
     <w:p>
@@ -135,15 +168,7 @@
     </w:p>
     <w:p>
       <w:r>
-        <w:t xml:space="preserve">Question 2: What is the primary mechanism used by </w:t>
-      </w:r>
-      <w:proofErr w:type="spellStart"/>
-      <w:r>
-        <w:t>SmoothGrad</w:t>
-      </w:r>
-      <w:proofErr w:type="spellEnd"/>
-      <w:r>
-        <w:t xml:space="preserve"> to reduce the visual noise found in standard gradient-based sensitivity maps?</w:t>
+        <w:t>Question 2: What is the primary mechanism used by SmoothGrad to reduce the visual noise found in standard gradient-based sensitivity maps?</w:t>
       </w:r>
     </w:p>
     <w:p>
@@ -160,17 +185,8 @@
       <w:r>
         <w:t xml:space="preserve"> - </w:t>
       </w:r>
-      <w:proofErr w:type="spellStart"/>
-      <w:r>
-        <w:t>SmoothGrad</w:t>
-      </w:r>
-      <w:proofErr w:type="spellEnd"/>
-      <w:r>
-        <w:t xml:space="preserve"> calculates </w:t>
-      </w:r>
-      <w:proofErr w:type="spellStart"/>
-      <w:r>
-        <w:t>M^</w:t>
+      <w:r>
+        <w:t>SmoothGrad calculates M^</w:t>
       </w:r>
       <w:r>
         <w:rPr>
@@ -178,7 +194,6 @@
         </w:rPr>
         <w:t>c</w:t>
       </w:r>
-      <w:proofErr w:type="spellEnd"/>
       <w:r>
         <w:t xml:space="preserve"> (x) = 1/n </w:t>
       </w:r>
@@ -309,7 +324,13 @@
         </w:numPr>
       </w:pPr>
       <w:r>
-        <w:t>Applying a Laplacian edge-detection filter to the raw gradient</w:t>
+        <w:t xml:space="preserve">Applying a </w:t>
+      </w:r>
+      <w:r>
+        <w:t>Gaussian blur to the saliency map after calculating</w:t>
+      </w:r>
+      <w:r>
+        <w:t xml:space="preserve"> the raw gradient</w:t>
       </w:r>
       <w:r>
         <w:t xml:space="preserve"> – This is a common misconception due to visual similarity</w:t>
@@ -470,10 +491,7 @@
     </w:p>
     <w:p>
       <w:r>
-        <w:t>Question 4: W</w:t>
-      </w:r>
-      <w:r>
-        <w:t>hat was the surprising finding regarding some popular attribution methods?</w:t>
+        <w:t>Question 4: What was the surprising finding regarding some popular attribution methods?</w:t>
       </w:r>
     </w:p>
     <w:p>
@@ -549,18 +567,7 @@
     </w:p>
     <w:p>
       <w:r>
-        <w:t xml:space="preserve">Question 5: </w:t>
-      </w:r>
-      <w:r>
-        <w:t xml:space="preserve">Which hyperparameter in </w:t>
-      </w:r>
-      <w:proofErr w:type="spellStart"/>
-      <w:r>
-        <w:t>SmoothGrad</w:t>
-      </w:r>
-      <w:proofErr w:type="spellEnd"/>
-      <w:r>
-        <w:t xml:space="preserve"> refers to the standard deviation of the Gaussian perturbations applied to the input?</w:t>
+        <w:t>Question 5: Which hyperparameter in SmoothGrad refers to the standard deviation of the Gaussian perturbations applied to the input?</w:t>
       </w:r>
     </w:p>
     <w:p>
@@ -581,7 +588,10 @@
         <w:t>c</w:t>
       </w:r>
       <w:r>
-        <w:t xml:space="preserve"> – This refers to the gradient</w:t>
+        <w:t xml:space="preserve"> – This refers to the </w:t>
+      </w:r>
+      <w:r>
+        <w:t>saliency map output and it is not a hyperparameter</w:t>
       </w:r>
     </w:p>
     <w:p>
@@ -593,49 +603,440 @@
         </w:numPr>
       </w:pPr>
       <w:r>
+        <w:t>σ (Correct Answer)</w:t>
+      </w:r>
+      <w:r>
+        <w:t xml:space="preserve"> - </w:t>
+      </w:r>
+      <w:r>
+        <w:t>the noise level σ determines the scale of random perturbations, with 10%-20% often cited as an ideal range for visual coherence.</w:t>
+      </w:r>
+    </w:p>
+    <w:p>
+      <w:pPr>
+        <w:pStyle w:val="ListParagraph"/>
+        <w:numPr>
+          <w:ilvl w:val="0"/>
+          <w:numId w:val="6"/>
+        </w:numPr>
+      </w:pPr>
+      <w:r>
+        <w:t>n – This refers to the number of samples</w:t>
+      </w:r>
+    </w:p>
+    <w:p>
+      <w:pPr>
+        <w:pStyle w:val="ListParagraph"/>
+        <w:numPr>
+          <w:ilvl w:val="0"/>
+          <w:numId w:val="6"/>
+        </w:numPr>
+      </w:pPr>
+      <w:r>
         <w:t>σ</w:t>
       </w:r>
       <w:r>
+        <w:rPr>
+          <w:vertAlign w:val="superscript"/>
+        </w:rPr>
+        <w:t>2</w:t>
+      </w:r>
+      <w:r>
+        <w:t xml:space="preserve"> – This </w:t>
+      </w:r>
+      <w:r>
+        <w:t>refers to the variance, which appears in notation but it is not directly used as the tuning parameters</w:t>
+      </w:r>
+    </w:p>
+    <w:p>
+      <w:r>
+        <w:t>Pitfall:</w:t>
+      </w:r>
+      <w:r>
+        <w:t xml:space="preserve"> </w:t>
+      </w:r>
+      <w:r>
+        <w:t>Confusing variance notation with the actual parameter used in implementation.</w:t>
+      </w:r>
+    </w:p>
+    <w:p/>
+    <w:p>
+      <w:r>
+        <w:t>Question 6:</w:t>
+      </w:r>
+      <w:r>
+        <w:t xml:space="preserve"> Why might a 'vanilla' gradient be an unreliable proxy for feature importance when a feature 'saturates' the class score function?</w:t>
+      </w:r>
+    </w:p>
+    <w:p>
+      <w:pPr>
+        <w:pStyle w:val="ListParagraph"/>
+        <w:numPr>
+          <w:ilvl w:val="0"/>
+          <w:numId w:val="7"/>
+        </w:numPr>
+      </w:pPr>
+      <w:r>
+        <w:lastRenderedPageBreak/>
+        <w:t>The local derivative becomes small even if the feature has a strong global influence. (Correct Answer)</w:t>
+      </w:r>
+      <w:r>
+        <w:t xml:space="preserve"> - W</w:t>
+      </w:r>
+      <w:r>
+        <w:t>hen the function flattens out (saturates), the gradient approaches zero, failing to capture the importance of the feature that caused the high score.</w:t>
+      </w:r>
+    </w:p>
+    <w:p>
+      <w:pPr>
+        <w:pStyle w:val="ListParagraph"/>
+        <w:numPr>
+          <w:ilvl w:val="0"/>
+          <w:numId w:val="7"/>
+        </w:numPr>
+      </w:pPr>
+      <w:r>
+        <w:t>The gradient increases exponentially, leading to 'exploding' attribution values.</w:t>
+      </w:r>
+      <w:r>
+        <w:t xml:space="preserve"> – This is the opposite of the issue that is being discussed</w:t>
+      </w:r>
+    </w:p>
+    <w:p>
+      <w:pPr>
+        <w:pStyle w:val="ListParagraph"/>
+        <w:numPr>
+          <w:ilvl w:val="0"/>
+          <w:numId w:val="7"/>
+        </w:numPr>
+      </w:pPr>
+      <w:r>
+        <w:t>The gradient is unable to handle negative pixel values in saturated regions.</w:t>
+      </w:r>
+      <w:r>
+        <w:t xml:space="preserve"> – This is not true and it is poorly represented</w:t>
+      </w:r>
+    </w:p>
+    <w:p>
+      <w:pPr>
+        <w:pStyle w:val="ListParagraph"/>
+        <w:numPr>
+          <w:ilvl w:val="0"/>
+          <w:numId w:val="7"/>
+        </w:numPr>
+      </w:pPr>
+      <w:r>
+        <w:t>Saturated features always introduce random noise into the back-propagation calculation.</w:t>
+      </w:r>
+      <w:r>
+        <w:t xml:space="preserve"> – This randomness is not caused by saturation</w:t>
+      </w:r>
+    </w:p>
+    <w:p>
+      <w:r>
+        <w:t xml:space="preserve">Pitfall: </w:t>
+      </w:r>
+      <w:r>
+        <w:t>Assuming gradients always reflect importance.</w:t>
+      </w:r>
+    </w:p>
+    <w:p>
+      <w:r>
+        <w:t xml:space="preserve">Question </w:t>
+      </w:r>
+      <w:r>
+        <w:t>7</w:t>
+      </w:r>
+      <w:r>
+        <w:t xml:space="preserve">: </w:t>
+      </w:r>
+      <w:r>
+        <w:t xml:space="preserve">What adjustments does </w:t>
+      </w:r>
+      <w:r>
+        <w:t>Guided Backpropagation apply during the backward pass?</w:t>
+      </w:r>
+    </w:p>
+    <w:p>
+      <w:pPr>
+        <w:pStyle w:val="ListParagraph"/>
+        <w:numPr>
+          <w:ilvl w:val="0"/>
+          <w:numId w:val="8"/>
+        </w:numPr>
+      </w:pPr>
+      <w:r>
+        <w:t>It clips the negative gradients at ReLU layers, allowing only positive signals to pass (Correct Answer)</w:t>
+      </w:r>
+      <w:r>
+        <w:t xml:space="preserve"> </w:t>
+      </w:r>
+      <w:r>
+        <w:t>–</w:t>
+      </w:r>
+      <w:r>
+        <w:t xml:space="preserve"> </w:t>
+      </w:r>
+      <w:r>
+        <w:t xml:space="preserve">This </w:t>
+      </w:r>
+      <w:r>
+        <w:t>ensures that only features that positively contribute to the activation are propagated backwards.</w:t>
+      </w:r>
+    </w:p>
+    <w:p>
+      <w:pPr>
+        <w:pStyle w:val="ListParagraph"/>
+        <w:numPr>
+          <w:ilvl w:val="0"/>
+          <w:numId w:val="8"/>
+        </w:numPr>
+      </w:pPr>
+      <w:r>
+        <w:t>It averages the gradients over multiple noisy inputs to reduce variance</w:t>
+      </w:r>
+      <w:r>
+        <w:t xml:space="preserve"> – This </w:t>
+      </w:r>
+      <w:r>
+        <w:t>option describes SmoothGrad</w:t>
+      </w:r>
+    </w:p>
+    <w:p>
+      <w:pPr>
+        <w:pStyle w:val="ListParagraph"/>
+        <w:numPr>
+          <w:ilvl w:val="0"/>
+          <w:numId w:val="8"/>
+        </w:numPr>
+      </w:pPr>
+      <w:r>
+        <w:t>It multiplies gradients by the input image to improve localisation – This refers to a different attribution method</w:t>
+      </w:r>
+    </w:p>
+    <w:p>
+      <w:pPr>
+        <w:pStyle w:val="ListParagraph"/>
+        <w:numPr>
+          <w:ilvl w:val="0"/>
+          <w:numId w:val="8"/>
+        </w:numPr>
+      </w:pPr>
+      <w:r>
+        <w:t>It removes ReLU activations entirely during backpropagation – This would break the model’s structure</w:t>
+      </w:r>
+    </w:p>
+    <w:p>
+      <w:r>
+        <w:t xml:space="preserve">Pitfall: </w:t>
+      </w:r>
+      <w:r>
+        <w:t xml:space="preserve">Confusing </w:t>
+      </w:r>
+      <w:r>
+        <w:t>gradient filtering with gradient averages</w:t>
+      </w:r>
+      <w:r>
+        <w:t>.</w:t>
+      </w:r>
+    </w:p>
+    <w:p>
+      <w:r>
+        <w:t xml:space="preserve">Question </w:t>
+      </w:r>
+      <w:r>
+        <w:t>8</w:t>
+      </w:r>
+      <w:r>
+        <w:t>:</w:t>
+      </w:r>
+      <w:r>
+        <w:t xml:space="preserve"> The requirement that a saliency method should mirror the sensitivity of the model when the input is transformed by a constant shift is called:</w:t>
+      </w:r>
+    </w:p>
+    <w:p>
+      <w:pPr>
+        <w:pStyle w:val="ListParagraph"/>
+        <w:numPr>
+          <w:ilvl w:val="0"/>
+          <w:numId w:val="9"/>
+        </w:numPr>
+      </w:pPr>
+      <w:r>
+        <w:t>Input Invariance (Correct Answer)</w:t>
+      </w:r>
+      <w:r>
+        <w:t xml:space="preserve"> - </w:t>
+      </w:r>
+      <w:r>
+        <w:t>Input Invariance ensures that if a pre-processing step does not change the model’s output, it should not fundamentally change the attribution.</w:t>
+      </w:r>
+    </w:p>
+    <w:p>
+      <w:pPr>
+        <w:pStyle w:val="ListParagraph"/>
+        <w:numPr>
+          <w:ilvl w:val="0"/>
+          <w:numId w:val="9"/>
+        </w:numPr>
+      </w:pPr>
+      <w:r>
+        <w:t xml:space="preserve">Sensitivity </w:t>
+      </w:r>
+      <w:r>
+        <w:t xml:space="preserve">– This </w:t>
+      </w:r>
+      <w:r>
+        <w:t xml:space="preserve">relates to </w:t>
+      </w:r>
+      <w:r>
+        <w:t>non-zero attribution, not invariance</w:t>
+      </w:r>
+    </w:p>
+    <w:p>
+      <w:pPr>
+        <w:pStyle w:val="ListParagraph"/>
+        <w:numPr>
+          <w:ilvl w:val="0"/>
+          <w:numId w:val="9"/>
+        </w:numPr>
+      </w:pPr>
+      <w:r>
+        <w:t>Implementation Invariance</w:t>
+      </w:r>
+      <w:r>
+        <w:t xml:space="preserve"> </w:t>
+      </w:r>
+      <w:r>
+        <w:t xml:space="preserve">– This </w:t>
+      </w:r>
+      <w:r>
+        <w:t>relates to whether two models function in the same way</w:t>
+      </w:r>
+    </w:p>
+    <w:p>
+      <w:pPr>
+        <w:pStyle w:val="ListParagraph"/>
+        <w:numPr>
+          <w:ilvl w:val="0"/>
+          <w:numId w:val="9"/>
+        </w:numPr>
+      </w:pPr>
+      <w:r>
+        <w:t>Completeness</w:t>
+      </w:r>
+      <w:r>
+        <w:t xml:space="preserve"> </w:t>
+      </w:r>
+      <w:r>
+        <w:t>–</w:t>
+      </w:r>
+      <w:r>
+        <w:t xml:space="preserve"> </w:t>
+      </w:r>
+      <w:r>
+        <w:t>Relates to the attribution totals</w:t>
+      </w:r>
+    </w:p>
+    <w:p>
+      <w:r>
+        <w:t xml:space="preserve">Pitfall: </w:t>
+      </w:r>
+      <w:r>
+        <w:t>Mixing invariance with unrelated mathematical properties.</w:t>
+      </w:r>
+    </w:p>
+    <w:p>
+      <w:r>
+        <w:t xml:space="preserve">Question 9: </w:t>
+      </w:r>
+      <w:r>
+        <w:t>Why can saliency maps sometimes highlight edges or textures even when the model is randomized</w:t>
+      </w:r>
+      <w:r>
+        <w:t>?</w:t>
+      </w:r>
+    </w:p>
+    <w:p>
+      <w:pPr>
+        <w:pStyle w:val="ListParagraph"/>
+        <w:numPr>
+          <w:ilvl w:val="0"/>
+          <w:numId w:val="10"/>
+        </w:numPr>
+      </w:pPr>
+      <w:r>
+        <w:t>Because they behave like edge detectors and may not depend on learned model parameter</w:t>
+      </w:r>
+      <w:r>
+        <w:t>s</w:t>
+      </w:r>
+      <w:r>
+        <w:t>.</w:t>
+      </w:r>
+      <w:r>
         <w:t xml:space="preserve"> (Correct Answer)</w:t>
       </w:r>
       <w:r>
-        <w:t xml:space="preserve"> - </w:t>
-      </w:r>
-      <w:r>
-        <w:t>the noise level σ determines the scale of random perturbations, with 10%-20% often cited as an ideal range for visual coherence.</w:t>
-      </w:r>
-    </w:p>
-    <w:p>
-      <w:pPr>
-        <w:pStyle w:val="ListParagraph"/>
-        <w:numPr>
-          <w:ilvl w:val="0"/>
-          <w:numId w:val="6"/>
-        </w:numPr>
-      </w:pPr>
-      <w:r>
-        <w:t>n – This refers to the number of samples</w:t>
-      </w:r>
-    </w:p>
-    <w:p>
-      <w:pPr>
-        <w:pStyle w:val="ListParagraph"/>
-        <w:numPr>
-          <w:ilvl w:val="0"/>
-          <w:numId w:val="6"/>
-        </w:numPr>
-      </w:pPr>
-      <w:r>
-        <w:t>S</w:t>
-      </w:r>
-      <w:r>
-        <w:rPr>
-          <w:vertAlign w:val="subscript"/>
-        </w:rPr>
-        <w:t>C</w:t>
-      </w:r>
-      <w:r>
-        <w:t xml:space="preserve"> – This does not exist in the formula</w:t>
+        <w:t xml:space="preserve"> </w:t>
+      </w:r>
+      <w:r>
+        <w:t>–</w:t>
+      </w:r>
+      <w:r>
+        <w:t xml:space="preserve"> </w:t>
+      </w:r>
+      <w:r>
+        <w:t xml:space="preserve">As seen in the paper by Adebayo et. al, some </w:t>
+      </w:r>
+      <w:r>
+        <w:lastRenderedPageBreak/>
+        <w:t>saliency methods produce visually similar outputs even when the model is random.</w:t>
+      </w:r>
+    </w:p>
+    <w:p>
+      <w:pPr>
+        <w:pStyle w:val="ListParagraph"/>
+        <w:numPr>
+          <w:ilvl w:val="0"/>
+          <w:numId w:val="10"/>
+        </w:numPr>
+      </w:pPr>
+      <w:r>
+        <w:t xml:space="preserve">Because gradients are only </w:t>
+      </w:r>
+      <w:r>
+        <w:t>computed at the output layer</w:t>
+      </w:r>
+      <w:r>
+        <w:t xml:space="preserve"> – This is </w:t>
+      </w:r>
+      <w:r>
+        <w:t>not true</w:t>
+      </w:r>
+    </w:p>
+    <w:p>
+      <w:pPr>
+        <w:pStyle w:val="ListParagraph"/>
+        <w:numPr>
+          <w:ilvl w:val="0"/>
+          <w:numId w:val="10"/>
+        </w:numPr>
+      </w:pPr>
+      <w:r>
+        <w:t>Because the model ignores pixel values during inference – This is false</w:t>
+      </w:r>
+    </w:p>
+    <w:p>
+      <w:pPr>
+        <w:pStyle w:val="ListParagraph"/>
+        <w:numPr>
+          <w:ilvl w:val="0"/>
+          <w:numId w:val="10"/>
+        </w:numPr>
+      </w:pPr>
+      <w:r>
+        <w:t>Because saliency maps always use pre-trained feature extractors – Not necessarily true</w:t>
       </w:r>
     </w:p>
     <w:p>
@@ -643,369 +1044,7 @@
         <w:t xml:space="preserve">Pitfall: </w:t>
       </w:r>
       <w:r>
-        <w:t>Confusing number of samples with noise intensity.</w:t>
-      </w:r>
-    </w:p>
-    <w:p>
-      <w:r>
-        <w:t>Question 6:</w:t>
-      </w:r>
-      <w:r>
-        <w:t xml:space="preserve"> </w:t>
-      </w:r>
-      <w:r>
-        <w:t>Why might a 'vanilla' gradient be an unreliable proxy for feature importance when a feature 'saturates' the class score function?</w:t>
-      </w:r>
-    </w:p>
-    <w:p>
-      <w:pPr>
-        <w:pStyle w:val="ListParagraph"/>
-        <w:numPr>
-          <w:ilvl w:val="0"/>
-          <w:numId w:val="7"/>
-        </w:numPr>
-      </w:pPr>
-      <w:r>
-        <w:t>The local derivative becomes small even if the feature has a strong global influence.</w:t>
-      </w:r>
-      <w:r>
-        <w:t xml:space="preserve"> (Correct Answer)</w:t>
-      </w:r>
-      <w:r>
-        <w:t xml:space="preserve"> - W</w:t>
-      </w:r>
-      <w:r>
-        <w:t>hen the function flattens out (saturates), the gradient approaches zero, failing to capture the importance of the feature that caused the high score.</w:t>
-      </w:r>
-    </w:p>
-    <w:p>
-      <w:pPr>
-        <w:pStyle w:val="ListParagraph"/>
-        <w:numPr>
-          <w:ilvl w:val="0"/>
-          <w:numId w:val="7"/>
-        </w:numPr>
-      </w:pPr>
-      <w:r>
-        <w:lastRenderedPageBreak/>
-        <w:t>The gradient increases exponentially, leading to 'exploding' attribution values.</w:t>
-      </w:r>
-      <w:r>
-        <w:t xml:space="preserve"> – This is the opposite of the issue that is being discussed</w:t>
-      </w:r>
-    </w:p>
-    <w:p>
-      <w:pPr>
-        <w:pStyle w:val="ListParagraph"/>
-        <w:numPr>
-          <w:ilvl w:val="0"/>
-          <w:numId w:val="7"/>
-        </w:numPr>
-      </w:pPr>
-      <w:r>
-        <w:t>The gradient is unable to handle negative pixel values in saturated regions.</w:t>
-      </w:r>
-      <w:r>
-        <w:t xml:space="preserve"> – This is not true and it is poorly represented</w:t>
-      </w:r>
-    </w:p>
-    <w:p>
-      <w:pPr>
-        <w:pStyle w:val="ListParagraph"/>
-        <w:numPr>
-          <w:ilvl w:val="0"/>
-          <w:numId w:val="7"/>
-        </w:numPr>
-      </w:pPr>
-      <w:r>
-        <w:t>Saturated features always introduce random noise into the back-propagation calculation.</w:t>
-      </w:r>
-      <w:r>
-        <w:t xml:space="preserve"> – This randomness is not caused by saturation</w:t>
-      </w:r>
-    </w:p>
-    <w:p>
-      <w:r>
-        <w:t xml:space="preserve">Pitfall: </w:t>
-      </w:r>
-      <w:r>
-        <w:t>Assuming gradients always reflect importance.</w:t>
-      </w:r>
-    </w:p>
-    <w:p>
-      <w:r>
-        <w:t xml:space="preserve">Question </w:t>
-      </w:r>
-      <w:r>
-        <w:t>7</w:t>
-      </w:r>
-      <w:r>
-        <w:t xml:space="preserve">: </w:t>
-      </w:r>
-      <w:r>
-        <w:t>In global interpretability, 'Activation Maximisation' is primarily used to:</w:t>
-      </w:r>
-    </w:p>
-    <w:p>
-      <w:pPr>
-        <w:pStyle w:val="ListParagraph"/>
-        <w:numPr>
-          <w:ilvl w:val="0"/>
-          <w:numId w:val="8"/>
-        </w:numPr>
-      </w:pPr>
-      <w:r>
-        <w:t>Identify which specific pixels in a single image led to a classification.</w:t>
-      </w:r>
-      <w:r>
-        <w:t xml:space="preserve"> </w:t>
-      </w:r>
-      <w:r>
-        <w:t>–</w:t>
-      </w:r>
-      <w:r>
-        <w:t xml:space="preserve"> </w:t>
-      </w:r>
-      <w:r>
-        <w:t>This is known as local interpretability</w:t>
-      </w:r>
-    </w:p>
-    <w:p>
-      <w:pPr>
-        <w:pStyle w:val="ListParagraph"/>
-        <w:numPr>
-          <w:ilvl w:val="0"/>
-          <w:numId w:val="8"/>
-        </w:numPr>
-      </w:pPr>
-      <w:r>
-        <w:t>Reduce the total number of active neurons to make the network faster.</w:t>
-      </w:r>
-      <w:r>
-        <w:t xml:space="preserve"> – This is not the purpose of </w:t>
-      </w:r>
-      <w:r>
-        <w:t>Activation Maximisation</w:t>
-      </w:r>
-    </w:p>
-    <w:p>
-      <w:pPr>
-        <w:pStyle w:val="ListParagraph"/>
-        <w:numPr>
-          <w:ilvl w:val="0"/>
-          <w:numId w:val="8"/>
-        </w:numPr>
-      </w:pPr>
-      <w:r>
-        <w:t>Ensure that the network's final output is as high as possible for every training sample.</w:t>
-      </w:r>
-      <w:r>
-        <w:t xml:space="preserve"> – This is not related to training</w:t>
-      </w:r>
-    </w:p>
-    <w:p>
-      <w:pPr>
-        <w:pStyle w:val="ListParagraph"/>
-        <w:numPr>
-          <w:ilvl w:val="0"/>
-          <w:numId w:val="8"/>
-        </w:numPr>
-      </w:pPr>
-      <w:r>
-        <w:t>Synthesise an input that maximally activates a specific neuron to see what it has 'learned'.</w:t>
-      </w:r>
-      <w:r>
-        <w:t xml:space="preserve"> (Correct Answer)</w:t>
-      </w:r>
-      <w:r>
-        <w:t xml:space="preserve"> - </w:t>
-      </w:r>
-      <w:r>
-        <w:t>By iteratively tweaking an input to maximize a neuron’s activation, researchers can visualize the patterns the neuron detects (like textures or parts).</w:t>
-      </w:r>
-    </w:p>
-    <w:p>
-      <w:r>
-        <w:t xml:space="preserve">Pitfall: </w:t>
-      </w:r>
-      <w:r>
-        <w:t>Confusing visualisation with explanation of predictions.</w:t>
-      </w:r>
-    </w:p>
-    <w:p>
-      <w:r>
-        <w:t xml:space="preserve">Question </w:t>
-      </w:r>
-      <w:r>
-        <w:t>8</w:t>
-      </w:r>
-      <w:r>
-        <w:t>:</w:t>
-      </w:r>
-      <w:r>
-        <w:t xml:space="preserve"> </w:t>
-      </w:r>
-      <w:r>
-        <w:t>The requirement that a saliency method should mirror the sensitivity of the model when the input is transformed by a constant shift is called:</w:t>
-      </w:r>
-    </w:p>
-    <w:p>
-      <w:pPr>
-        <w:pStyle w:val="ListParagraph"/>
-        <w:numPr>
-          <w:ilvl w:val="0"/>
-          <w:numId w:val="9"/>
-        </w:numPr>
-      </w:pPr>
-      <w:r>
-        <w:t>Input Invariance (Correct Answer)</w:t>
-      </w:r>
-      <w:r>
-        <w:t xml:space="preserve"> - </w:t>
-      </w:r>
-      <w:r>
-        <w:t>Input Invariance ensures that if a pre-processing step does not change the model’s output, it should not fundamentally change the attribution.</w:t>
-      </w:r>
-    </w:p>
-    <w:p>
-      <w:pPr>
-        <w:pStyle w:val="ListParagraph"/>
-        <w:numPr>
-          <w:ilvl w:val="0"/>
-          <w:numId w:val="9"/>
-        </w:numPr>
-      </w:pPr>
-      <w:r>
-        <w:t>Linearity</w:t>
-      </w:r>
-      <w:r>
-        <w:t xml:space="preserve"> – This is a different concept</w:t>
-      </w:r>
-    </w:p>
-    <w:p>
-      <w:pPr>
-        <w:pStyle w:val="ListParagraph"/>
-        <w:numPr>
-          <w:ilvl w:val="0"/>
-          <w:numId w:val="9"/>
-        </w:numPr>
-      </w:pPr>
-      <w:r>
-        <w:t>Saliency Denoising</w:t>
-      </w:r>
-      <w:r>
-        <w:t xml:space="preserve"> – This is not relevant</w:t>
-      </w:r>
-    </w:p>
-    <w:p>
-      <w:pPr>
-        <w:pStyle w:val="ListParagraph"/>
-        <w:numPr>
-          <w:ilvl w:val="0"/>
-          <w:numId w:val="9"/>
-        </w:numPr>
-      </w:pPr>
-      <w:proofErr w:type="spellStart"/>
-      <w:r>
-        <w:t>Discriminativity</w:t>
-      </w:r>
-      <w:proofErr w:type="spellEnd"/>
-      <w:r>
-        <w:t xml:space="preserve"> - </w:t>
-      </w:r>
-      <w:r>
-        <w:t>This is not relevant</w:t>
-      </w:r>
-    </w:p>
-    <w:p>
-      <w:r>
-        <w:t xml:space="preserve">Pitfall: </w:t>
-      </w:r>
-      <w:r>
-        <w:t>Mixing invariance with unrelated mathematical properties.</w:t>
-      </w:r>
-    </w:p>
-    <w:p>
-      <w:r>
-        <w:t xml:space="preserve">Question 9: </w:t>
-      </w:r>
-      <w:r>
-        <w:t>When generating 'Human-friendly Explanations', what characterises a 'Contrastive Explanation'?</w:t>
-      </w:r>
-    </w:p>
-    <w:p>
-      <w:pPr>
-        <w:pStyle w:val="ListParagraph"/>
-        <w:numPr>
-          <w:ilvl w:val="0"/>
-          <w:numId w:val="10"/>
-        </w:numPr>
-      </w:pPr>
-      <w:r>
-        <w:t>It explains why a specific prediction was made instead of a different, alternative prediction.</w:t>
-      </w:r>
-      <w:r>
-        <w:t xml:space="preserve"> (Correct Answer)</w:t>
-      </w:r>
-      <w:r>
-        <w:t xml:space="preserve"> - </w:t>
-      </w:r>
-      <w:r>
-        <w:t>Contrastive Explanations answer Why Q rather than R?, where Q is the model’s predicted outcome and R is a plausible alternative outcome, which is often more intuitive than a full feature list.</w:t>
-      </w:r>
-    </w:p>
-    <w:p>
-      <w:pPr>
-        <w:pStyle w:val="ListParagraph"/>
-        <w:numPr>
-          <w:ilvl w:val="0"/>
-          <w:numId w:val="10"/>
-        </w:numPr>
-      </w:pPr>
-      <w:r>
-        <w:t>It provides the full decision logic and every feature weight of the entire model.</w:t>
-      </w:r>
-      <w:r>
-        <w:t xml:space="preserve"> – This is exhaustive explanation not Contrastive Explanation</w:t>
-      </w:r>
-    </w:p>
-    <w:p>
-      <w:pPr>
-        <w:pStyle w:val="ListParagraph"/>
-        <w:numPr>
-          <w:ilvl w:val="0"/>
-          <w:numId w:val="10"/>
-        </w:numPr>
-      </w:pPr>
-      <w:r>
-        <w:lastRenderedPageBreak/>
-        <w:t>It uses visual heatmaps that show only the contrast between bright and dark pixels.</w:t>
-      </w:r>
-      <w:r>
-        <w:t xml:space="preserve"> – This is a visual method not conceptual explanation</w:t>
-      </w:r>
-    </w:p>
-    <w:p>
-      <w:pPr>
-        <w:pStyle w:val="ListParagraph"/>
-        <w:numPr>
-          <w:ilvl w:val="0"/>
-          <w:numId w:val="10"/>
-        </w:numPr>
-      </w:pPr>
-      <w:r>
-        <w:t>It is an explanation that only highlights the errors made by the model.</w:t>
-      </w:r>
-      <w:r>
-        <w:t xml:space="preserve"> – That is debugging not explanation</w:t>
-      </w:r>
-    </w:p>
-    <w:p>
-      <w:r>
-        <w:t xml:space="preserve">Pitfall: </w:t>
-      </w:r>
-      <w:r>
-        <w:t>Confusing comparison-based reasoning with feature importance.</w:t>
+        <w:t>Assuming visual quality implies meaningful explanation.</w:t>
       </w:r>
     </w:p>
     <w:p>
@@ -1013,18 +1052,7 @@
         <w:t>Question 10:</w:t>
       </w:r>
       <w:r>
-        <w:t xml:space="preserve"> </w:t>
-      </w:r>
-      <w:r>
-        <w:t xml:space="preserve">What happens to the visual coherence of </w:t>
-      </w:r>
-      <w:proofErr w:type="spellStart"/>
-      <w:r>
-        <w:t>SmoothGrad</w:t>
-      </w:r>
-      <w:proofErr w:type="spellEnd"/>
-      <w:r>
-        <w:t xml:space="preserve"> sensitivity maps as the sample size n increases?</w:t>
+        <w:t xml:space="preserve"> What happens to the visual coherence of SmoothGrad sensitivity maps as the sample size n increases?</w:t>
       </w:r>
     </w:p>
     <w:p>
@@ -1039,15 +1067,7 @@
         <w:t>The maps become increasingly noisy as more random perturbations are added.</w:t>
       </w:r>
       <w:r>
-        <w:t xml:space="preserve"> – This is not true as through </w:t>
-      </w:r>
-      <w:proofErr w:type="spellStart"/>
-      <w:r>
-        <w:t>SmoothGrad</w:t>
-      </w:r>
-      <w:proofErr w:type="spellEnd"/>
-      <w:r>
-        <w:t xml:space="preserve">, the process of averaging </w:t>
+        <w:t xml:space="preserve"> – This is not true as through SmoothGrad, the process of averaging </w:t>
       </w:r>
       <w:r>
         <w:t>sensitivity maps of an image</w:t>
@@ -1095,10 +1115,7 @@
         </w:numPr>
       </w:pPr>
       <w:r>
-        <w:t>They become smoother and more coherent, but with diminishing returns after n &gt; 50.</w:t>
-      </w:r>
-      <w:r>
-        <w:t xml:space="preserve"> (Correct Answer)</w:t>
+        <w:t>They become smoother and more coherent, but with diminishing returns after n &gt; 50. (Correct Answer)</w:t>
       </w:r>
       <w:r>
         <w:t xml:space="preserve"> – As </w:t>
@@ -2746,6 +2763,7 @@
   <w:style w:type="character" w:default="1" w:styleId="DefaultParagraphFont">
     <w:name w:val="Default Paragraph Font"/>
     <w:uiPriority w:val="1"/>
+    <w:semiHidden/>
     <w:unhideWhenUsed/>
   </w:style>
   <w:style w:type="table" w:default="1" w:styleId="TableNormal">

</xml_diff>

<commit_message>
Edited Study Notes and Quiz
</commit_message>
<xml_diff>
--- a/Quiz.docx
+++ b/Quiz.docx
@@ -4,6 +4,7 @@
   <w:body>
     <w:p>
       <w:pPr>
+        <w:jc w:val="both"/>
         <w:rPr>
           <w:b/>
           <w:bCs/>
@@ -40,17 +41,33 @@
       </w:r>
     </w:p>
     <w:p>
-      <w:r>
-        <w:t xml:space="preserve">Question 1: In the context of </w:t>
-      </w:r>
-      <w:r>
-        <w:t>attribution methods such as the</w:t>
-      </w:r>
-      <w:r>
-        <w:t xml:space="preserve"> Vanilla Saliency (Integrated Gradients) approach, which rule states that </w:t>
-      </w:r>
-      <w:r>
-        <w:t>attribution should be identical for two neural networks that are functionally equivalent, regardless of their internal architectures</w:t>
+      <w:pPr>
+        <w:jc w:val="both"/>
+      </w:pPr>
+      <w:r>
+        <w:rPr>
+          <w:b/>
+          <w:bCs/>
+        </w:rPr>
+        <w:t>Question 1:</w:t>
+      </w:r>
+      <w:r>
+        <w:t xml:space="preserve"> </w:t>
+      </w:r>
+      <w:r>
+        <w:t xml:space="preserve">If </w:t>
+      </w:r>
+      <w:r>
+        <w:t xml:space="preserve">two </w:t>
+      </w:r>
+      <w:r>
+        <w:t>neural networks perform the same function</w:t>
+      </w:r>
+      <w:r>
+        <w:t xml:space="preserve">, which principle ensures that the networks </w:t>
+      </w:r>
+      <w:r>
+        <w:t>receive the same attributions</w:t>
       </w:r>
       <w:r>
         <w:t>?</w:t>
@@ -63,6 +80,7 @@
           <w:ilvl w:val="0"/>
           <w:numId w:val="1"/>
         </w:numPr>
+        <w:jc w:val="both"/>
       </w:pPr>
       <w:r>
         <w:t>Sensitivity</w:t>
@@ -71,16 +89,19 @@
         <w:t xml:space="preserve"> – </w:t>
       </w:r>
       <w:r>
-        <w:t>Sensitivity</w:t>
-      </w:r>
-      <w:r>
-        <w:t xml:space="preserve"> </w:t>
-      </w:r>
-      <w:r>
-        <w:t xml:space="preserve">focuses on the input-output relationship (If a feature changes the output, it should receive non-zero attribution), not </w:t>
-      </w:r>
-      <w:r>
-        <w:t>whether two models give similar attributions</w:t>
+        <w:t xml:space="preserve"> This rule is about whether a feature has an impact on the output</w:t>
+      </w:r>
+      <w:r>
+        <w:t xml:space="preserve">, not </w:t>
+      </w:r>
+      <w:r>
+        <w:t xml:space="preserve">whether two </w:t>
+      </w:r>
+      <w:r>
+        <w:t>identical networks produce the same</w:t>
+      </w:r>
+      <w:r>
+        <w:t xml:space="preserve"> attributions</w:t>
       </w:r>
     </w:p>
     <w:p>
@@ -90,6 +111,7 @@
           <w:ilvl w:val="0"/>
           <w:numId w:val="1"/>
         </w:numPr>
+        <w:jc w:val="both"/>
       </w:pPr>
       <w:r>
         <w:t>Completeness</w:t>
@@ -117,15 +139,25 @@
           <w:ilvl w:val="0"/>
           <w:numId w:val="1"/>
         </w:numPr>
-      </w:pPr>
-      <w:r>
+        <w:jc w:val="both"/>
+        <w:rPr>
+          <w:i/>
+          <w:iCs/>
+        </w:rPr>
+      </w:pPr>
+      <w:r>
+        <w:rPr>
+          <w:i/>
+          <w:iCs/>
+        </w:rPr>
         <w:t>Implementation Invariance (Correct Answer)</w:t>
       </w:r>
       <w:r>
-        <w:t xml:space="preserve"> - T</w:t>
-      </w:r>
-      <w:r>
-        <w:t>his rule requests that the attribution depends on the function implemented by the network and the input, not the specific implementation details.</w:t>
+        <w:rPr>
+          <w:i/>
+          <w:iCs/>
+        </w:rPr>
+        <w:t xml:space="preserve"> - This rule requests that the attribution depends on the function implemented by the network and the input, not the specific implementation details.</w:t>
       </w:r>
     </w:p>
     <w:p>
@@ -135,6 +167,7 @@
           <w:ilvl w:val="0"/>
           <w:numId w:val="1"/>
         </w:numPr>
+        <w:jc w:val="both"/>
       </w:pPr>
       <w:r>
         <w:t>Input Invariance</w:t>
@@ -159,16 +192,44 @@
       </w:r>
     </w:p>
     <w:p>
-      <w:r>
-        <w:t xml:space="preserve">Pitfall: </w:t>
+      <w:pPr>
+        <w:jc w:val="both"/>
+      </w:pPr>
+      <w:r>
+        <w:rPr>
+          <w:b/>
+          <w:bCs/>
+        </w:rPr>
+        <w:t>Pitfall:</w:t>
+      </w:r>
+      <w:r>
+        <w:t xml:space="preserve"> </w:t>
       </w:r>
       <w:r>
         <w:t>Confusing model equivalence with input behaviour.</w:t>
       </w:r>
     </w:p>
     <w:p>
-      <w:r>
-        <w:t>Question 2: What is the primary mechanism used by SmoothGrad to reduce the visual noise found in standard gradient-based sensitivity maps?</w:t>
+      <w:pPr>
+        <w:jc w:val="both"/>
+      </w:pPr>
+      <w:r>
+        <w:rPr>
+          <w:b/>
+          <w:bCs/>
+        </w:rPr>
+        <w:t>Question 2:</w:t>
+      </w:r>
+      <w:r>
+        <w:t xml:space="preserve"> What is the primary mechanism used by </w:t>
+      </w:r>
+      <w:proofErr w:type="spellStart"/>
+      <w:r>
+        <w:t>SmoothGrad</w:t>
+      </w:r>
+      <w:proofErr w:type="spellEnd"/>
+      <w:r>
+        <w:t xml:space="preserve"> to reduce the visual noise found in standard gradient-based sensitivity maps?</w:t>
       </w:r>
     </w:p>
     <w:p>
@@ -178,23 +239,64 @@
           <w:ilvl w:val="0"/>
           <w:numId w:val="2"/>
         </w:numPr>
-      </w:pPr>
-      <w:r>
+        <w:jc w:val="both"/>
+        <w:rPr>
+          <w:i/>
+          <w:iCs/>
+        </w:rPr>
+      </w:pPr>
+      <w:r>
+        <w:rPr>
+          <w:i/>
+          <w:iCs/>
+        </w:rPr>
         <w:t>Averaging sensitivity maps of an image with added Gaussian noise (Correct Answer)</w:t>
       </w:r>
       <w:r>
+        <w:rPr>
+          <w:i/>
+          <w:iCs/>
+        </w:rPr>
         <w:t xml:space="preserve"> - </w:t>
       </w:r>
-      <w:r>
-        <w:t>SmoothGrad calculates M^</w:t>
-      </w:r>
-      <w:r>
-        <w:rPr>
+      <w:proofErr w:type="spellStart"/>
+      <w:r>
+        <w:rPr>
+          <w:i/>
+          <w:iCs/>
+        </w:rPr>
+        <w:t>SmoothGrad</w:t>
+      </w:r>
+      <w:proofErr w:type="spellEnd"/>
+      <w:r>
+        <w:rPr>
+          <w:i/>
+          <w:iCs/>
+        </w:rPr>
+        <w:t xml:space="preserve"> calculates </w:t>
+      </w:r>
+      <w:proofErr w:type="spellStart"/>
+      <w:r>
+        <w:rPr>
+          <w:i/>
+          <w:iCs/>
+        </w:rPr>
+        <w:t>M^</w:t>
+      </w:r>
+      <w:r>
+        <w:rPr>
+          <w:i/>
+          <w:iCs/>
           <w:vertAlign w:val="subscript"/>
         </w:rPr>
         <w:t>c</w:t>
       </w:r>
-      <w:r>
+      <w:proofErr w:type="spellEnd"/>
+      <w:r>
+        <w:rPr>
+          <w:i/>
+          <w:iCs/>
+        </w:rPr>
         <w:t xml:space="preserve"> (x) = 1/n </w:t>
       </w:r>
       <m:oMath>
@@ -206,6 +308,7 @@
               <w:rPr>
                 <w:rFonts w:ascii="Cambria Math" w:hAnsi="Cambria Math"/>
                 <w:i/>
+                <w:iCs/>
               </w:rPr>
             </m:ctrlPr>
           </m:naryPr>
@@ -232,6 +335,7 @@
                   <w:rPr>
                     <w:rFonts w:ascii="Cambria Math" w:hAnsi="Cambria Math"/>
                     <w:i/>
+                    <w:iCs/>
                   </w:rPr>
                 </m:ctrlPr>
               </m:sSubPr>
@@ -264,6 +368,7 @@
                   <w:rPr>
                     <w:rFonts w:ascii="Cambria Math" w:hAnsi="Cambria Math"/>
                     <w:i/>
+                    <w:iCs/>
                   </w:rPr>
                 </m:ctrlPr>
               </m:dPr>
@@ -280,6 +385,7 @@
                       <w:rPr>
                         <w:rFonts w:ascii="Cambria Math" w:hAnsi="Cambria Math"/>
                         <w:i/>
+                        <w:iCs/>
                       </w:rPr>
                     </m:ctrlPr>
                   </m:sSupPr>
@@ -312,6 +418,10 @@
         </m:nary>
       </m:oMath>
       <w:r>
+        <w:rPr>
+          <w:i/>
+          <w:iCs/>
+        </w:rPr>
         <w:t>, which smooths out sharp fluctuations in the gradient</w:t>
       </w:r>
     </w:p>
@@ -322,6 +432,7 @@
           <w:ilvl w:val="0"/>
           <w:numId w:val="2"/>
         </w:numPr>
+        <w:jc w:val="both"/>
       </w:pPr>
       <w:r>
         <w:t xml:space="preserve">Applying a </w:t>
@@ -343,6 +454,7 @@
           <w:ilvl w:val="0"/>
           <w:numId w:val="2"/>
         </w:numPr>
+        <w:jc w:val="both"/>
       </w:pPr>
       <w:r>
         <w:t>Multiplying the gradient by the input image pixels</w:t>
@@ -358,17 +470,36 @@
           <w:ilvl w:val="0"/>
           <w:numId w:val="2"/>
         </w:numPr>
+        <w:jc w:val="both"/>
       </w:pPr>
       <w:r>
         <w:t>Discarding all negative gradient values during back propagation</w:t>
       </w:r>
       <w:r>
-        <w:t xml:space="preserve"> – This sounds like denoising but the meaning is different.</w:t>
-      </w:r>
-    </w:p>
-    <w:p>
-      <w:r>
-        <w:t xml:space="preserve">Pitfall: </w:t>
+        <w:t xml:space="preserve"> – This sounds like </w:t>
+      </w:r>
+      <w:proofErr w:type="gramStart"/>
+      <w:r>
+        <w:t>denoising</w:t>
+      </w:r>
+      <w:proofErr w:type="gramEnd"/>
+      <w:r>
+        <w:t xml:space="preserve"> but the meaning is different.</w:t>
+      </w:r>
+    </w:p>
+    <w:p>
+      <w:pPr>
+        <w:jc w:val="both"/>
+      </w:pPr>
+      <w:r>
+        <w:rPr>
+          <w:b/>
+          <w:bCs/>
+        </w:rPr>
+        <w:t>Pitfall:</w:t>
+      </w:r>
+      <w:r>
+        <w:t xml:space="preserve"> </w:t>
       </w:r>
       <w:r>
         <w:t>Assuming smoothing = filtering instead of statistical averaging.</w:t>
@@ -376,6 +507,7 @@
     </w:p>
     <w:p>
       <w:pPr>
+        <w:jc w:val="both"/>
         <w:rPr>
           <w:rFonts w:eastAsiaTheme="minorEastAsia"/>
         </w:rPr>
@@ -383,8 +515,16 @@
       <w:r>
         <w:rPr>
           <w:rFonts w:eastAsiaTheme="minorEastAsia"/>
-        </w:rPr>
-        <w:t>Question 3: According to a survey on interpretable machine learning, what is the main difference between 'intrinsic interpretability' and 'post-hoc interpretability'?</w:t>
+          <w:b/>
+          <w:bCs/>
+        </w:rPr>
+        <w:t>Question 3:</w:t>
+      </w:r>
+      <w:r>
+        <w:rPr>
+          <w:rFonts w:eastAsiaTheme="minorEastAsia"/>
+        </w:rPr>
+        <w:t xml:space="preserve"> According to a survey on interpretable machine learning, what is the main difference between 'intrinsic interpretability' and 'post-hoc interpretability'?</w:t>
       </w:r>
     </w:p>
     <w:p>
@@ -394,27 +534,28 @@
           <w:ilvl w:val="0"/>
           <w:numId w:val="3"/>
         </w:numPr>
+        <w:jc w:val="both"/>
         <w:rPr>
           <w:rFonts w:eastAsiaTheme="minorEastAsia"/>
+          <w:i/>
+          <w:iCs/>
         </w:rPr>
       </w:pPr>
       <w:r>
         <w:rPr>
           <w:rFonts w:eastAsiaTheme="minorEastAsia"/>
+          <w:i/>
+          <w:iCs/>
         </w:rPr>
         <w:t>Intrinsic interpretability is built into the structure of the model, while post-hoc requires a second model or method for explanation (Correct Answer)</w:t>
       </w:r>
       <w:r>
         <w:rPr>
           <w:rFonts w:eastAsiaTheme="minorEastAsia"/>
-        </w:rPr>
-        <w:t xml:space="preserve"> - </w:t>
-      </w:r>
-      <w:r>
-        <w:rPr>
-          <w:rFonts w:eastAsiaTheme="minorEastAsia"/>
-        </w:rPr>
-        <w:t>Intrinsic Models are self-explanatory by design (e.g., decision trees) whereas post-hoc methods analyse pre-trained black-box models.</w:t>
+          <w:i/>
+          <w:iCs/>
+        </w:rPr>
+        <w:t xml:space="preserve"> - Intrinsic Models are self-explanatory by design (e.g., decision trees) whereas post-hoc methods analyse pre-trained black-box models.</w:t>
       </w:r>
     </w:p>
     <w:p>
@@ -424,6 +565,7 @@
           <w:ilvl w:val="0"/>
           <w:numId w:val="3"/>
         </w:numPr>
+        <w:jc w:val="both"/>
         <w:rPr>
           <w:rFonts w:eastAsiaTheme="minorEastAsia"/>
         </w:rPr>
@@ -454,16 +596,20 @@
           <w:ilvl w:val="0"/>
           <w:numId w:val="3"/>
         </w:numPr>
-      </w:pPr>
+        <w:jc w:val="both"/>
+      </w:pPr>
+      <w:r>
+        <w:t>Post-hoc interpretability ensures higher prediction accuracy than intrinsic interpretability in all cases</w:t>
+      </w:r>
+      <w:r>
+        <w:t xml:space="preserve"> - </w:t>
+      </w:r>
+      <w:r>
+        <w:t xml:space="preserve">There is often a trade-off between intrinsic interpretability and post-hoc interpretability but post-hoc methods aim to keep </w:t>
+      </w:r>
       <w:r>
         <w:lastRenderedPageBreak/>
-        <w:t>Post-hoc interpretability ensures higher prediction accuracy than intrinsic interpretability in all cases</w:t>
-      </w:r>
-      <w:r>
-        <w:t xml:space="preserve"> - </w:t>
-      </w:r>
-      <w:r>
-        <w:t>There is often a trade-off between intrinsic interpretability and post-hoc interpretability but post-hoc methods aim to keep the original model’s accuracy intact without necessarily being higher in absolute terms.</w:t>
+        <w:t>the original model’s accuracy intact without necessarily being higher in absolute terms.</w:t>
       </w:r>
     </w:p>
     <w:p>
@@ -473,6 +619,7 @@
           <w:ilvl w:val="0"/>
           <w:numId w:val="3"/>
         </w:numPr>
+        <w:jc w:val="both"/>
       </w:pPr>
       <w:r>
         <w:t>Intrinsic interpretability provides global explanations, while post-hoc only provides local explanations</w:t>
@@ -485,13 +632,33 @@
       </w:r>
     </w:p>
     <w:p>
-      <w:r>
-        <w:t>Pitfall: Mixing model type with interpretability type</w:t>
-      </w:r>
-    </w:p>
-    <w:p>
-      <w:r>
-        <w:t>Question 4: What was the surprising finding regarding some popular attribution methods?</w:t>
+      <w:pPr>
+        <w:jc w:val="both"/>
+      </w:pPr>
+      <w:r>
+        <w:rPr>
+          <w:b/>
+          <w:bCs/>
+        </w:rPr>
+        <w:t>Pitfall:</w:t>
+      </w:r>
+      <w:r>
+        <w:t xml:space="preserve"> Mixing model type with interpretability type</w:t>
+      </w:r>
+    </w:p>
+    <w:p>
+      <w:pPr>
+        <w:jc w:val="both"/>
+      </w:pPr>
+      <w:r>
+        <w:rPr>
+          <w:b/>
+          <w:bCs/>
+        </w:rPr>
+        <w:t>Question 4:</w:t>
+      </w:r>
+      <w:r>
+        <w:t xml:space="preserve"> What was the surprising finding regarding some popular attribution methods?</w:t>
       </w:r>
     </w:p>
     <w:p>
@@ -501,6 +668,7 @@
           <w:ilvl w:val="0"/>
           <w:numId w:val="5"/>
         </w:numPr>
+        <w:jc w:val="both"/>
       </w:pPr>
       <w:r>
         <w:t>They always outperformed human experts in identifying relevant features for classification</w:t>
@@ -516,6 +684,7 @@
           <w:ilvl w:val="0"/>
           <w:numId w:val="5"/>
         </w:numPr>
+        <w:jc w:val="both"/>
       </w:pPr>
       <w:r>
         <w:t>They only worked for Recurrent Neural Networks but failed for Convolutional Neural Networks</w:t>
@@ -531,15 +700,25 @@
           <w:ilvl w:val="0"/>
           <w:numId w:val="5"/>
         </w:numPr>
-      </w:pPr>
-      <w:r>
+        <w:jc w:val="both"/>
+        <w:rPr>
+          <w:i/>
+          <w:iCs/>
+        </w:rPr>
+      </w:pPr>
+      <w:r>
+        <w:rPr>
+          <w:i/>
+          <w:iCs/>
+        </w:rPr>
         <w:t>They produced maps that were independent of both the model parameters and the data-generating process (Correct Answer)</w:t>
       </w:r>
       <w:r>
-        <w:t xml:space="preserve"> - </w:t>
-      </w:r>
-      <w:r>
-        <w:t>Through the experiments that were conducted in the 'Sanity Checks for Saliency Maps' study, it was deduced that some methods failed to change when model weights were randomised, behaving more like model-independent edge detectors.</w:t>
+        <w:rPr>
+          <w:i/>
+          <w:iCs/>
+        </w:rPr>
+        <w:t xml:space="preserve"> - Through the experiments that were conducted in the 'Sanity Checks for Saliency Maps' study, it was deduced that some methods failed to change when model weights were randomised, behaving more like model-independent edge detectors.</w:t>
       </w:r>
     </w:p>
     <w:p>
@@ -549,6 +728,7 @@
           <w:ilvl w:val="0"/>
           <w:numId w:val="5"/>
         </w:numPr>
+        <w:jc w:val="both"/>
       </w:pPr>
       <w:r>
         <w:t>They were only effective when the input images were perfectly centred and normalised</w:t>
@@ -558,16 +738,44 @@
       </w:r>
     </w:p>
     <w:p>
-      <w:r>
-        <w:t xml:space="preserve">Pitfall: </w:t>
+      <w:pPr>
+        <w:jc w:val="both"/>
+      </w:pPr>
+      <w:r>
+        <w:rPr>
+          <w:b/>
+          <w:bCs/>
+        </w:rPr>
+        <w:t>Pitfall:</w:t>
+      </w:r>
+      <w:r>
+        <w:t xml:space="preserve"> </w:t>
       </w:r>
       <w:r>
         <w:t>Assuming saliency maps are always model-dependent.</w:t>
       </w:r>
     </w:p>
     <w:p>
-      <w:r>
-        <w:t>Question 5: Which hyperparameter in SmoothGrad refers to the standard deviation of the Gaussian perturbations applied to the input?</w:t>
+      <w:pPr>
+        <w:jc w:val="both"/>
+      </w:pPr>
+      <w:r>
+        <w:rPr>
+          <w:b/>
+          <w:bCs/>
+        </w:rPr>
+        <w:t>Question 5:</w:t>
+      </w:r>
+      <w:r>
+        <w:t xml:space="preserve"> Which hyperparameter in </w:t>
+      </w:r>
+      <w:proofErr w:type="spellStart"/>
+      <w:r>
+        <w:t>SmoothGrad</w:t>
+      </w:r>
+      <w:proofErr w:type="spellEnd"/>
+      <w:r>
+        <w:t xml:space="preserve"> refers to the standard deviation of the Gaussian perturbations applied to the input?</w:t>
       </w:r>
     </w:p>
     <w:p>
@@ -577,6 +785,7 @@
           <w:ilvl w:val="0"/>
           <w:numId w:val="6"/>
         </w:numPr>
+        <w:jc w:val="both"/>
       </w:pPr>
       <w:r>
         <w:t>M</w:t>
@@ -591,7 +800,13 @@
         <w:t xml:space="preserve"> – This refers to the </w:t>
       </w:r>
       <w:r>
-        <w:t>saliency map output and it is not a hyperparameter</w:t>
+        <w:t xml:space="preserve">saliency map </w:t>
+      </w:r>
+      <w:r>
+        <w:t>output,</w:t>
+      </w:r>
+      <w:r>
+        <w:t xml:space="preserve"> and it is not a hyperparameter</w:t>
       </w:r>
     </w:p>
     <w:p>
@@ -601,15 +816,25 @@
           <w:ilvl w:val="0"/>
           <w:numId w:val="6"/>
         </w:numPr>
-      </w:pPr>
-      <w:r>
+        <w:jc w:val="both"/>
+        <w:rPr>
+          <w:i/>
+          <w:iCs/>
+        </w:rPr>
+      </w:pPr>
+      <w:r>
+        <w:rPr>
+          <w:i/>
+          <w:iCs/>
+        </w:rPr>
         <w:t>σ (Correct Answer)</w:t>
       </w:r>
       <w:r>
-        <w:t xml:space="preserve"> - </w:t>
-      </w:r>
-      <w:r>
-        <w:t>the noise level σ determines the scale of random perturbations, with 10%-20% often cited as an ideal range for visual coherence.</w:t>
+        <w:rPr>
+          <w:i/>
+          <w:iCs/>
+        </w:rPr>
+        <w:t xml:space="preserve"> - the noise level σ determines the scale of random perturbations, with 10%-20% often cited as an ideal range for visual coherence.</w:t>
       </w:r>
     </w:p>
     <w:p>
@@ -619,6 +844,7 @@
           <w:ilvl w:val="0"/>
           <w:numId w:val="6"/>
         </w:numPr>
+        <w:jc w:val="both"/>
       </w:pPr>
       <w:r>
         <w:t>n – This refers to the number of samples</w:t>
@@ -631,6 +857,7 @@
           <w:ilvl w:val="0"/>
           <w:numId w:val="6"/>
         </w:numPr>
+        <w:jc w:val="both"/>
       </w:pPr>
       <w:r>
         <w:t>σ</w:t>
@@ -645,11 +872,24 @@
         <w:t xml:space="preserve"> – This </w:t>
       </w:r>
       <w:r>
-        <w:t>refers to the variance, which appears in notation but it is not directly used as the tuning parameters</w:t>
-      </w:r>
-    </w:p>
-    <w:p>
-      <w:r>
+        <w:t xml:space="preserve">refers to the variance, which appears in </w:t>
+      </w:r>
+      <w:r>
+        <w:t>notation,</w:t>
+      </w:r>
+      <w:r>
+        <w:t xml:space="preserve"> but it is not directly used as the tuning parameters</w:t>
+      </w:r>
+    </w:p>
+    <w:p>
+      <w:pPr>
+        <w:jc w:val="both"/>
+      </w:pPr>
+      <w:r>
+        <w:rPr>
+          <w:b/>
+          <w:bCs/>
+        </w:rPr>
         <w:t>Pitfall:</w:t>
       </w:r>
       <w:r>
@@ -660,7 +900,14 @@
       </w:r>
     </w:p>
     <w:p>
-      <w:r>
+      <w:pPr>
+        <w:jc w:val="both"/>
+      </w:pPr>
+      <w:r>
+        <w:rPr>
+          <w:b/>
+          <w:bCs/>
+        </w:rPr>
         <w:t>Question 6:</w:t>
       </w:r>
       <w:r>
@@ -674,19 +921,25 @@
           <w:ilvl w:val="0"/>
           <w:numId w:val="7"/>
         </w:numPr>
-      </w:pPr>
-      <w:r>
+        <w:jc w:val="both"/>
+        <w:rPr>
+          <w:i/>
+          <w:iCs/>
+        </w:rPr>
+      </w:pPr>
+      <w:r>
+        <w:rPr>
+          <w:i/>
+          <w:iCs/>
+        </w:rPr>
         <w:t>The local derivative becomes small even if the feature has a strong global influence. (Correct Answer)</w:t>
       </w:r>
       <w:r>
-        <w:t xml:space="preserve"> - W</w:t>
-      </w:r>
-      <w:r>
-        <w:t xml:space="preserve">hen the function flattens out (saturates), the </w:t>
-      </w:r>
-      <w:r>
-        <w:lastRenderedPageBreak/>
-        <w:t>gradient approaches zero, failing to capture the importance of the feature that caused the high score.</w:t>
+        <w:rPr>
+          <w:i/>
+          <w:iCs/>
+        </w:rPr>
+        <w:t xml:space="preserve"> - When the function flattens out (saturates), the gradient approaches zero, failing to capture the importance of the feature that caused the high score.</w:t>
       </w:r>
     </w:p>
     <w:p>
@@ -696,6 +949,7 @@
           <w:ilvl w:val="0"/>
           <w:numId w:val="7"/>
         </w:numPr>
+        <w:jc w:val="both"/>
       </w:pPr>
       <w:r>
         <w:t>The gradient increases exponentially, leading to 'exploding' attribution values.</w:t>
@@ -711,8 +965,10 @@
           <w:ilvl w:val="0"/>
           <w:numId w:val="7"/>
         </w:numPr>
-      </w:pPr>
-      <w:r>
+        <w:jc w:val="both"/>
+      </w:pPr>
+      <w:r>
+        <w:lastRenderedPageBreak/>
         <w:t>The gradient is unable to handle negative pixel values in saturated regions.</w:t>
       </w:r>
       <w:r>
@@ -726,6 +982,7 @@
           <w:ilvl w:val="0"/>
           <w:numId w:val="7"/>
         </w:numPr>
+        <w:jc w:val="both"/>
       </w:pPr>
       <w:r>
         <w:t>Saturated features always introduce random noise into the back-propagation calculation.</w:t>
@@ -735,22 +992,50 @@
       </w:r>
     </w:p>
     <w:p>
-      <w:r>
-        <w:t xml:space="preserve">Pitfall: </w:t>
+      <w:pPr>
+        <w:jc w:val="both"/>
+      </w:pPr>
+      <w:r>
+        <w:rPr>
+          <w:b/>
+          <w:bCs/>
+        </w:rPr>
+        <w:t>Pitfall:</w:t>
+      </w:r>
+      <w:r>
+        <w:t xml:space="preserve"> </w:t>
       </w:r>
       <w:r>
         <w:t>Assuming gradients always reflect importance.</w:t>
       </w:r>
     </w:p>
     <w:p>
-      <w:r>
+      <w:pPr>
+        <w:jc w:val="both"/>
+      </w:pPr>
+      <w:r>
+        <w:rPr>
+          <w:b/>
+          <w:bCs/>
+        </w:rPr>
         <w:t xml:space="preserve">Question </w:t>
       </w:r>
       <w:r>
+        <w:rPr>
+          <w:b/>
+          <w:bCs/>
+        </w:rPr>
         <w:t>7</w:t>
       </w:r>
       <w:r>
-        <w:t xml:space="preserve">: </w:t>
+        <w:rPr>
+          <w:b/>
+          <w:bCs/>
+        </w:rPr>
+        <w:t>:</w:t>
+      </w:r>
+      <w:r>
+        <w:t xml:space="preserve"> </w:t>
       </w:r>
       <w:r>
         <w:t xml:space="preserve">What adjustments does </w:t>
@@ -766,23 +1051,68 @@
           <w:ilvl w:val="0"/>
           <w:numId w:val="8"/>
         </w:numPr>
-      </w:pPr>
-      <w:r>
-        <w:t>It clips the negative gradients at ReLU layers, allowing only positive signals to pass (Correct Answer)</w:t>
-      </w:r>
-      <w:r>
+        <w:jc w:val="both"/>
+        <w:rPr>
+          <w:i/>
+          <w:iCs/>
+        </w:rPr>
+      </w:pPr>
+      <w:r>
+        <w:rPr>
+          <w:i/>
+          <w:iCs/>
+        </w:rPr>
+        <w:t xml:space="preserve">It clips the negative gradients at </w:t>
+      </w:r>
+      <w:proofErr w:type="spellStart"/>
+      <w:r>
+        <w:rPr>
+          <w:i/>
+          <w:iCs/>
+        </w:rPr>
+        <w:t>ReLU</w:t>
+      </w:r>
+      <w:proofErr w:type="spellEnd"/>
+      <w:r>
+        <w:rPr>
+          <w:i/>
+          <w:iCs/>
+        </w:rPr>
+        <w:t xml:space="preserve"> layers, allowing only positive signals to pass (Correct Answer)</w:t>
+      </w:r>
+      <w:r>
+        <w:rPr>
+          <w:i/>
+          <w:iCs/>
+        </w:rPr>
         <w:t xml:space="preserve"> </w:t>
       </w:r>
       <w:r>
+        <w:rPr>
+          <w:i/>
+          <w:iCs/>
+        </w:rPr>
         <w:t>–</w:t>
       </w:r>
       <w:r>
+        <w:rPr>
+          <w:i/>
+          <w:iCs/>
+        </w:rPr>
         <w:t xml:space="preserve"> </w:t>
       </w:r>
       <w:r>
+        <w:rPr>
+          <w:i/>
+          <w:iCs/>
+        </w:rPr>
         <w:t xml:space="preserve">This </w:t>
       </w:r>
       <w:r>
+        <w:rPr>
+          <w:i/>
+          <w:iCs/>
+        </w:rPr>
         <w:t>ensures that only features that positively contribute to the activation are propagated backwards.</w:t>
       </w:r>
     </w:p>
@@ -793,6 +1123,7 @@
           <w:ilvl w:val="0"/>
           <w:numId w:val="8"/>
         </w:numPr>
+        <w:jc w:val="both"/>
       </w:pPr>
       <w:r>
         <w:t>It averages the gradients over multiple noisy inputs to reduce variance</w:t>
@@ -801,8 +1132,13 @@
         <w:t xml:space="preserve"> – This </w:t>
       </w:r>
       <w:r>
-        <w:t>option describes SmoothGrad</w:t>
-      </w:r>
+        <w:t xml:space="preserve">option describes </w:t>
+      </w:r>
+      <w:proofErr w:type="spellStart"/>
+      <w:r>
+        <w:t>SmoothGrad</w:t>
+      </w:r>
+      <w:proofErr w:type="spellEnd"/>
     </w:p>
     <w:p>
       <w:pPr>
@@ -811,6 +1147,7 @@
           <w:ilvl w:val="0"/>
           <w:numId w:val="8"/>
         </w:numPr>
+        <w:jc w:val="both"/>
       </w:pPr>
       <w:r>
         <w:t>It multiplies gradients by the input image to improve localisation – This refers to a different attribution method</w:t>
@@ -823,14 +1160,33 @@
           <w:ilvl w:val="0"/>
           <w:numId w:val="8"/>
         </w:numPr>
-      </w:pPr>
-      <w:r>
-        <w:t>It removes ReLU activations entirely during backpropagation – This would break the model’s structure</w:t>
-      </w:r>
-    </w:p>
-    <w:p>
-      <w:r>
-        <w:t xml:space="preserve">Pitfall: </w:t>
+        <w:jc w:val="both"/>
+      </w:pPr>
+      <w:r>
+        <w:t xml:space="preserve">It removes </w:t>
+      </w:r>
+      <w:proofErr w:type="spellStart"/>
+      <w:r>
+        <w:t>ReLU</w:t>
+      </w:r>
+      <w:proofErr w:type="spellEnd"/>
+      <w:r>
+        <w:t xml:space="preserve"> activations entirely during backpropagation – This would break the model’s structure</w:t>
+      </w:r>
+    </w:p>
+    <w:p>
+      <w:pPr>
+        <w:jc w:val="both"/>
+      </w:pPr>
+      <w:r>
+        <w:rPr>
+          <w:b/>
+          <w:bCs/>
+        </w:rPr>
+        <w:t>Pitfall:</w:t>
+      </w:r>
+      <w:r>
+        <w:t xml:space="preserve"> </w:t>
       </w:r>
       <w:r>
         <w:t xml:space="preserve">Confusing </w:t>
@@ -843,17 +1199,50 @@
       </w:r>
     </w:p>
     <w:p>
-      <w:r>
+      <w:pPr>
+        <w:jc w:val="both"/>
+      </w:pPr>
+      <w:r>
+        <w:rPr>
+          <w:b/>
+          <w:bCs/>
+        </w:rPr>
         <w:t xml:space="preserve">Question </w:t>
       </w:r>
       <w:r>
+        <w:rPr>
+          <w:b/>
+          <w:bCs/>
+        </w:rPr>
         <w:t>8</w:t>
       </w:r>
       <w:r>
+        <w:rPr>
+          <w:b/>
+          <w:bCs/>
+        </w:rPr>
         <w:t>:</w:t>
       </w:r>
       <w:r>
-        <w:t xml:space="preserve"> The requirement that a saliency method should mirror the sensitivity of the model when the input is transformed by a constant shift is called:</w:t>
+        <w:t xml:space="preserve"> </w:t>
+      </w:r>
+      <w:r>
+        <w:t>Which rule</w:t>
+      </w:r>
+      <w:r>
+        <w:t xml:space="preserve"> states</w:t>
+      </w:r>
+      <w:r>
+        <w:t xml:space="preserve"> that a saliency method should </w:t>
+      </w:r>
+      <w:r>
+        <w:t xml:space="preserve">replicate </w:t>
+      </w:r>
+      <w:r>
+        <w:t>the sensitivity of the model when the input is transformed by a constant shift</w:t>
+      </w:r>
+      <w:r>
+        <w:t>?</w:t>
       </w:r>
     </w:p>
     <w:p>
@@ -863,15 +1252,53 @@
           <w:ilvl w:val="0"/>
           <w:numId w:val="9"/>
         </w:numPr>
-      </w:pPr>
-      <w:r>
+        <w:jc w:val="both"/>
+        <w:rPr>
+          <w:i/>
+          <w:iCs/>
+        </w:rPr>
+      </w:pPr>
+      <w:r>
+        <w:rPr>
+          <w:i/>
+          <w:iCs/>
+        </w:rPr>
         <w:t>Input Invariance (Correct Answer)</w:t>
       </w:r>
       <w:r>
-        <w:t xml:space="preserve"> - </w:t>
-      </w:r>
-      <w:r>
-        <w:t>Input Invariance ensures that if a pre-processing step does not change the model’s output, it should not fundamentally change the attribution.</w:t>
+        <w:rPr>
+          <w:i/>
+          <w:iCs/>
+        </w:rPr>
+        <w:t xml:space="preserve"> </w:t>
+      </w:r>
+      <w:r>
+        <w:rPr>
+          <w:i/>
+          <w:iCs/>
+        </w:rPr>
+        <w:t>–</w:t>
+      </w:r>
+      <w:r>
+        <w:rPr>
+          <w:i/>
+          <w:iCs/>
+        </w:rPr>
+        <w:t xml:space="preserve"> </w:t>
+      </w:r>
+      <w:r>
+        <w:rPr>
+          <w:i/>
+          <w:iCs/>
+        </w:rPr>
+        <w:t xml:space="preserve">This requirement states that </w:t>
+      </w:r>
+      <w:r>
+        <w:rPr>
+          <w:i/>
+          <w:iCs/>
+        </w:rPr>
+        <w:t>if a pre-processing step does not change the model’s output, it should not fundamentally change the attribution.</w:t>
       </w:r>
     </w:p>
     <w:p>
@@ -881,6 +1308,7 @@
           <w:ilvl w:val="0"/>
           <w:numId w:val="9"/>
         </w:numPr>
+        <w:jc w:val="both"/>
       </w:pPr>
       <w:r>
         <w:t xml:space="preserve">Sensitivity </w:t>
@@ -902,6 +1330,7 @@
           <w:ilvl w:val="0"/>
           <w:numId w:val="9"/>
         </w:numPr>
+        <w:jc w:val="both"/>
       </w:pPr>
       <w:r>
         <w:t xml:space="preserve">Implementation Invariance </w:t>
@@ -920,6 +1349,7 @@
           <w:ilvl w:val="0"/>
           <w:numId w:val="9"/>
         </w:numPr>
+        <w:jc w:val="both"/>
       </w:pPr>
       <w:r>
         <w:t>Completeness</w:t>
@@ -938,16 +1368,36 @@
       </w:r>
     </w:p>
     <w:p>
-      <w:r>
-        <w:t xml:space="preserve">Pitfall: </w:t>
+      <w:pPr>
+        <w:jc w:val="both"/>
+      </w:pPr>
+      <w:r>
+        <w:rPr>
+          <w:b/>
+          <w:bCs/>
+        </w:rPr>
+        <w:t>Pitfall:</w:t>
+      </w:r>
+      <w:r>
+        <w:t xml:space="preserve"> </w:t>
       </w:r>
       <w:r>
         <w:t>Mixing invariance with unrelated mathematical properties.</w:t>
       </w:r>
     </w:p>
     <w:p>
-      <w:r>
-        <w:t xml:space="preserve">Question 9: </w:t>
+      <w:pPr>
+        <w:jc w:val="both"/>
+      </w:pPr>
+      <w:r>
+        <w:rPr>
+          <w:b/>
+          <w:bCs/>
+        </w:rPr>
+        <w:t>Question 9:</w:t>
+      </w:r>
+      <w:r>
+        <w:t xml:space="preserve"> </w:t>
       </w:r>
       <w:r>
         <w:t>Why can saliency maps sometimes highlight edges or textures even when the model is randomized</w:t>
@@ -963,29 +1413,59 @@
           <w:ilvl w:val="0"/>
           <w:numId w:val="10"/>
         </w:numPr>
-      </w:pPr>
-      <w:r>
-        <w:t>Because they behave like edge detectors and may not depend on learned model parameter</w:t>
-      </w:r>
-      <w:r>
-        <w:t>s</w:t>
-      </w:r>
-      <w:r>
+        <w:jc w:val="both"/>
+        <w:rPr>
+          <w:i/>
+          <w:iCs/>
+        </w:rPr>
+      </w:pPr>
+      <w:r>
+        <w:rPr>
+          <w:i/>
+          <w:iCs/>
+        </w:rPr>
+        <w:t>Because they behave like edge detectors and may not depend on learned model parameters</w:t>
+      </w:r>
+      <w:r>
+        <w:rPr>
+          <w:i/>
+          <w:iCs/>
+        </w:rPr>
         <w:t>.</w:t>
       </w:r>
       <w:r>
+        <w:rPr>
+          <w:i/>
+          <w:iCs/>
+        </w:rPr>
         <w:t xml:space="preserve"> (Correct Answer)</w:t>
       </w:r>
       <w:r>
+        <w:rPr>
+          <w:i/>
+          <w:iCs/>
+        </w:rPr>
         <w:t xml:space="preserve"> </w:t>
       </w:r>
       <w:r>
+        <w:rPr>
+          <w:i/>
+          <w:iCs/>
+        </w:rPr>
         <w:t>–</w:t>
       </w:r>
       <w:r>
+        <w:rPr>
+          <w:i/>
+          <w:iCs/>
+        </w:rPr>
         <w:t xml:space="preserve"> </w:t>
       </w:r>
       <w:r>
+        <w:rPr>
+          <w:i/>
+          <w:iCs/>
+        </w:rPr>
         <w:t>As seen in the paper by Adebayo et. al, some saliency methods produce visually similar outputs even when the model is random.</w:t>
       </w:r>
     </w:p>
@@ -996,9 +1476,9 @@
           <w:ilvl w:val="0"/>
           <w:numId w:val="10"/>
         </w:numPr>
-      </w:pPr>
-      <w:r>
-        <w:lastRenderedPageBreak/>
+        <w:jc w:val="both"/>
+      </w:pPr>
+      <w:r>
         <w:t xml:space="preserve">Because gradients are only </w:t>
       </w:r>
       <w:r>
@@ -1018,6 +1498,7 @@
           <w:ilvl w:val="0"/>
           <w:numId w:val="10"/>
         </w:numPr>
+        <w:jc w:val="both"/>
       </w:pPr>
       <w:r>
         <w:t>Because the model ignores pixel values during inference – This is false</w:t>
@@ -1030,25 +1511,52 @@
           <w:ilvl w:val="0"/>
           <w:numId w:val="10"/>
         </w:numPr>
+        <w:jc w:val="both"/>
       </w:pPr>
       <w:r>
         <w:t>Because saliency maps always use pre-trained feature extractors – Not necessarily true</w:t>
       </w:r>
     </w:p>
     <w:p>
-      <w:r>
-        <w:t xml:space="preserve">Pitfall: </w:t>
+      <w:pPr>
+        <w:jc w:val="both"/>
+      </w:pPr>
+      <w:r>
+        <w:rPr>
+          <w:b/>
+          <w:bCs/>
+        </w:rPr>
+        <w:lastRenderedPageBreak/>
+        <w:t>Pitfall:</w:t>
+      </w:r>
+      <w:r>
+        <w:t xml:space="preserve"> </w:t>
       </w:r>
       <w:r>
         <w:t>Assuming visual quality implies meaningful explanation.</w:t>
       </w:r>
     </w:p>
     <w:p>
-      <w:r>
+      <w:pPr>
+        <w:jc w:val="both"/>
+      </w:pPr>
+      <w:r>
+        <w:rPr>
+          <w:b/>
+          <w:bCs/>
+        </w:rPr>
         <w:t>Question 10:</w:t>
       </w:r>
       <w:r>
-        <w:t xml:space="preserve"> What happens to the visual coherence of SmoothGrad sensitivity maps as the sample size n increases?</w:t>
+        <w:t xml:space="preserve"> What happens to the visual coherence of </w:t>
+      </w:r>
+      <w:proofErr w:type="spellStart"/>
+      <w:r>
+        <w:t>SmoothGrad</w:t>
+      </w:r>
+      <w:proofErr w:type="spellEnd"/>
+      <w:r>
+        <w:t xml:space="preserve"> sensitivity maps as the sample size n increases?</w:t>
       </w:r>
     </w:p>
     <w:p>
@@ -1058,12 +1566,21 @@
           <w:ilvl w:val="0"/>
           <w:numId w:val="11"/>
         </w:numPr>
+        <w:jc w:val="both"/>
       </w:pPr>
       <w:r>
         <w:t>The maps become increasingly noisy as more random perturbations are added.</w:t>
       </w:r>
       <w:r>
-        <w:t xml:space="preserve"> – This is not true as through SmoothGrad, the process of averaging </w:t>
+        <w:t xml:space="preserve"> – This is not true as through </w:t>
+      </w:r>
+      <w:proofErr w:type="spellStart"/>
+      <w:r>
+        <w:t>SmoothGrad</w:t>
+      </w:r>
+      <w:proofErr w:type="spellEnd"/>
+      <w:r>
+        <w:t xml:space="preserve">, the process of averaging </w:t>
       </w:r>
       <w:r>
         <w:t>sensitivity maps of an image</w:t>
@@ -1079,6 +1596,7 @@
           <w:ilvl w:val="0"/>
           <w:numId w:val="11"/>
         </w:numPr>
+        <w:jc w:val="both"/>
       </w:pPr>
       <w:r>
         <w:t>The maps eventually vanish to black because the average gradient becomes zero.</w:t>
@@ -1094,6 +1612,7 @@
           <w:ilvl w:val="0"/>
           <w:numId w:val="11"/>
         </w:numPr>
+        <w:jc w:val="both"/>
       </w:pPr>
       <w:r>
         <w:t>They become sharper only if the noise level σ is also increased simultaneously.</w:t>
@@ -1109,20 +1628,40 @@
           <w:ilvl w:val="0"/>
           <w:numId w:val="11"/>
         </w:numPr>
-      </w:pPr>
-      <w:r>
+        <w:jc w:val="both"/>
+        <w:rPr>
+          <w:i/>
+          <w:iCs/>
+        </w:rPr>
+      </w:pPr>
+      <w:r>
+        <w:rPr>
+          <w:i/>
+          <w:iCs/>
+        </w:rPr>
         <w:t>They become smoother and more coherent, but with diminishing returns after n &gt; 50. (Correct Answer)</w:t>
       </w:r>
       <w:r>
-        <w:t xml:space="preserve"> – As </w:t>
-      </w:r>
-      <w:r>
-        <w:t>n increases, the approximation of the local average is improved but the visual improvement levels off after 50 samples.</w:t>
-      </w:r>
-    </w:p>
-    <w:p>
-      <w:r>
-        <w:t xml:space="preserve">Pitfall: </w:t>
+        <w:rPr>
+          <w:i/>
+          <w:iCs/>
+        </w:rPr>
+        <w:t xml:space="preserve"> – As n increases, the approximation of the local average is improved but the visual improvement levels off after 50 samples.</w:t>
+      </w:r>
+    </w:p>
+    <w:p>
+      <w:pPr>
+        <w:jc w:val="both"/>
+      </w:pPr>
+      <w:r>
+        <w:rPr>
+          <w:b/>
+          <w:bCs/>
+        </w:rPr>
+        <w:t>Pitfall:</w:t>
+      </w:r>
+      <w:r>
+        <w:t xml:space="preserve"> </w:t>
       </w:r>
       <w:r>
         <w:t>Assuming “more noise inputs = noisier output” instead of averaging effect.</w:t>

</xml_diff>

<commit_message>
Edited Quiz to have only 2 pages
</commit_message>
<xml_diff>
--- a/Quiz.docx
+++ b/Quiz.docx
@@ -10,8 +10,8 @@
           <w:bCs/>
           <w:i/>
           <w:iCs/>
-          <w:sz w:val="28"/>
-          <w:szCs w:val="28"/>
+          <w:sz w:val="26"/>
+          <w:szCs w:val="26"/>
           <w:u w:val="single"/>
         </w:rPr>
       </w:pPr>
@@ -21,55 +21,70 @@
           <w:bCs/>
           <w:i/>
           <w:iCs/>
-          <w:sz w:val="28"/>
-          <w:szCs w:val="28"/>
+          <w:sz w:val="26"/>
+          <w:szCs w:val="26"/>
           <w:u w:val="single"/>
         </w:rPr>
-        <w:t xml:space="preserve">Saliency Maps and Input-Space Interpretability </w:t>
-      </w:r>
+        <w:t>Saliency Maps and Input-Space Interpretability Adversarial Quiz</w:t>
+      </w:r>
+    </w:p>
+    <w:p>
+      <w:pPr>
+        <w:jc w:val="both"/>
+        <w:rPr>
+          <w:sz w:val="21"/>
+          <w:szCs w:val="21"/>
+        </w:rPr>
+      </w:pPr>
       <w:r>
         <w:rPr>
           <w:b/>
           <w:bCs/>
-          <w:i/>
-          <w:iCs/>
-          <w:sz w:val="28"/>
-          <w:szCs w:val="28"/>
-          <w:u w:val="single"/>
-        </w:rPr>
-        <w:t>Adversarial Quiz</w:t>
-      </w:r>
-    </w:p>
-    <w:p>
-      <w:pPr>
-        <w:jc w:val="both"/>
-      </w:pPr>
-      <w:r>
-        <w:rPr>
-          <w:b/>
-          <w:bCs/>
+          <w:sz w:val="21"/>
+          <w:szCs w:val="21"/>
         </w:rPr>
         <w:t>Question 1:</w:t>
       </w:r>
       <w:r>
+        <w:rPr>
+          <w:sz w:val="21"/>
+          <w:szCs w:val="21"/>
+        </w:rPr>
         <w:t xml:space="preserve"> </w:t>
       </w:r>
       <w:r>
-        <w:t xml:space="preserve">If </w:t>
-      </w:r>
-      <w:r>
-        <w:t xml:space="preserve">two </w:t>
-      </w:r>
-      <w:r>
-        <w:t>neural networks perform the same function</w:t>
-      </w:r>
-      <w:r>
-        <w:t xml:space="preserve">, which principle ensures that the networks </w:t>
-      </w:r>
-      <w:r>
-        <w:t>receive the same attributions</w:t>
-      </w:r>
-      <w:r>
+        <w:rPr>
+          <w:sz w:val="21"/>
+          <w:szCs w:val="21"/>
+        </w:rPr>
+        <w:t>W</w:t>
+      </w:r>
+      <w:r>
+        <w:rPr>
+          <w:sz w:val="21"/>
+          <w:szCs w:val="21"/>
+        </w:rPr>
+        <w:t xml:space="preserve">hich principle ensures that </w:t>
+      </w:r>
+      <w:r>
+        <w:rPr>
+          <w:sz w:val="21"/>
+          <w:szCs w:val="21"/>
+        </w:rPr>
+        <w:t>two identical</w:t>
+      </w:r>
+      <w:r>
+        <w:rPr>
+          <w:sz w:val="21"/>
+          <w:szCs w:val="21"/>
+        </w:rPr>
+        <w:t xml:space="preserve"> networks receive the same attributions</w:t>
+      </w:r>
+      <w:r>
+        <w:rPr>
+          <w:sz w:val="21"/>
+          <w:szCs w:val="21"/>
+        </w:rPr>
         <w:t>?</w:t>
       </w:r>
     </w:p>
@@ -81,27 +96,45 @@
           <w:numId w:val="1"/>
         </w:numPr>
         <w:jc w:val="both"/>
-      </w:pPr>
-      <w:r>
+        <w:rPr>
+          <w:sz w:val="21"/>
+          <w:szCs w:val="21"/>
+        </w:rPr>
+      </w:pPr>
+      <w:r>
+        <w:rPr>
+          <w:sz w:val="21"/>
+          <w:szCs w:val="21"/>
+        </w:rPr>
         <w:t>Sensitivity</w:t>
       </w:r>
       <w:r>
+        <w:rPr>
+          <w:sz w:val="21"/>
+          <w:szCs w:val="21"/>
+        </w:rPr>
         <w:t xml:space="preserve"> – </w:t>
       </w:r>
       <w:r>
-        <w:t xml:space="preserve"> This rule is about whether a feature has an impact on the output</w:t>
-      </w:r>
-      <w:r>
-        <w:t xml:space="preserve">, not </w:t>
-      </w:r>
-      <w:r>
-        <w:t xml:space="preserve">whether two </w:t>
-      </w:r>
-      <w:r>
-        <w:t>identical networks produce the same</w:t>
-      </w:r>
-      <w:r>
-        <w:t xml:space="preserve"> attributions</w:t>
+        <w:rPr>
+          <w:sz w:val="21"/>
+          <w:szCs w:val="21"/>
+        </w:rPr>
+        <w:t xml:space="preserve"> </w:t>
+      </w:r>
+      <w:r>
+        <w:rPr>
+          <w:sz w:val="21"/>
+          <w:szCs w:val="21"/>
+        </w:rPr>
+        <w:t xml:space="preserve">Only knows </w:t>
+      </w:r>
+      <w:r>
+        <w:rPr>
+          <w:sz w:val="21"/>
+          <w:szCs w:val="21"/>
+        </w:rPr>
+        <w:t>whether a feature has an impact on the output</w:t>
       </w:r>
     </w:p>
     <w:p>
@@ -112,24 +145,66 @@
           <w:numId w:val="1"/>
         </w:numPr>
         <w:jc w:val="both"/>
-      </w:pPr>
-      <w:r>
+        <w:rPr>
+          <w:sz w:val="21"/>
+          <w:szCs w:val="21"/>
+        </w:rPr>
+      </w:pPr>
+      <w:r>
+        <w:rPr>
+          <w:sz w:val="21"/>
+          <w:szCs w:val="21"/>
+        </w:rPr>
         <w:t>Completeness</w:t>
       </w:r>
       <w:r>
+        <w:rPr>
+          <w:sz w:val="21"/>
+          <w:szCs w:val="21"/>
+        </w:rPr>
         <w:t xml:space="preserve"> - </w:t>
       </w:r>
       <w:r>
-        <w:t xml:space="preserve"> This focuses on the </w:t>
-      </w:r>
-      <w:r>
+        <w:rPr>
+          <w:sz w:val="21"/>
+          <w:szCs w:val="21"/>
+        </w:rPr>
+        <w:t xml:space="preserve"> </w:t>
+      </w:r>
+      <w:r>
+        <w:rPr>
+          <w:sz w:val="21"/>
+          <w:szCs w:val="21"/>
+        </w:rPr>
+        <w:t>F</w:t>
+      </w:r>
+      <w:r>
+        <w:rPr>
+          <w:sz w:val="21"/>
+          <w:szCs w:val="21"/>
+        </w:rPr>
+        <w:t xml:space="preserve">ocuses on the </w:t>
+      </w:r>
+      <w:r>
+        <w:rPr>
+          <w:sz w:val="21"/>
+          <w:szCs w:val="21"/>
+        </w:rPr>
         <w:t xml:space="preserve">total </w:t>
       </w:r>
       <w:r>
-        <w:t xml:space="preserve">amount of attribution that is assigned </w:t>
-      </w:r>
-      <w:r>
-        <w:t>overall</w:t>
+        <w:rPr>
+          <w:sz w:val="21"/>
+          <w:szCs w:val="21"/>
+        </w:rPr>
+        <w:t xml:space="preserve">overall </w:t>
+      </w:r>
+      <w:r>
+        <w:rPr>
+          <w:sz w:val="21"/>
+          <w:szCs w:val="21"/>
+        </w:rPr>
+        <w:t>amount of attribution</w:t>
       </w:r>
     </w:p>
     <w:p>
@@ -143,21 +218,99 @@
         <w:rPr>
           <w:i/>
           <w:iCs/>
-        </w:rPr>
-      </w:pPr>
-      <w:r>
-        <w:rPr>
-          <w:i/>
-          <w:iCs/>
-        </w:rPr>
-        <w:t>Implementation Invariance (Correct Answer)</w:t>
-      </w:r>
-      <w:r>
-        <w:rPr>
-          <w:i/>
-          <w:iCs/>
-        </w:rPr>
-        <w:t xml:space="preserve"> - This rule requests that the attribution depends on the function implemented by the network and the input, not the specific implementation details.</w:t>
+          <w:sz w:val="21"/>
+          <w:szCs w:val="21"/>
+        </w:rPr>
+      </w:pPr>
+      <w:r>
+        <w:rPr>
+          <w:i/>
+          <w:iCs/>
+          <w:sz w:val="21"/>
+          <w:szCs w:val="21"/>
+        </w:rPr>
+        <w:t>Implementation Invariance (</w:t>
+      </w:r>
+      <w:r>
+        <w:rPr>
+          <w:i/>
+          <w:iCs/>
+          <w:sz w:val="21"/>
+          <w:szCs w:val="21"/>
+        </w:rPr>
+        <w:t>Key</w:t>
+      </w:r>
+      <w:r>
+        <w:rPr>
+          <w:i/>
+          <w:iCs/>
+          <w:sz w:val="21"/>
+          <w:szCs w:val="21"/>
+        </w:rPr>
+        <w:t>)</w:t>
+      </w:r>
+      <w:r>
+        <w:rPr>
+          <w:i/>
+          <w:iCs/>
+          <w:sz w:val="21"/>
+          <w:szCs w:val="21"/>
+        </w:rPr>
+        <w:t xml:space="preserve"> - </w:t>
+      </w:r>
+      <w:r>
+        <w:rPr>
+          <w:i/>
+          <w:iCs/>
+          <w:sz w:val="21"/>
+          <w:szCs w:val="21"/>
+        </w:rPr>
+        <w:t>A</w:t>
+      </w:r>
+      <w:r>
+        <w:rPr>
+          <w:i/>
+          <w:iCs/>
+          <w:sz w:val="21"/>
+          <w:szCs w:val="21"/>
+        </w:rPr>
+        <w:t xml:space="preserve">ttribution depends on the </w:t>
+      </w:r>
+      <w:r>
+        <w:rPr>
+          <w:i/>
+          <w:iCs/>
+          <w:sz w:val="21"/>
+          <w:szCs w:val="21"/>
+        </w:rPr>
+        <w:t xml:space="preserve">network’s </w:t>
+      </w:r>
+      <w:r>
+        <w:rPr>
+          <w:i/>
+          <w:iCs/>
+          <w:sz w:val="21"/>
+          <w:szCs w:val="21"/>
+        </w:rPr>
+        <w:t xml:space="preserve">function </w:t>
+      </w:r>
+      <w:r>
+        <w:rPr>
+          <w:i/>
+          <w:iCs/>
+          <w:sz w:val="21"/>
+          <w:szCs w:val="21"/>
+        </w:rPr>
+        <w:t>and input</w:t>
+      </w:r>
+      <w:r>
+        <w:rPr>
+          <w:i/>
+          <w:iCs/>
+          <w:sz w:val="21"/>
+          <w:szCs w:val="21"/>
+        </w:rPr>
+        <w:t>, not the specific implementation details.</w:t>
       </w:r>
     </w:p>
     <w:p>
@@ -168,68 +321,118 @@
           <w:numId w:val="1"/>
         </w:numPr>
         <w:jc w:val="both"/>
-      </w:pPr>
-      <w:r>
+        <w:rPr>
+          <w:sz w:val="21"/>
+          <w:szCs w:val="21"/>
+        </w:rPr>
+      </w:pPr>
+      <w:r>
+        <w:rPr>
+          <w:sz w:val="21"/>
+          <w:szCs w:val="21"/>
+        </w:rPr>
         <w:t>Input Invariance</w:t>
       </w:r>
       <w:r>
+        <w:rPr>
+          <w:sz w:val="21"/>
+          <w:szCs w:val="21"/>
+        </w:rPr>
         <w:t xml:space="preserve"> – </w:t>
       </w:r>
       <w:r>
-        <w:t xml:space="preserve">This rule </w:t>
-      </w:r>
-      <w:r>
-        <w:t>relates to the fact that if</w:t>
-      </w:r>
-      <w:r>
-        <w:t xml:space="preserve"> the input is transformed in a way that doesn’t affect predictions, </w:t>
-      </w:r>
-      <w:r>
-        <w:t xml:space="preserve">the </w:t>
-      </w:r>
-      <w:r>
-        <w:t xml:space="preserve">attribution shouldn’t change </w:t>
-      </w:r>
-    </w:p>
-    <w:p>
-      <w:pPr>
-        <w:jc w:val="both"/>
+        <w:rPr>
+          <w:sz w:val="21"/>
+          <w:szCs w:val="21"/>
+        </w:rPr>
+        <w:t xml:space="preserve">Confuses </w:t>
+      </w:r>
+      <w:r>
+        <w:rPr>
+          <w:sz w:val="21"/>
+          <w:szCs w:val="21"/>
+        </w:rPr>
+        <w:t xml:space="preserve">internal model structure with external input </w:t>
+      </w:r>
+      <w:r>
+        <w:rPr>
+          <w:sz w:val="21"/>
+          <w:szCs w:val="21"/>
+        </w:rPr>
+        <w:t>behaviour.</w:t>
+      </w:r>
+    </w:p>
+    <w:p>
+      <w:pPr>
+        <w:jc w:val="both"/>
+        <w:rPr>
+          <w:sz w:val="21"/>
+          <w:szCs w:val="21"/>
+        </w:rPr>
       </w:pPr>
       <w:r>
         <w:rPr>
           <w:b/>
           <w:bCs/>
+          <w:sz w:val="21"/>
+          <w:szCs w:val="21"/>
         </w:rPr>
         <w:t>Pitfall:</w:t>
       </w:r>
       <w:r>
-        <w:t xml:space="preserve"> </w:t>
-      </w:r>
-      <w:r>
-        <w:t>Confusing model equivalence with input behaviour.</w:t>
-      </w:r>
-    </w:p>
-    <w:p>
-      <w:pPr>
-        <w:jc w:val="both"/>
+        <w:rPr>
+          <w:sz w:val="21"/>
+          <w:szCs w:val="21"/>
+        </w:rPr>
+        <w:t xml:space="preserve"> Confusing model equivalence with input behaviour.</w:t>
+      </w:r>
+    </w:p>
+    <w:p>
+      <w:pPr>
+        <w:jc w:val="both"/>
+        <w:rPr>
+          <w:sz w:val="21"/>
+          <w:szCs w:val="21"/>
+        </w:rPr>
       </w:pPr>
       <w:r>
         <w:rPr>
           <w:b/>
           <w:bCs/>
+          <w:sz w:val="21"/>
+          <w:szCs w:val="21"/>
         </w:rPr>
         <w:t>Question 2:</w:t>
       </w:r>
       <w:r>
-        <w:t xml:space="preserve"> What is the primary mechanism used by </w:t>
+        <w:rPr>
+          <w:sz w:val="21"/>
+          <w:szCs w:val="21"/>
+        </w:rPr>
+        <w:t xml:space="preserve"> </w:t>
+      </w:r>
+      <w:r>
+        <w:rPr>
+          <w:sz w:val="21"/>
+          <w:szCs w:val="21"/>
+        </w:rPr>
+        <w:t xml:space="preserve">How does </w:t>
       </w:r>
       <w:proofErr w:type="spellStart"/>
       <w:r>
+        <w:rPr>
+          <w:sz w:val="21"/>
+          <w:szCs w:val="21"/>
+        </w:rPr>
         <w:t>SmoothGrad</w:t>
       </w:r>
       <w:proofErr w:type="spellEnd"/>
       <w:r>
-        <w:t xml:space="preserve"> to reduce the visual noise found in standard gradient-based sensitivity maps?</w:t>
+        <w:rPr>
+          <w:sz w:val="21"/>
+          <w:szCs w:val="21"/>
+        </w:rPr>
+        <w:t xml:space="preserve"> reduce the visual noise found in standard gradient-based sensitivity maps?</w:t>
       </w:r>
     </w:p>
     <w:p>
@@ -243,59 +446,109 @@
         <w:rPr>
           <w:i/>
           <w:iCs/>
-        </w:rPr>
-      </w:pPr>
-      <w:r>
-        <w:rPr>
-          <w:i/>
-          <w:iCs/>
-        </w:rPr>
-        <w:t>Averaging sensitivity maps of an image with added Gaussian noise (Correct Answer)</w:t>
-      </w:r>
-      <w:r>
-        <w:rPr>
-          <w:i/>
-          <w:iCs/>
-        </w:rPr>
-        <w:t xml:space="preserve"> - </w:t>
+          <w:sz w:val="21"/>
+          <w:szCs w:val="21"/>
+        </w:rPr>
+      </w:pPr>
+      <w:r>
+        <w:rPr>
+          <w:i/>
+          <w:iCs/>
+          <w:sz w:val="21"/>
+          <w:szCs w:val="21"/>
+        </w:rPr>
+        <w:t>Averaging sensitivity maps of an image with added Gaussian noise (</w:t>
+      </w:r>
+      <w:r>
+        <w:rPr>
+          <w:i/>
+          <w:iCs/>
+          <w:sz w:val="21"/>
+          <w:szCs w:val="21"/>
+        </w:rPr>
+        <w:t>Key</w:t>
+      </w:r>
+      <w:r>
+        <w:rPr>
+          <w:i/>
+          <w:iCs/>
+          <w:sz w:val="21"/>
+          <w:szCs w:val="21"/>
+        </w:rPr>
+        <w:t>)</w:t>
+      </w:r>
+      <w:r>
+        <w:rPr>
+          <w:i/>
+          <w:iCs/>
+          <w:sz w:val="21"/>
+          <w:szCs w:val="21"/>
+        </w:rPr>
+        <w:t xml:space="preserve"> </w:t>
+      </w:r>
+      <w:r>
+        <w:rPr>
+          <w:i/>
+          <w:iCs/>
+          <w:sz w:val="21"/>
+          <w:szCs w:val="21"/>
+        </w:rPr>
+        <w:t>–</w:t>
+      </w:r>
+      <w:r>
+        <w:rPr>
+          <w:i/>
+          <w:iCs/>
+          <w:sz w:val="21"/>
+          <w:szCs w:val="21"/>
+        </w:rPr>
+        <w:t xml:space="preserve"> </w:t>
+      </w:r>
+      <w:r>
+        <w:rPr>
+          <w:i/>
+          <w:iCs/>
+          <w:sz w:val="21"/>
+          <w:szCs w:val="21"/>
+        </w:rPr>
+        <w:t>It uses the formula</w:t>
+      </w:r>
+      <w:r>
+        <w:rPr>
+          <w:i/>
+          <w:iCs/>
+          <w:sz w:val="21"/>
+          <w:szCs w:val="21"/>
+        </w:rPr>
+        <w:t xml:space="preserve"> </w:t>
       </w:r>
       <w:proofErr w:type="spellStart"/>
       <w:r>
         <w:rPr>
           <w:i/>
           <w:iCs/>
-        </w:rPr>
-        <w:t>SmoothGrad</w:t>
+          <w:sz w:val="21"/>
+          <w:szCs w:val="21"/>
+        </w:rPr>
+        <w:t>M^</w:t>
+      </w:r>
+      <w:r>
+        <w:rPr>
+          <w:i/>
+          <w:iCs/>
+          <w:sz w:val="21"/>
+          <w:szCs w:val="21"/>
+          <w:vertAlign w:val="subscript"/>
+        </w:rPr>
+        <w:t>c</w:t>
       </w:r>
       <w:proofErr w:type="spellEnd"/>
       <w:r>
         <w:rPr>
           <w:i/>
           <w:iCs/>
-        </w:rPr>
-        <w:t xml:space="preserve"> calculates </w:t>
-      </w:r>
-      <w:proofErr w:type="spellStart"/>
-      <w:r>
-        <w:rPr>
-          <w:i/>
-          <w:iCs/>
-        </w:rPr>
-        <w:t>M^</w:t>
-      </w:r>
-      <w:r>
-        <w:rPr>
-          <w:i/>
-          <w:iCs/>
-          <w:vertAlign w:val="subscript"/>
-        </w:rPr>
-        <w:t>c</w:t>
-      </w:r>
-      <w:proofErr w:type="spellEnd"/>
-      <w:r>
-        <w:rPr>
-          <w:i/>
-          <w:iCs/>
+          <w:sz w:val="21"/>
+          <w:szCs w:val="21"/>
         </w:rPr>
         <w:t xml:space="preserve"> (x) = 1/n </w:t>
       </w:r>
@@ -309,6 +562,8 @@
                 <w:rFonts w:ascii="Cambria Math" w:hAnsi="Cambria Math"/>
                 <w:i/>
                 <w:iCs/>
+                <w:sz w:val="21"/>
+                <w:szCs w:val="21"/>
               </w:rPr>
             </m:ctrlPr>
           </m:naryPr>
@@ -316,6 +571,8 @@
             <m:r>
               <w:rPr>
                 <w:rFonts w:ascii="Cambria Math" w:hAnsi="Cambria Math"/>
+                <w:sz w:val="21"/>
+                <w:szCs w:val="21"/>
               </w:rPr>
               <m:t>i=1</m:t>
             </m:r>
@@ -324,6 +581,8 @@
             <m:r>
               <w:rPr>
                 <w:rFonts w:ascii="Cambria Math" w:hAnsi="Cambria Math"/>
+                <w:sz w:val="21"/>
+                <w:szCs w:val="21"/>
               </w:rPr>
               <m:t>n</m:t>
             </m:r>
@@ -336,6 +595,8 @@
                     <w:rFonts w:ascii="Cambria Math" w:hAnsi="Cambria Math"/>
                     <w:i/>
                     <w:iCs/>
+                    <w:sz w:val="21"/>
+                    <w:szCs w:val="21"/>
                   </w:rPr>
                 </m:ctrlPr>
               </m:sSubPr>
@@ -343,6 +604,8 @@
                 <m:r>
                   <w:rPr>
                     <w:rFonts w:ascii="Cambria Math" w:hAnsi="Cambria Math"/>
+                    <w:sz w:val="21"/>
+                    <w:szCs w:val="21"/>
                   </w:rPr>
                   <m:t>M</m:t>
                 </m:r>
@@ -351,6 +614,8 @@
                 <m:r>
                   <w:rPr>
                     <w:rFonts w:ascii="Cambria Math" w:hAnsi="Cambria Math"/>
+                    <w:sz w:val="21"/>
+                    <w:szCs w:val="21"/>
                   </w:rPr>
                   <m:t>c</m:t>
                 </m:r>
@@ -359,6 +624,8 @@
             <m:r>
               <w:rPr>
                 <w:rFonts w:ascii="Cambria Math" w:hAnsi="Cambria Math"/>
+                <w:sz w:val="21"/>
+                <w:szCs w:val="21"/>
               </w:rPr>
               <m:t>(x+ N</m:t>
             </m:r>
@@ -369,6 +636,8 @@
                     <w:rFonts w:ascii="Cambria Math" w:hAnsi="Cambria Math"/>
                     <w:i/>
                     <w:iCs/>
+                    <w:sz w:val="21"/>
+                    <w:szCs w:val="21"/>
                   </w:rPr>
                 </m:ctrlPr>
               </m:dPr>
@@ -376,6 +645,8 @@
                 <m:r>
                   <w:rPr>
                     <w:rFonts w:ascii="Cambria Math" w:hAnsi="Cambria Math"/>
+                    <w:sz w:val="21"/>
+                    <w:szCs w:val="21"/>
                   </w:rPr>
                   <m:t xml:space="preserve">0, </m:t>
                 </m:r>
@@ -386,6 +657,8 @@
                         <w:rFonts w:ascii="Cambria Math" w:hAnsi="Cambria Math"/>
                         <w:i/>
                         <w:iCs/>
+                        <w:sz w:val="21"/>
+                        <w:szCs w:val="21"/>
                       </w:rPr>
                     </m:ctrlPr>
                   </m:sSupPr>
@@ -393,6 +666,8 @@
                     <m:r>
                       <w:rPr>
                         <w:rFonts w:ascii="Cambria Math" w:hAnsi="Cambria Math"/>
+                        <w:sz w:val="21"/>
+                        <w:szCs w:val="21"/>
                       </w:rPr>
                       <m:t>σ</m:t>
                     </m:r>
@@ -401,6 +676,8 @@
                     <m:r>
                       <w:rPr>
                         <w:rFonts w:ascii="Cambria Math" w:hAnsi="Cambria Math"/>
+                        <w:sz w:val="21"/>
+                        <w:szCs w:val="21"/>
                       </w:rPr>
                       <m:t>2</m:t>
                     </m:r>
@@ -411,6 +688,8 @@
             <m:r>
               <w:rPr>
                 <w:rFonts w:ascii="Cambria Math" w:hAnsi="Cambria Math"/>
+                <w:sz w:val="21"/>
+                <w:szCs w:val="21"/>
               </w:rPr>
               <m:t>)</m:t>
             </m:r>
@@ -421,8 +700,19 @@
         <w:rPr>
           <w:i/>
           <w:iCs/>
-        </w:rPr>
-        <w:t>, which smooths out sharp fluctuations in the gradient</w:t>
+          <w:sz w:val="21"/>
+          <w:szCs w:val="21"/>
+        </w:rPr>
+        <w:t xml:space="preserve"> to </w:t>
+      </w:r>
+      <w:r>
+        <w:rPr>
+          <w:i/>
+          <w:iCs/>
+          <w:sz w:val="21"/>
+          <w:szCs w:val="21"/>
+        </w:rPr>
+        <w:t>smooth out sharp fluctuations</w:t>
       </w:r>
     </w:p>
     <w:p>
@@ -433,18 +723,52 @@
           <w:numId w:val="2"/>
         </w:numPr>
         <w:jc w:val="both"/>
-      </w:pPr>
-      <w:r>
+        <w:rPr>
+          <w:sz w:val="21"/>
+          <w:szCs w:val="21"/>
+        </w:rPr>
+      </w:pPr>
+      <w:r>
+        <w:rPr>
+          <w:sz w:val="21"/>
+          <w:szCs w:val="21"/>
+        </w:rPr>
         <w:t xml:space="preserve">Applying a </w:t>
       </w:r>
       <w:r>
+        <w:rPr>
+          <w:sz w:val="21"/>
+          <w:szCs w:val="21"/>
+        </w:rPr>
         <w:t>Gaussian blur to the saliency map after calculating</w:t>
       </w:r>
       <w:r>
+        <w:rPr>
+          <w:sz w:val="21"/>
+          <w:szCs w:val="21"/>
+        </w:rPr>
         <w:t xml:space="preserve"> the raw gradient</w:t>
       </w:r>
       <w:r>
-        <w:t xml:space="preserve"> – This is a common misconception due to visual similarity</w:t>
+        <w:rPr>
+          <w:sz w:val="21"/>
+          <w:szCs w:val="21"/>
+        </w:rPr>
+        <w:t xml:space="preserve"> – This is a common </w:t>
+      </w:r>
+      <w:r>
+        <w:rPr>
+          <w:sz w:val="21"/>
+          <w:szCs w:val="21"/>
+        </w:rPr>
+        <w:t xml:space="preserve">visual </w:t>
+      </w:r>
+      <w:r>
+        <w:rPr>
+          <w:sz w:val="21"/>
+          <w:szCs w:val="21"/>
+        </w:rPr>
+        <w:t>misconception</w:t>
       </w:r>
     </w:p>
     <w:p>
@@ -455,12 +779,31 @@
           <w:numId w:val="2"/>
         </w:numPr>
         <w:jc w:val="both"/>
-      </w:pPr>
-      <w:r>
+        <w:rPr>
+          <w:sz w:val="21"/>
+          <w:szCs w:val="21"/>
+        </w:rPr>
+      </w:pPr>
+      <w:r>
+        <w:rPr>
+          <w:sz w:val="21"/>
+          <w:szCs w:val="21"/>
+        </w:rPr>
         <w:t>Multiplying the gradient by the input image pixels</w:t>
       </w:r>
       <w:r>
-        <w:t xml:space="preserve"> – This refers to a different attribution method</w:t>
+        <w:rPr>
+          <w:sz w:val="21"/>
+          <w:szCs w:val="21"/>
+        </w:rPr>
+        <w:t xml:space="preserve"> – </w:t>
+      </w:r>
+      <w:r>
+        <w:rPr>
+          <w:sz w:val="21"/>
+          <w:szCs w:val="21"/>
+        </w:rPr>
+        <w:t>Describes the “Input x Gradient” method</w:t>
       </w:r>
     </w:p>
     <w:p>
@@ -471,38 +814,72 @@
           <w:numId w:val="2"/>
         </w:numPr>
         <w:jc w:val="both"/>
-      </w:pPr>
-      <w:r>
+        <w:rPr>
+          <w:sz w:val="21"/>
+          <w:szCs w:val="21"/>
+        </w:rPr>
+      </w:pPr>
+      <w:r>
+        <w:rPr>
+          <w:sz w:val="21"/>
+          <w:szCs w:val="21"/>
+        </w:rPr>
         <w:t>Discarding all negative gradient values during back propagation</w:t>
       </w:r>
       <w:r>
-        <w:t xml:space="preserve"> – This sounds like </w:t>
-      </w:r>
-      <w:proofErr w:type="gramStart"/>
-      <w:r>
-        <w:t>denoising</w:t>
-      </w:r>
-      <w:proofErr w:type="gramEnd"/>
-      <w:r>
-        <w:t xml:space="preserve"> but the meaning is different.</w:t>
-      </w:r>
-    </w:p>
-    <w:p>
-      <w:pPr>
-        <w:jc w:val="both"/>
+        <w:rPr>
+          <w:sz w:val="21"/>
+          <w:szCs w:val="21"/>
+        </w:rPr>
+        <w:t xml:space="preserve"> – </w:t>
+      </w:r>
+      <w:r>
+        <w:rPr>
+          <w:sz w:val="21"/>
+          <w:szCs w:val="21"/>
+        </w:rPr>
+        <w:t>Used in Guided Backprop</w:t>
+      </w:r>
+      <w:r>
+        <w:rPr>
+          <w:sz w:val="21"/>
+          <w:szCs w:val="21"/>
+        </w:rPr>
+        <w:t xml:space="preserve">, not </w:t>
+      </w:r>
+      <w:proofErr w:type="spellStart"/>
+      <w:r>
+        <w:rPr>
+          <w:sz w:val="21"/>
+          <w:szCs w:val="21"/>
+        </w:rPr>
+        <w:t>SmoothGrad</w:t>
+      </w:r>
+      <w:proofErr w:type="spellEnd"/>
+    </w:p>
+    <w:p>
+      <w:pPr>
+        <w:jc w:val="both"/>
+        <w:rPr>
+          <w:sz w:val="21"/>
+          <w:szCs w:val="21"/>
+        </w:rPr>
       </w:pPr>
       <w:r>
         <w:rPr>
           <w:b/>
           <w:bCs/>
+          <w:sz w:val="21"/>
+          <w:szCs w:val="21"/>
         </w:rPr>
         <w:t>Pitfall:</w:t>
       </w:r>
       <w:r>
-        <w:t xml:space="preserve"> </w:t>
-      </w:r>
-      <w:r>
-        <w:t>Assuming smoothing = filtering instead of statistical averaging.</w:t>
+        <w:rPr>
+          <w:sz w:val="21"/>
+          <w:szCs w:val="21"/>
+        </w:rPr>
+        <w:t xml:space="preserve"> Assuming smoothing = filtering instead of statistical averaging.</w:t>
       </w:r>
     </w:p>
     <w:p>
@@ -510,6 +887,8 @@
         <w:jc w:val="both"/>
         <w:rPr>
           <w:rFonts w:eastAsiaTheme="minorEastAsia"/>
+          <w:sz w:val="21"/>
+          <w:szCs w:val="21"/>
         </w:rPr>
       </w:pPr>
       <w:r>
@@ -517,14 +896,66 @@
           <w:rFonts w:eastAsiaTheme="minorEastAsia"/>
           <w:b/>
           <w:bCs/>
+          <w:sz w:val="21"/>
+          <w:szCs w:val="21"/>
         </w:rPr>
         <w:t>Question 3:</w:t>
       </w:r>
       <w:r>
         <w:rPr>
           <w:rFonts w:eastAsiaTheme="minorEastAsia"/>
-        </w:rPr>
-        <w:t xml:space="preserve"> According to a survey on interpretable machine learning, what is the main difference between 'intrinsic interpretability' and 'post-hoc interpretability'?</w:t>
+          <w:sz w:val="21"/>
+          <w:szCs w:val="21"/>
+        </w:rPr>
+        <w:t xml:space="preserve"> </w:t>
+      </w:r>
+      <w:r>
+        <w:rPr>
+          <w:rFonts w:eastAsiaTheme="minorEastAsia"/>
+          <w:sz w:val="21"/>
+          <w:szCs w:val="21"/>
+        </w:rPr>
+        <w:t>W</w:t>
+      </w:r>
+      <w:r>
+        <w:rPr>
+          <w:rFonts w:eastAsiaTheme="minorEastAsia"/>
+          <w:sz w:val="21"/>
+          <w:szCs w:val="21"/>
+        </w:rPr>
+        <w:t xml:space="preserve">hat </w:t>
+      </w:r>
+      <w:r>
+        <w:rPr>
+          <w:rFonts w:eastAsiaTheme="minorEastAsia"/>
+          <w:sz w:val="21"/>
+          <w:szCs w:val="21"/>
+        </w:rPr>
+        <w:t xml:space="preserve">separates </w:t>
+      </w:r>
+      <w:r>
+        <w:rPr>
+          <w:rFonts w:eastAsiaTheme="minorEastAsia"/>
+          <w:sz w:val="21"/>
+          <w:szCs w:val="21"/>
+        </w:rPr>
+        <w:t xml:space="preserve">'intrinsic interpretability' </w:t>
+      </w:r>
+      <w:r>
+        <w:rPr>
+          <w:rFonts w:eastAsiaTheme="minorEastAsia"/>
+          <w:sz w:val="21"/>
+          <w:szCs w:val="21"/>
+        </w:rPr>
+        <w:t>from</w:t>
+      </w:r>
+      <w:r>
+        <w:rPr>
+          <w:rFonts w:eastAsiaTheme="minorEastAsia"/>
+          <w:sz w:val="21"/>
+          <w:szCs w:val="21"/>
+        </w:rPr>
+        <w:t xml:space="preserve"> 'post-hoc interpretability'?</w:t>
       </w:r>
     </w:p>
     <w:p>
@@ -539,6 +970,8 @@
           <w:rFonts w:eastAsiaTheme="minorEastAsia"/>
           <w:i/>
           <w:iCs/>
+          <w:sz w:val="21"/>
+          <w:szCs w:val="21"/>
         </w:rPr>
       </w:pPr>
       <w:r>
@@ -546,16 +979,150 @@
           <w:rFonts w:eastAsiaTheme="minorEastAsia"/>
           <w:i/>
           <w:iCs/>
-        </w:rPr>
-        <w:t>Intrinsic interpretability is built into the structure of the model, while post-hoc requires a second model or method for explanation (Correct Answer)</w:t>
+          <w:sz w:val="21"/>
+          <w:szCs w:val="21"/>
+        </w:rPr>
+        <w:t>Built-in vs. External Analysis</w:t>
       </w:r>
       <w:r>
         <w:rPr>
           <w:rFonts w:eastAsiaTheme="minorEastAsia"/>
           <w:i/>
           <w:iCs/>
-        </w:rPr>
-        <w:t xml:space="preserve"> - Intrinsic Models are self-explanatory by design (e.g., decision trees) whereas post-hoc methods analyse pre-trained black-box models.</w:t>
+          <w:sz w:val="21"/>
+          <w:szCs w:val="21"/>
+        </w:rPr>
+        <w:t xml:space="preserve"> (</w:t>
+      </w:r>
+      <w:r>
+        <w:rPr>
+          <w:rFonts w:eastAsiaTheme="minorEastAsia"/>
+          <w:i/>
+          <w:iCs/>
+          <w:sz w:val="21"/>
+          <w:szCs w:val="21"/>
+        </w:rPr>
+        <w:t>Key</w:t>
+      </w:r>
+      <w:r>
+        <w:rPr>
+          <w:rFonts w:eastAsiaTheme="minorEastAsia"/>
+          <w:i/>
+          <w:iCs/>
+          <w:sz w:val="21"/>
+          <w:szCs w:val="21"/>
+        </w:rPr>
+        <w:t>)</w:t>
+      </w:r>
+      <w:r>
+        <w:rPr>
+          <w:rFonts w:eastAsiaTheme="minorEastAsia"/>
+          <w:i/>
+          <w:iCs/>
+          <w:sz w:val="21"/>
+          <w:szCs w:val="21"/>
+        </w:rPr>
+        <w:t xml:space="preserve"> </w:t>
+      </w:r>
+      <w:r>
+        <w:rPr>
+          <w:rFonts w:eastAsiaTheme="minorEastAsia"/>
+          <w:i/>
+          <w:iCs/>
+          <w:sz w:val="21"/>
+          <w:szCs w:val="21"/>
+        </w:rPr>
+        <w:t>–</w:t>
+      </w:r>
+      <w:r>
+        <w:rPr>
+          <w:rFonts w:eastAsiaTheme="minorEastAsia"/>
+          <w:i/>
+          <w:iCs/>
+          <w:sz w:val="21"/>
+          <w:szCs w:val="21"/>
+        </w:rPr>
+        <w:t xml:space="preserve"> </w:t>
+      </w:r>
+      <w:r>
+        <w:rPr>
+          <w:rFonts w:eastAsiaTheme="minorEastAsia"/>
+          <w:i/>
+          <w:iCs/>
+          <w:sz w:val="21"/>
+          <w:szCs w:val="21"/>
+        </w:rPr>
+        <w:t>Intrinsic m</w:t>
+      </w:r>
+      <w:r>
+        <w:rPr>
+          <w:rFonts w:eastAsiaTheme="minorEastAsia"/>
+          <w:i/>
+          <w:iCs/>
+          <w:sz w:val="21"/>
+          <w:szCs w:val="21"/>
+        </w:rPr>
+        <w:t xml:space="preserve">odels </w:t>
+      </w:r>
+      <w:r>
+        <w:rPr>
+          <w:rFonts w:eastAsiaTheme="minorEastAsia"/>
+          <w:i/>
+          <w:iCs/>
+          <w:sz w:val="21"/>
+          <w:szCs w:val="21"/>
+        </w:rPr>
+        <w:t xml:space="preserve">are simple to understand just by looking at them </w:t>
+      </w:r>
+      <w:r>
+        <w:rPr>
+          <w:rFonts w:eastAsiaTheme="minorEastAsia"/>
+          <w:i/>
+          <w:iCs/>
+          <w:sz w:val="21"/>
+          <w:szCs w:val="21"/>
+        </w:rPr>
+        <w:t xml:space="preserve">(e.g., decision trees) </w:t>
+      </w:r>
+      <w:r>
+        <w:rPr>
+          <w:rFonts w:eastAsiaTheme="minorEastAsia"/>
+          <w:i/>
+          <w:iCs/>
+          <w:sz w:val="21"/>
+          <w:szCs w:val="21"/>
+        </w:rPr>
+        <w:t>whilst</w:t>
+      </w:r>
+      <w:r>
+        <w:rPr>
+          <w:rFonts w:eastAsiaTheme="minorEastAsia"/>
+          <w:i/>
+          <w:iCs/>
+          <w:sz w:val="21"/>
+          <w:szCs w:val="21"/>
+        </w:rPr>
+        <w:t xml:space="preserve"> post-hoc methods </w:t>
+      </w:r>
+      <w:r>
+        <w:rPr>
+          <w:rFonts w:eastAsiaTheme="minorEastAsia"/>
+          <w:i/>
+          <w:iCs/>
+          <w:sz w:val="21"/>
+          <w:szCs w:val="21"/>
+        </w:rPr>
+        <w:t>are used to "interrogate" complex, pre-trained models that aren't naturally easy to read</w:t>
+      </w:r>
+      <w:r>
+        <w:rPr>
+          <w:rFonts w:eastAsiaTheme="minorEastAsia"/>
+          <w:i/>
+          <w:iCs/>
+          <w:sz w:val="21"/>
+          <w:szCs w:val="21"/>
+        </w:rPr>
+        <w:t>.</w:t>
       </w:r>
     </w:p>
     <w:p>
@@ -568,25 +1135,41 @@
         <w:jc w:val="both"/>
         <w:rPr>
           <w:rFonts w:eastAsiaTheme="minorEastAsia"/>
+          <w:sz w:val="21"/>
+          <w:szCs w:val="21"/>
         </w:rPr>
       </w:pPr>
       <w:r>
         <w:rPr>
           <w:rFonts w:eastAsiaTheme="minorEastAsia"/>
-        </w:rPr>
-        <w:t>Intrinsic interpretability only works for linear models, whereas post-hoc only works for deep neural networks</w:t>
+          <w:sz w:val="21"/>
+          <w:szCs w:val="21"/>
+        </w:rPr>
+        <w:t>Intrinsic interpretability works for linear models</w:t>
       </w:r>
       <w:r>
         <w:rPr>
           <w:rFonts w:eastAsiaTheme="minorEastAsia"/>
-        </w:rPr>
-        <w:t xml:space="preserve"> - </w:t>
+          <w:sz w:val="21"/>
+          <w:szCs w:val="21"/>
+        </w:rPr>
+        <w:t xml:space="preserve"> whilst </w:t>
       </w:r>
       <w:r>
         <w:rPr>
           <w:rFonts w:eastAsiaTheme="minorEastAsia"/>
-        </w:rPr>
-        <w:t>Both techniques can be applied to various model types but post-hoc is more common for complex models like DNNs</w:t>
+          <w:sz w:val="21"/>
+          <w:szCs w:val="21"/>
+        </w:rPr>
+        <w:t>post-hoc works for deep neural networks</w:t>
+      </w:r>
+      <w:r>
+        <w:rPr>
+          <w:rFonts w:eastAsiaTheme="minorEastAsia"/>
+          <w:sz w:val="21"/>
+          <w:szCs w:val="21"/>
+        </w:rPr>
+        <w:t xml:space="preserve"> - Both techniques can be applied to various model types but post-hoc is more common for complex models like DNNs</w:t>
       </w:r>
     </w:p>
     <w:p>
@@ -597,19 +1180,24 @@
           <w:numId w:val="3"/>
         </w:numPr>
         <w:jc w:val="both"/>
-      </w:pPr>
-      <w:r>
+        <w:rPr>
+          <w:sz w:val="21"/>
+          <w:szCs w:val="21"/>
+        </w:rPr>
+      </w:pPr>
+      <w:r>
+        <w:rPr>
+          <w:sz w:val="21"/>
+          <w:szCs w:val="21"/>
+        </w:rPr>
         <w:t>Post-hoc interpretability ensures higher prediction accuracy than intrinsic interpretability in all cases</w:t>
       </w:r>
       <w:r>
-        <w:t xml:space="preserve"> - </w:t>
-      </w:r>
-      <w:r>
-        <w:t xml:space="preserve">There is often a trade-off between intrinsic interpretability and post-hoc interpretability but post-hoc methods aim to keep </w:t>
-      </w:r>
-      <w:r>
-        <w:lastRenderedPageBreak/>
-        <w:t>the original model’s accuracy intact without necessarily being higher in absolute terms.</w:t>
+        <w:rPr>
+          <w:sz w:val="21"/>
+          <w:szCs w:val="21"/>
+        </w:rPr>
+        <w:t xml:space="preserve"> - There is often a trade-off between intrinsic interpretability and post-hoc interpretability but post-hoc methods aim to keep the original model’s accuracy intact without necessarily being higher in absolute terms.</w:t>
       </w:r>
     </w:p>
     <w:p>
@@ -620,44 +1208,73 @@
           <w:numId w:val="3"/>
         </w:numPr>
         <w:jc w:val="both"/>
-      </w:pPr>
-      <w:r>
+        <w:rPr>
+          <w:sz w:val="21"/>
+          <w:szCs w:val="21"/>
+        </w:rPr>
+      </w:pPr>
+      <w:r>
+        <w:rPr>
+          <w:sz w:val="21"/>
+          <w:szCs w:val="21"/>
+        </w:rPr>
         <w:t>Intrinsic interpretability provides global explanations, while post-hoc only provides local explanations</w:t>
       </w:r>
       <w:r>
-        <w:t xml:space="preserve"> - </w:t>
-      </w:r>
-      <w:r>
-        <w:t>Both categories can offer both global and local levels of interpretability depending on the specific technique used.</w:t>
-      </w:r>
-    </w:p>
-    <w:p>
-      <w:pPr>
-        <w:jc w:val="both"/>
+        <w:rPr>
+          <w:sz w:val="21"/>
+          <w:szCs w:val="21"/>
+        </w:rPr>
+        <w:t xml:space="preserve"> - Both categories can offer both global and local levels of interpretability depending on the specific technique used.</w:t>
+      </w:r>
+    </w:p>
+    <w:p>
+      <w:pPr>
+        <w:jc w:val="both"/>
+        <w:rPr>
+          <w:sz w:val="21"/>
+          <w:szCs w:val="21"/>
+        </w:rPr>
       </w:pPr>
       <w:r>
         <w:rPr>
           <w:b/>
           <w:bCs/>
+          <w:sz w:val="21"/>
+          <w:szCs w:val="21"/>
         </w:rPr>
         <w:t>Pitfall:</w:t>
       </w:r>
       <w:r>
+        <w:rPr>
+          <w:sz w:val="21"/>
+          <w:szCs w:val="21"/>
+        </w:rPr>
         <w:t xml:space="preserve"> Mixing model type with interpretability type</w:t>
       </w:r>
     </w:p>
     <w:p>
       <w:pPr>
         <w:jc w:val="both"/>
+        <w:rPr>
+          <w:sz w:val="21"/>
+          <w:szCs w:val="21"/>
+        </w:rPr>
       </w:pPr>
       <w:r>
         <w:rPr>
           <w:b/>
           <w:bCs/>
+          <w:sz w:val="21"/>
+          <w:szCs w:val="21"/>
         </w:rPr>
         <w:t>Question 4:</w:t>
       </w:r>
       <w:r>
+        <w:rPr>
+          <w:sz w:val="21"/>
+          <w:szCs w:val="21"/>
+        </w:rPr>
         <w:t xml:space="preserve"> What was the surprising finding regarding some popular attribution methods?</w:t>
       </w:r>
     </w:p>
@@ -669,11 +1286,23 @@
           <w:numId w:val="5"/>
         </w:numPr>
         <w:jc w:val="both"/>
-      </w:pPr>
-      <w:r>
-        <w:t>They always outperformed human experts in identifying relevant features for classification</w:t>
-      </w:r>
-      <w:r>
+        <w:rPr>
+          <w:sz w:val="21"/>
+          <w:szCs w:val="21"/>
+        </w:rPr>
+      </w:pPr>
+      <w:r>
+        <w:rPr>
+          <w:sz w:val="21"/>
+          <w:szCs w:val="21"/>
+        </w:rPr>
+        <w:t>Human vs AI Performance</w:t>
+      </w:r>
+      <w:r>
+        <w:rPr>
+          <w:sz w:val="21"/>
+          <w:szCs w:val="21"/>
+        </w:rPr>
         <w:t xml:space="preserve"> – This was not tested in the study</w:t>
       </w:r>
     </w:p>
@@ -685,11 +1314,23 @@
           <w:numId w:val="5"/>
         </w:numPr>
         <w:jc w:val="both"/>
-      </w:pPr>
-      <w:r>
-        <w:t>They only worked for Recurrent Neural Networks but failed for Convolutional Neural Networks</w:t>
-      </w:r>
-      <w:r>
+        <w:rPr>
+          <w:sz w:val="21"/>
+          <w:szCs w:val="21"/>
+        </w:rPr>
+      </w:pPr>
+      <w:r>
+        <w:rPr>
+          <w:sz w:val="21"/>
+          <w:szCs w:val="21"/>
+        </w:rPr>
+        <w:t>RNN vs CNN failure</w:t>
+      </w:r>
+      <w:r>
+        <w:rPr>
+          <w:sz w:val="21"/>
+          <w:szCs w:val="21"/>
+        </w:rPr>
         <w:t xml:space="preserve"> – This generalization is incorrect</w:t>
       </w:r>
     </w:p>
@@ -704,21 +1345,90 @@
         <w:rPr>
           <w:i/>
           <w:iCs/>
-        </w:rPr>
-      </w:pPr>
-      <w:r>
-        <w:rPr>
-          <w:i/>
-          <w:iCs/>
-        </w:rPr>
-        <w:t>They produced maps that were independent of both the model parameters and the data-generating process (Correct Answer)</w:t>
-      </w:r>
-      <w:r>
-        <w:rPr>
-          <w:i/>
-          <w:iCs/>
-        </w:rPr>
-        <w:t xml:space="preserve"> - Through the experiments that were conducted in the 'Sanity Checks for Saliency Maps' study, it was deduced that some methods failed to change when model weights were randomised, behaving more like model-independent edge detectors.</w:t>
+          <w:sz w:val="21"/>
+          <w:szCs w:val="21"/>
+        </w:rPr>
+      </w:pPr>
+      <w:r>
+        <w:rPr>
+          <w:i/>
+          <w:iCs/>
+          <w:sz w:val="21"/>
+          <w:szCs w:val="21"/>
+        </w:rPr>
+        <w:t>Parameter Independence</w:t>
+      </w:r>
+      <w:r>
+        <w:rPr>
+          <w:i/>
+          <w:iCs/>
+          <w:sz w:val="21"/>
+          <w:szCs w:val="21"/>
+        </w:rPr>
+        <w:t xml:space="preserve"> (</w:t>
+      </w:r>
+      <w:r>
+        <w:rPr>
+          <w:i/>
+          <w:iCs/>
+          <w:sz w:val="21"/>
+          <w:szCs w:val="21"/>
+        </w:rPr>
+        <w:t>Key</w:t>
+      </w:r>
+      <w:r>
+        <w:rPr>
+          <w:i/>
+          <w:iCs/>
+          <w:sz w:val="21"/>
+          <w:szCs w:val="21"/>
+        </w:rPr>
+        <w:t>)</w:t>
+      </w:r>
+      <w:r>
+        <w:rPr>
+          <w:i/>
+          <w:iCs/>
+          <w:sz w:val="21"/>
+          <w:szCs w:val="21"/>
+        </w:rPr>
+        <w:t xml:space="preserve"> - </w:t>
+      </w:r>
+      <w:r>
+        <w:rPr>
+          <w:i/>
+          <w:iCs/>
+          <w:sz w:val="21"/>
+          <w:szCs w:val="21"/>
+        </w:rPr>
+        <w:t>S</w:t>
+      </w:r>
+      <w:r>
+        <w:rPr>
+          <w:i/>
+          <w:iCs/>
+          <w:sz w:val="21"/>
+          <w:szCs w:val="21"/>
+        </w:rPr>
+        <w:t xml:space="preserve">ome methods </w:t>
+      </w:r>
+      <w:r>
+        <w:rPr>
+          <w:i/>
+          <w:iCs/>
+          <w:sz w:val="21"/>
+          <w:szCs w:val="21"/>
+        </w:rPr>
+        <w:t>produced maps that didn’t change even when model weights were randomized</w:t>
+      </w:r>
+      <w:r>
+        <w:rPr>
+          <w:i/>
+          <w:iCs/>
+          <w:sz w:val="21"/>
+          <w:szCs w:val="21"/>
+        </w:rPr>
+        <w:t>.</w:t>
       </w:r>
     </w:p>
     <w:p>
@@ -729,53 +1439,127 @@
           <w:numId w:val="5"/>
         </w:numPr>
         <w:jc w:val="both"/>
-      </w:pPr>
-      <w:r>
-        <w:t>They were only effective when the input images were perfectly centred and normalised</w:t>
-      </w:r>
-      <w:r>
+        <w:rPr>
+          <w:sz w:val="21"/>
+          <w:szCs w:val="21"/>
+        </w:rPr>
+      </w:pPr>
+      <w:r>
+        <w:rPr>
+          <w:sz w:val="21"/>
+          <w:szCs w:val="21"/>
+        </w:rPr>
+        <w:t>Normalization</w:t>
+      </w:r>
+      <w:r>
+        <w:rPr>
+          <w:sz w:val="21"/>
+          <w:szCs w:val="21"/>
+        </w:rPr>
         <w:t xml:space="preserve"> – This was irrelevant to what the study was mainly trying to find</w:t>
       </w:r>
     </w:p>
     <w:p>
       <w:pPr>
         <w:jc w:val="both"/>
+        <w:rPr>
+          <w:sz w:val="21"/>
+          <w:szCs w:val="21"/>
+        </w:rPr>
       </w:pPr>
       <w:r>
         <w:rPr>
           <w:b/>
           <w:bCs/>
+          <w:sz w:val="21"/>
+          <w:szCs w:val="21"/>
         </w:rPr>
         <w:t>Pitfall:</w:t>
       </w:r>
       <w:r>
-        <w:t xml:space="preserve"> </w:t>
-      </w:r>
-      <w:r>
-        <w:t>Assuming saliency maps are always model-dependent.</w:t>
-      </w:r>
-    </w:p>
-    <w:p>
-      <w:pPr>
-        <w:jc w:val="both"/>
-      </w:pPr>
-      <w:r>
+        <w:rPr>
+          <w:sz w:val="21"/>
+          <w:szCs w:val="21"/>
+        </w:rPr>
+        <w:t xml:space="preserve"> Assuming saliency maps are always model-dependent.</w:t>
+      </w:r>
+    </w:p>
+    <w:p>
+      <w:pPr>
+        <w:jc w:val="both"/>
         <w:rPr>
           <w:b/>
           <w:bCs/>
-        </w:rPr>
+          <w:sz w:val="21"/>
+          <w:szCs w:val="21"/>
+        </w:rPr>
+      </w:pPr>
+    </w:p>
+    <w:p>
+      <w:pPr>
+        <w:jc w:val="both"/>
+        <w:rPr>
+          <w:b/>
+          <w:bCs/>
+          <w:sz w:val="21"/>
+          <w:szCs w:val="21"/>
+        </w:rPr>
+      </w:pPr>
+    </w:p>
+    <w:p>
+      <w:pPr>
+        <w:jc w:val="both"/>
+        <w:rPr>
+          <w:sz w:val="21"/>
+          <w:szCs w:val="21"/>
+        </w:rPr>
+      </w:pPr>
+      <w:r>
+        <w:rPr>
+          <w:b/>
+          <w:bCs/>
+          <w:sz w:val="21"/>
+          <w:szCs w:val="21"/>
+        </w:rPr>
+        <w:lastRenderedPageBreak/>
         <w:t>Question 5:</w:t>
       </w:r>
       <w:r>
-        <w:t xml:space="preserve"> Which hyperparameter in </w:t>
+        <w:rPr>
+          <w:sz w:val="21"/>
+          <w:szCs w:val="21"/>
+        </w:rPr>
+        <w:t xml:space="preserve"> Which </w:t>
       </w:r>
       <w:proofErr w:type="spellStart"/>
       <w:r>
+        <w:rPr>
+          <w:sz w:val="21"/>
+          <w:szCs w:val="21"/>
+        </w:rPr>
         <w:t>SmoothGrad</w:t>
       </w:r>
       <w:proofErr w:type="spellEnd"/>
       <w:r>
-        <w:t xml:space="preserve"> refers to the standard deviation of the Gaussian perturbations applied to the input?</w:t>
+        <w:rPr>
+          <w:sz w:val="21"/>
+          <w:szCs w:val="21"/>
+        </w:rPr>
+        <w:t xml:space="preserve"> </w:t>
+      </w:r>
+      <w:r>
+        <w:rPr>
+          <w:sz w:val="21"/>
+          <w:szCs w:val="21"/>
+        </w:rPr>
+        <w:t>parameter controls the noise intensity</w:t>
+      </w:r>
+      <w:r>
+        <w:rPr>
+          <w:sz w:val="21"/>
+          <w:szCs w:val="21"/>
+        </w:rPr>
+        <w:t>?</w:t>
       </w:r>
     </w:p>
     <w:p>
@@ -786,27 +1570,39 @@
           <w:numId w:val="6"/>
         </w:numPr>
         <w:jc w:val="both"/>
-      </w:pPr>
-      <w:r>
+        <w:rPr>
+          <w:sz w:val="21"/>
+          <w:szCs w:val="21"/>
+        </w:rPr>
+      </w:pPr>
+      <w:r>
+        <w:rPr>
+          <w:sz w:val="21"/>
+          <w:szCs w:val="21"/>
+        </w:rPr>
         <w:t>M</w:t>
       </w:r>
       <w:r>
         <w:rPr>
+          <w:sz w:val="21"/>
+          <w:szCs w:val="21"/>
           <w:vertAlign w:val="subscript"/>
         </w:rPr>
         <w:t>c</w:t>
       </w:r>
       <w:r>
-        <w:t xml:space="preserve"> – This refers to the </w:t>
-      </w:r>
-      <w:r>
-        <w:t xml:space="preserve">saliency map </w:t>
-      </w:r>
-      <w:r>
-        <w:t>output,</w:t>
-      </w:r>
-      <w:r>
-        <w:t xml:space="preserve"> and it is not a hyperparameter</w:t>
+        <w:rPr>
+          <w:sz w:val="21"/>
+          <w:szCs w:val="21"/>
+        </w:rPr>
+        <w:t xml:space="preserve"> – </w:t>
+      </w:r>
+      <w:r>
+        <w:rPr>
+          <w:sz w:val="21"/>
+          <w:szCs w:val="21"/>
+        </w:rPr>
+        <w:t>the resulting saliency map</w:t>
       </w:r>
     </w:p>
     <w:p>
@@ -820,21 +1616,126 @@
         <w:rPr>
           <w:i/>
           <w:iCs/>
-        </w:rPr>
-      </w:pPr>
-      <w:r>
-        <w:rPr>
-          <w:i/>
-          <w:iCs/>
-        </w:rPr>
-        <w:t>σ (Correct Answer)</w:t>
-      </w:r>
-      <w:r>
-        <w:rPr>
-          <w:i/>
-          <w:iCs/>
-        </w:rPr>
-        <w:t xml:space="preserve"> - the noise level σ determines the scale of random perturbations, with 10%-20% often cited as an ideal range for visual coherence.</w:t>
+          <w:sz w:val="21"/>
+          <w:szCs w:val="21"/>
+        </w:rPr>
+      </w:pPr>
+      <w:r>
+        <w:rPr>
+          <w:i/>
+          <w:iCs/>
+          <w:sz w:val="21"/>
+          <w:szCs w:val="21"/>
+        </w:rPr>
+        <w:t>σ (</w:t>
+      </w:r>
+      <w:r>
+        <w:rPr>
+          <w:i/>
+          <w:iCs/>
+          <w:sz w:val="21"/>
+          <w:szCs w:val="21"/>
+        </w:rPr>
+        <w:t>Key</w:t>
+      </w:r>
+      <w:r>
+        <w:rPr>
+          <w:i/>
+          <w:iCs/>
+          <w:sz w:val="21"/>
+          <w:szCs w:val="21"/>
+        </w:rPr>
+        <w:t>)</w:t>
+      </w:r>
+      <w:r>
+        <w:rPr>
+          <w:i/>
+          <w:iCs/>
+          <w:sz w:val="21"/>
+          <w:szCs w:val="21"/>
+        </w:rPr>
+        <w:t xml:space="preserve"> - the noise level σ </w:t>
+      </w:r>
+      <w:r>
+        <w:rPr>
+          <w:i/>
+          <w:iCs/>
+          <w:sz w:val="21"/>
+          <w:szCs w:val="21"/>
+        </w:rPr>
+        <w:t xml:space="preserve">sets </w:t>
+      </w:r>
+      <w:r>
+        <w:rPr>
+          <w:i/>
+          <w:iCs/>
+          <w:sz w:val="21"/>
+          <w:szCs w:val="21"/>
+        </w:rPr>
+        <w:t xml:space="preserve">the </w:t>
+      </w:r>
+      <w:r>
+        <w:rPr>
+          <w:i/>
+          <w:iCs/>
+          <w:sz w:val="21"/>
+          <w:szCs w:val="21"/>
+        </w:rPr>
+        <w:t>perturbatio</w:t>
+      </w:r>
+      <w:r>
+        <w:rPr>
+          <w:i/>
+          <w:iCs/>
+          <w:sz w:val="21"/>
+          <w:szCs w:val="21"/>
+        </w:rPr>
+        <w:t xml:space="preserve">n </w:t>
+      </w:r>
+      <w:r>
+        <w:rPr>
+          <w:i/>
+          <w:iCs/>
+          <w:sz w:val="21"/>
+          <w:szCs w:val="21"/>
+        </w:rPr>
+        <w:t xml:space="preserve">scale, with 10%-20% </w:t>
+      </w:r>
+      <w:r>
+        <w:rPr>
+          <w:i/>
+          <w:iCs/>
+          <w:sz w:val="21"/>
+          <w:szCs w:val="21"/>
+        </w:rPr>
+        <w:t xml:space="preserve">defined </w:t>
+      </w:r>
+      <w:r>
+        <w:rPr>
+          <w:i/>
+          <w:iCs/>
+          <w:sz w:val="21"/>
+          <w:szCs w:val="21"/>
+        </w:rPr>
+        <w:t xml:space="preserve">as </w:t>
+      </w:r>
+      <w:r>
+        <w:rPr>
+          <w:i/>
+          <w:iCs/>
+          <w:sz w:val="21"/>
+          <w:szCs w:val="21"/>
+        </w:rPr>
+        <w:t>the</w:t>
+      </w:r>
+      <w:r>
+        <w:rPr>
+          <w:i/>
+          <w:iCs/>
+          <w:sz w:val="21"/>
+          <w:szCs w:val="21"/>
+        </w:rPr>
+        <w:t xml:space="preserve"> ideal range.</w:t>
       </w:r>
     </w:p>
     <w:p>
@@ -845,9 +1746,38 @@
           <w:numId w:val="6"/>
         </w:numPr>
         <w:jc w:val="both"/>
-      </w:pPr>
-      <w:r>
-        <w:t>n – This refers to the number of samples</w:t>
+        <w:rPr>
+          <w:sz w:val="21"/>
+          <w:szCs w:val="21"/>
+        </w:rPr>
+      </w:pPr>
+      <w:r>
+        <w:rPr>
+          <w:sz w:val="21"/>
+          <w:szCs w:val="21"/>
+        </w:rPr>
+        <w:t xml:space="preserve">n – </w:t>
+      </w:r>
+      <w:r>
+        <w:rPr>
+          <w:sz w:val="21"/>
+          <w:szCs w:val="21"/>
+        </w:rPr>
+        <w:t>t</w:t>
+      </w:r>
+      <w:r>
+        <w:rPr>
+          <w:sz w:val="21"/>
+          <w:szCs w:val="21"/>
+        </w:rPr>
+        <w:t>he number of samples</w:t>
+      </w:r>
+      <w:r>
+        <w:rPr>
+          <w:sz w:val="21"/>
+          <w:szCs w:val="21"/>
+        </w:rPr>
+        <w:t xml:space="preserve"> taken</w:t>
       </w:r>
     </w:p>
     <w:p>
@@ -858,60 +1788,117 @@
           <w:numId w:val="6"/>
         </w:numPr>
         <w:jc w:val="both"/>
-      </w:pPr>
-      <w:r>
+        <w:rPr>
+          <w:sz w:val="21"/>
+          <w:szCs w:val="21"/>
+        </w:rPr>
+      </w:pPr>
+      <w:r>
+        <w:rPr>
+          <w:sz w:val="21"/>
+          <w:szCs w:val="21"/>
+        </w:rPr>
         <w:t>σ</w:t>
       </w:r>
       <w:r>
         <w:rPr>
+          <w:sz w:val="21"/>
+          <w:szCs w:val="21"/>
           <w:vertAlign w:val="superscript"/>
         </w:rPr>
         <w:t>2</w:t>
       </w:r>
       <w:r>
-        <w:t xml:space="preserve"> – This </w:t>
-      </w:r>
-      <w:r>
-        <w:t xml:space="preserve">refers to the variance, which appears in </w:t>
-      </w:r>
-      <w:r>
-        <w:t>notation,</w:t>
-      </w:r>
-      <w:r>
-        <w:t xml:space="preserve"> but it is not directly used as the tuning parameters</w:t>
-      </w:r>
-    </w:p>
-    <w:p>
-      <w:pPr>
-        <w:jc w:val="both"/>
+        <w:rPr>
+          <w:sz w:val="21"/>
+          <w:szCs w:val="21"/>
+        </w:rPr>
+        <w:t xml:space="preserve"> – </w:t>
+      </w:r>
+      <w:r>
+        <w:rPr>
+          <w:sz w:val="21"/>
+          <w:szCs w:val="21"/>
+        </w:rPr>
+        <w:t>T</w:t>
+      </w:r>
+      <w:r>
+        <w:rPr>
+          <w:sz w:val="21"/>
+          <w:szCs w:val="21"/>
+        </w:rPr>
+        <w:t>he variance</w:t>
+      </w:r>
+      <w:r>
+        <w:rPr>
+          <w:sz w:val="21"/>
+          <w:szCs w:val="21"/>
+        </w:rPr>
+        <w:t xml:space="preserve"> which is used in the formula but not to directly tune the parameters</w:t>
+      </w:r>
+    </w:p>
+    <w:p>
+      <w:pPr>
+        <w:jc w:val="both"/>
+        <w:rPr>
+          <w:sz w:val="21"/>
+          <w:szCs w:val="21"/>
+        </w:rPr>
       </w:pPr>
       <w:r>
         <w:rPr>
           <w:b/>
           <w:bCs/>
+          <w:sz w:val="21"/>
+          <w:szCs w:val="21"/>
         </w:rPr>
         <w:t>Pitfall:</w:t>
       </w:r>
       <w:r>
-        <w:t xml:space="preserve"> </w:t>
-      </w:r>
-      <w:r>
-        <w:t>Confusing variance notation with the actual parameter used in implementation.</w:t>
-      </w:r>
-    </w:p>
-    <w:p>
-      <w:pPr>
-        <w:jc w:val="both"/>
+        <w:rPr>
+          <w:sz w:val="21"/>
+          <w:szCs w:val="21"/>
+        </w:rPr>
+        <w:t xml:space="preserve"> Confusing variance notation with the actual parameter used in implementation.</w:t>
+      </w:r>
+    </w:p>
+    <w:p>
+      <w:pPr>
+        <w:jc w:val="both"/>
+        <w:rPr>
+          <w:sz w:val="21"/>
+          <w:szCs w:val="21"/>
+        </w:rPr>
       </w:pPr>
       <w:r>
         <w:rPr>
           <w:b/>
           <w:bCs/>
+          <w:sz w:val="21"/>
+          <w:szCs w:val="21"/>
         </w:rPr>
         <w:t>Question 6:</w:t>
       </w:r>
       <w:r>
-        <w:t xml:space="preserve"> Why might a 'vanilla' gradient be an unreliable proxy for feature importance when a feature 'saturates' the class score function?</w:t>
+        <w:rPr>
+          <w:sz w:val="21"/>
+          <w:szCs w:val="21"/>
+        </w:rPr>
+        <w:t xml:space="preserve"> Why </w:t>
+      </w:r>
+      <w:r>
+        <w:rPr>
+          <w:sz w:val="21"/>
+          <w:szCs w:val="21"/>
+        </w:rPr>
+        <w:t>is</w:t>
+      </w:r>
+      <w:r>
+        <w:rPr>
+          <w:sz w:val="21"/>
+          <w:szCs w:val="21"/>
+        </w:rPr>
+        <w:t xml:space="preserve"> a 'vanilla' gradient unreliable when a feature 'saturates'?</w:t>
       </w:r>
     </w:p>
     <w:p>
@@ -925,21 +1912,108 @@
         <w:rPr>
           <w:i/>
           <w:iCs/>
-        </w:rPr>
-      </w:pPr>
-      <w:r>
-        <w:rPr>
-          <w:i/>
-          <w:iCs/>
-        </w:rPr>
-        <w:t>The local derivative becomes small even if the feature has a strong global influence. (Correct Answer)</w:t>
-      </w:r>
-      <w:r>
-        <w:rPr>
-          <w:i/>
-          <w:iCs/>
-        </w:rPr>
-        <w:t xml:space="preserve"> - When the function flattens out (saturates), the gradient approaches zero, failing to capture the importance of the feature that caused the high score.</w:t>
+          <w:sz w:val="21"/>
+          <w:szCs w:val="21"/>
+        </w:rPr>
+      </w:pPr>
+      <w:r>
+        <w:rPr>
+          <w:i/>
+          <w:iCs/>
+          <w:sz w:val="21"/>
+          <w:szCs w:val="21"/>
+        </w:rPr>
+        <w:t>Vanishing</w:t>
+      </w:r>
+      <w:r>
+        <w:rPr>
+          <w:i/>
+          <w:iCs/>
+          <w:sz w:val="21"/>
+          <w:szCs w:val="21"/>
+        </w:rPr>
+        <w:t xml:space="preserve"> local derivative</w:t>
+      </w:r>
+      <w:r>
+        <w:rPr>
+          <w:i/>
+          <w:iCs/>
+          <w:sz w:val="21"/>
+          <w:szCs w:val="21"/>
+        </w:rPr>
+        <w:t>s</w:t>
+      </w:r>
+      <w:r>
+        <w:rPr>
+          <w:i/>
+          <w:iCs/>
+          <w:sz w:val="21"/>
+          <w:szCs w:val="21"/>
+        </w:rPr>
+        <w:t xml:space="preserve"> (</w:t>
+      </w:r>
+      <w:r>
+        <w:rPr>
+          <w:i/>
+          <w:iCs/>
+          <w:sz w:val="21"/>
+          <w:szCs w:val="21"/>
+        </w:rPr>
+        <w:t>Key</w:t>
+      </w:r>
+      <w:r>
+        <w:rPr>
+          <w:i/>
+          <w:iCs/>
+          <w:sz w:val="21"/>
+          <w:szCs w:val="21"/>
+        </w:rPr>
+        <w:t>)</w:t>
+      </w:r>
+      <w:r>
+        <w:rPr>
+          <w:i/>
+          <w:iCs/>
+          <w:sz w:val="21"/>
+          <w:szCs w:val="21"/>
+        </w:rPr>
+        <w:t xml:space="preserve"> - </w:t>
+      </w:r>
+      <w:r>
+        <w:rPr>
+          <w:i/>
+          <w:iCs/>
+          <w:sz w:val="21"/>
+          <w:szCs w:val="21"/>
+        </w:rPr>
+        <w:t>If</w:t>
+      </w:r>
+      <w:r>
+        <w:rPr>
+          <w:i/>
+          <w:iCs/>
+          <w:sz w:val="21"/>
+          <w:szCs w:val="21"/>
+        </w:rPr>
+        <w:t xml:space="preserve"> the function flattens out, the gradient approaches zero</w:t>
+      </w:r>
+      <w:r>
+        <w:rPr>
+          <w:i/>
+          <w:iCs/>
+          <w:sz w:val="21"/>
+          <w:szCs w:val="21"/>
+        </w:rPr>
+        <w:t xml:space="preserve"> even if the feature is important</w:t>
+      </w:r>
+      <w:r>
+        <w:rPr>
+          <w:i/>
+          <w:iCs/>
+          <w:sz w:val="21"/>
+          <w:szCs w:val="21"/>
+        </w:rPr>
+        <w:t>.</w:t>
       </w:r>
     </w:p>
     <w:p>
@@ -950,12 +2024,52 @@
           <w:numId w:val="7"/>
         </w:numPr>
         <w:jc w:val="both"/>
-      </w:pPr>
-      <w:r>
-        <w:t>The gradient increases exponentially, leading to 'exploding' attribution values.</w:t>
-      </w:r>
-      <w:r>
-        <w:t xml:space="preserve"> – This is the opposite of the issue that is being discussed</w:t>
+        <w:rPr>
+          <w:sz w:val="21"/>
+          <w:szCs w:val="21"/>
+        </w:rPr>
+      </w:pPr>
+      <w:r>
+        <w:rPr>
+          <w:sz w:val="21"/>
+          <w:szCs w:val="21"/>
+        </w:rPr>
+        <w:t>E</w:t>
+      </w:r>
+      <w:r>
+        <w:rPr>
+          <w:sz w:val="21"/>
+          <w:szCs w:val="21"/>
+        </w:rPr>
+        <w:t>xploding attribution values.</w:t>
+      </w:r>
+      <w:r>
+        <w:rPr>
+          <w:sz w:val="21"/>
+          <w:szCs w:val="21"/>
+        </w:rPr>
+        <w:t xml:space="preserve"> – </w:t>
+      </w:r>
+      <w:r>
+        <w:rPr>
+          <w:sz w:val="21"/>
+          <w:szCs w:val="21"/>
+        </w:rPr>
+        <w:t>The</w:t>
+      </w:r>
+      <w:r>
+        <w:rPr>
+          <w:sz w:val="21"/>
+          <w:szCs w:val="21"/>
+        </w:rPr>
+        <w:t xml:space="preserve"> opposite of </w:t>
+      </w:r>
+      <w:r>
+        <w:rPr>
+          <w:sz w:val="21"/>
+          <w:szCs w:val="21"/>
+        </w:rPr>
+        <w:t>what happens during saturation</w:t>
       </w:r>
     </w:p>
     <w:p>
@@ -966,13 +2080,45 @@
           <w:numId w:val="7"/>
         </w:numPr>
         <w:jc w:val="both"/>
-      </w:pPr>
-      <w:r>
-        <w:lastRenderedPageBreak/>
-        <w:t>The gradient is unable to handle negative pixel values in saturated regions.</w:t>
-      </w:r>
-      <w:r>
-        <w:t xml:space="preserve"> – This is not true and it is poorly represented</w:t>
+        <w:rPr>
+          <w:sz w:val="21"/>
+          <w:szCs w:val="21"/>
+        </w:rPr>
+      </w:pPr>
+      <w:r>
+        <w:rPr>
+          <w:sz w:val="21"/>
+          <w:szCs w:val="21"/>
+        </w:rPr>
+        <w:t>N</w:t>
+      </w:r>
+      <w:r>
+        <w:rPr>
+          <w:sz w:val="21"/>
+          <w:szCs w:val="21"/>
+        </w:rPr>
+        <w:t xml:space="preserve">egative pixel </w:t>
+      </w:r>
+      <w:r>
+        <w:rPr>
+          <w:sz w:val="21"/>
+          <w:szCs w:val="21"/>
+        </w:rPr>
+        <w:t xml:space="preserve">handling </w:t>
+      </w:r>
+      <w:r>
+        <w:rPr>
+          <w:sz w:val="21"/>
+          <w:szCs w:val="21"/>
+        </w:rPr>
+        <w:t xml:space="preserve">– This is </w:t>
+      </w:r>
+      <w:r>
+        <w:rPr>
+          <w:sz w:val="21"/>
+          <w:szCs w:val="21"/>
+        </w:rPr>
+        <w:t>unrelated to saturation</w:t>
       </w:r>
     </w:p>
     <w:p>
@@ -983,40 +2129,86 @@
           <w:numId w:val="7"/>
         </w:numPr>
         <w:jc w:val="both"/>
-      </w:pPr>
-      <w:r>
-        <w:t>Saturated features always introduce random noise into the back-propagation calculation.</w:t>
-      </w:r>
-      <w:r>
-        <w:t xml:space="preserve"> – This randomness is not caused by saturation</w:t>
-      </w:r>
-    </w:p>
-    <w:p>
-      <w:pPr>
-        <w:jc w:val="both"/>
+        <w:rPr>
+          <w:sz w:val="21"/>
+          <w:szCs w:val="21"/>
+        </w:rPr>
+      </w:pPr>
+      <w:r>
+        <w:rPr>
+          <w:sz w:val="21"/>
+          <w:szCs w:val="21"/>
+        </w:rPr>
+        <w:t>R</w:t>
+      </w:r>
+      <w:r>
+        <w:rPr>
+          <w:sz w:val="21"/>
+          <w:szCs w:val="21"/>
+        </w:rPr>
+        <w:t>andom noise</w:t>
+      </w:r>
+      <w:r>
+        <w:rPr>
+          <w:sz w:val="21"/>
+          <w:szCs w:val="21"/>
+        </w:rPr>
+        <w:t xml:space="preserve"> </w:t>
+      </w:r>
+      <w:r>
+        <w:rPr>
+          <w:sz w:val="21"/>
+          <w:szCs w:val="21"/>
+        </w:rPr>
+        <w:t xml:space="preserve">– </w:t>
+      </w:r>
+      <w:r>
+        <w:rPr>
+          <w:sz w:val="21"/>
+          <w:szCs w:val="21"/>
+        </w:rPr>
+        <w:t>Saturation causes the gradient to approach zero, not randomness</w:t>
+      </w:r>
+    </w:p>
+    <w:p>
+      <w:pPr>
+        <w:jc w:val="both"/>
+        <w:rPr>
+          <w:sz w:val="21"/>
+          <w:szCs w:val="21"/>
+        </w:rPr>
       </w:pPr>
       <w:r>
         <w:rPr>
           <w:b/>
           <w:bCs/>
+          <w:sz w:val="21"/>
+          <w:szCs w:val="21"/>
         </w:rPr>
         <w:t>Pitfall:</w:t>
       </w:r>
       <w:r>
-        <w:t xml:space="preserve"> </w:t>
-      </w:r>
-      <w:r>
-        <w:t>Assuming gradients always reflect importance.</w:t>
-      </w:r>
-    </w:p>
-    <w:p>
-      <w:pPr>
-        <w:jc w:val="both"/>
+        <w:rPr>
+          <w:sz w:val="21"/>
+          <w:szCs w:val="21"/>
+        </w:rPr>
+        <w:t xml:space="preserve"> Assuming gradients always reflect importance.</w:t>
+      </w:r>
+    </w:p>
+    <w:p>
+      <w:pPr>
+        <w:jc w:val="both"/>
+        <w:rPr>
+          <w:sz w:val="21"/>
+          <w:szCs w:val="21"/>
+        </w:rPr>
       </w:pPr>
       <w:r>
         <w:rPr>
           <w:b/>
           <w:bCs/>
+          <w:sz w:val="21"/>
+          <w:szCs w:val="21"/>
         </w:rPr>
         <w:t xml:space="preserve">Question </w:t>
       </w:r>
@@ -1024,6 +2216,8 @@
         <w:rPr>
           <w:b/>
           <w:bCs/>
+          <w:sz w:val="21"/>
+          <w:szCs w:val="21"/>
         </w:rPr>
         <w:t>7</w:t>
       </w:r>
@@ -1031,17 +2225,45 @@
         <w:rPr>
           <w:b/>
           <w:bCs/>
+          <w:sz w:val="21"/>
+          <w:szCs w:val="21"/>
         </w:rPr>
         <w:t>:</w:t>
       </w:r>
       <w:r>
+        <w:rPr>
+          <w:sz w:val="21"/>
+          <w:szCs w:val="21"/>
+        </w:rPr>
         <w:t xml:space="preserve"> </w:t>
       </w:r>
       <w:r>
-        <w:t xml:space="preserve">What adjustments does </w:t>
-      </w:r>
-      <w:r>
-        <w:t>Guided Backpropagation apply during the backward pass?</w:t>
+        <w:rPr>
+          <w:sz w:val="21"/>
+          <w:szCs w:val="21"/>
+        </w:rPr>
+        <w:t>How does</w:t>
+      </w:r>
+      <w:r>
+        <w:rPr>
+          <w:sz w:val="21"/>
+          <w:szCs w:val="21"/>
+        </w:rPr>
+        <w:t xml:space="preserve"> Guided Backpropagation </w:t>
+      </w:r>
+      <w:r>
+        <w:rPr>
+          <w:sz w:val="21"/>
+          <w:szCs w:val="21"/>
+        </w:rPr>
+        <w:t>modify</w:t>
+      </w:r>
+      <w:r>
+        <w:rPr>
+          <w:sz w:val="21"/>
+          <w:szCs w:val="21"/>
+        </w:rPr>
+        <w:t xml:space="preserve"> the backward pass?</w:t>
       </w:r>
     </w:p>
     <w:p>
@@ -1055,20 +2277,17 @@
         <w:rPr>
           <w:i/>
           <w:iCs/>
-        </w:rPr>
-      </w:pPr>
-      <w:r>
-        <w:rPr>
-          <w:i/>
-          <w:iCs/>
-        </w:rPr>
-        <w:t xml:space="preserve">It clips the negative gradients at </w:t>
-      </w:r>
+          <w:sz w:val="21"/>
+          <w:szCs w:val="21"/>
+        </w:rPr>
+      </w:pPr>
       <w:proofErr w:type="spellStart"/>
       <w:r>
         <w:rPr>
           <w:i/>
           <w:iCs/>
+          <w:sz w:val="21"/>
+          <w:szCs w:val="21"/>
         </w:rPr>
         <w:t>ReLU</w:t>
       </w:r>
@@ -1077,13 +2296,8 @@
         <w:rPr>
           <w:i/>
           <w:iCs/>
-        </w:rPr>
-        <w:t xml:space="preserve"> layers, allowing only positive signals to pass (Correct Answer)</w:t>
-      </w:r>
-      <w:r>
-        <w:rPr>
-          <w:i/>
-          <w:iCs/>
+          <w:sz w:val="21"/>
+          <w:szCs w:val="21"/>
         </w:rPr>
         <w:t xml:space="preserve"> </w:t>
       </w:r>
@@ -1091,6 +2305,53 @@
         <w:rPr>
           <w:i/>
           <w:iCs/>
+          <w:sz w:val="21"/>
+          <w:szCs w:val="21"/>
+        </w:rPr>
+        <w:t xml:space="preserve">gradient clipping </w:t>
+      </w:r>
+      <w:r>
+        <w:rPr>
+          <w:i/>
+          <w:iCs/>
+          <w:sz w:val="21"/>
+          <w:szCs w:val="21"/>
+        </w:rPr>
+        <w:t>(</w:t>
+      </w:r>
+      <w:r>
+        <w:rPr>
+          <w:i/>
+          <w:iCs/>
+          <w:sz w:val="21"/>
+          <w:szCs w:val="21"/>
+        </w:rPr>
+        <w:t>Key</w:t>
+      </w:r>
+      <w:r>
+        <w:rPr>
+          <w:i/>
+          <w:iCs/>
+          <w:sz w:val="21"/>
+          <w:szCs w:val="21"/>
+        </w:rPr>
+        <w:t>)</w:t>
+      </w:r>
+      <w:r>
+        <w:rPr>
+          <w:i/>
+          <w:iCs/>
+          <w:sz w:val="21"/>
+          <w:szCs w:val="21"/>
+        </w:rPr>
+        <w:t xml:space="preserve"> </w:t>
+      </w:r>
+      <w:r>
+        <w:rPr>
+          <w:i/>
+          <w:iCs/>
+          <w:sz w:val="21"/>
+          <w:szCs w:val="21"/>
         </w:rPr>
         <w:t>–</w:t>
       </w:r>
@@ -1098,6 +2359,8 @@
         <w:rPr>
           <w:i/>
           <w:iCs/>
+          <w:sz w:val="21"/>
+          <w:szCs w:val="21"/>
         </w:rPr>
         <w:t xml:space="preserve"> </w:t>
       </w:r>
@@ -1105,15 +2368,19 @@
         <w:rPr>
           <w:i/>
           <w:iCs/>
-        </w:rPr>
-        <w:t xml:space="preserve">This </w:t>
-      </w:r>
-      <w:r>
-        <w:rPr>
-          <w:i/>
-          <w:iCs/>
-        </w:rPr>
-        <w:t>ensures that only features that positively contribute to the activation are propagated backwards.</w:t>
+          <w:sz w:val="21"/>
+          <w:szCs w:val="21"/>
+        </w:rPr>
+        <w:t>It blocks negative gradients to focus only on the features that help the neuron fire</w:t>
+      </w:r>
+      <w:r>
+        <w:rPr>
+          <w:i/>
+          <w:iCs/>
+          <w:sz w:val="21"/>
+          <w:szCs w:val="21"/>
+        </w:rPr>
+        <w:t>.</w:t>
       </w:r>
     </w:p>
     <w:p>
@@ -1124,18 +2391,38 @@
           <w:numId w:val="8"/>
         </w:numPr>
         <w:jc w:val="both"/>
-      </w:pPr>
-      <w:r>
-        <w:t>It averages the gradients over multiple noisy inputs to reduce variance</w:t>
-      </w:r>
-      <w:r>
+        <w:rPr>
+          <w:sz w:val="21"/>
+          <w:szCs w:val="21"/>
+        </w:rPr>
+      </w:pPr>
+      <w:r>
+        <w:rPr>
+          <w:sz w:val="21"/>
+          <w:szCs w:val="21"/>
+        </w:rPr>
+        <w:t>Average noisy inputs</w:t>
+      </w:r>
+      <w:r>
+        <w:rPr>
+          <w:sz w:val="21"/>
+          <w:szCs w:val="21"/>
+        </w:rPr>
         <w:t xml:space="preserve"> – This </w:t>
       </w:r>
       <w:r>
+        <w:rPr>
+          <w:sz w:val="21"/>
+          <w:szCs w:val="21"/>
+        </w:rPr>
         <w:t xml:space="preserve">option describes </w:t>
       </w:r>
       <w:proofErr w:type="spellStart"/>
       <w:r>
+        <w:rPr>
+          <w:sz w:val="21"/>
+          <w:szCs w:val="21"/>
+        </w:rPr>
         <w:t>SmoothGrad</w:t>
       </w:r>
       <w:proofErr w:type="spellEnd"/>
@@ -1148,9 +2435,31 @@
           <w:numId w:val="8"/>
         </w:numPr>
         <w:jc w:val="both"/>
-      </w:pPr>
-      <w:r>
-        <w:t>It multiplies gradients by the input image to improve localisation – This refers to a different attribution method</w:t>
+        <w:rPr>
+          <w:sz w:val="21"/>
+          <w:szCs w:val="21"/>
+        </w:rPr>
+      </w:pPr>
+      <w:r>
+        <w:rPr>
+          <w:sz w:val="21"/>
+          <w:szCs w:val="21"/>
+        </w:rPr>
+        <w:t>Input multiplication</w:t>
+      </w:r>
+      <w:r>
+        <w:rPr>
+          <w:sz w:val="21"/>
+          <w:szCs w:val="21"/>
+        </w:rPr>
+        <w:t xml:space="preserve"> – This refers to a different </w:t>
+      </w:r>
+      <w:r>
+        <w:rPr>
+          <w:sz w:val="21"/>
+          <w:szCs w:val="21"/>
+        </w:rPr>
+        <w:t>technique (Input x Gradient)</w:t>
       </w:r>
     </w:p>
     <w:p>
@@ -1161,51 +2470,95 @@
           <w:numId w:val="8"/>
         </w:numPr>
         <w:jc w:val="both"/>
-      </w:pPr>
-      <w:r>
-        <w:t xml:space="preserve">It removes </w:t>
+        <w:rPr>
+          <w:sz w:val="21"/>
+          <w:szCs w:val="21"/>
+        </w:rPr>
+      </w:pPr>
+      <w:r>
+        <w:rPr>
+          <w:sz w:val="21"/>
+          <w:szCs w:val="21"/>
+        </w:rPr>
+        <w:t>Removing</w:t>
+      </w:r>
+      <w:r>
+        <w:rPr>
+          <w:sz w:val="21"/>
+          <w:szCs w:val="21"/>
+        </w:rPr>
+        <w:t xml:space="preserve"> </w:t>
       </w:r>
       <w:proofErr w:type="spellStart"/>
       <w:r>
+        <w:rPr>
+          <w:sz w:val="21"/>
+          <w:szCs w:val="21"/>
+        </w:rPr>
         <w:t>ReLU</w:t>
       </w:r>
       <w:proofErr w:type="spellEnd"/>
       <w:r>
-        <w:t xml:space="preserve"> activations entirely during backpropagation – This would break the model’s structure</w:t>
-      </w:r>
-    </w:p>
-    <w:p>
-      <w:pPr>
-        <w:jc w:val="both"/>
+        <w:rPr>
+          <w:sz w:val="21"/>
+          <w:szCs w:val="21"/>
+        </w:rPr>
+        <w:t xml:space="preserve"> activations – This would break the model’s structure</w:t>
+      </w:r>
+    </w:p>
+    <w:p>
+      <w:pPr>
+        <w:jc w:val="both"/>
+        <w:rPr>
+          <w:sz w:val="21"/>
+          <w:szCs w:val="21"/>
+        </w:rPr>
       </w:pPr>
       <w:r>
         <w:rPr>
           <w:b/>
           <w:bCs/>
+          <w:sz w:val="21"/>
+          <w:szCs w:val="21"/>
         </w:rPr>
         <w:t>Pitfall:</w:t>
       </w:r>
       <w:r>
-        <w:t xml:space="preserve"> </w:t>
-      </w:r>
-      <w:r>
-        <w:t xml:space="preserve">Confusing </w:t>
-      </w:r>
-      <w:r>
+        <w:rPr>
+          <w:sz w:val="21"/>
+          <w:szCs w:val="21"/>
+        </w:rPr>
+        <w:t xml:space="preserve"> Confusing </w:t>
+      </w:r>
+      <w:r>
+        <w:rPr>
+          <w:sz w:val="21"/>
+          <w:szCs w:val="21"/>
+        </w:rPr>
         <w:t>gradient filtering with gradient averages</w:t>
       </w:r>
       <w:r>
+        <w:rPr>
+          <w:sz w:val="21"/>
+          <w:szCs w:val="21"/>
+        </w:rPr>
         <w:t>.</w:t>
       </w:r>
     </w:p>
     <w:p>
       <w:pPr>
         <w:jc w:val="both"/>
+        <w:rPr>
+          <w:sz w:val="21"/>
+          <w:szCs w:val="21"/>
+        </w:rPr>
       </w:pPr>
       <w:r>
         <w:rPr>
           <w:b/>
           <w:bCs/>
+          <w:sz w:val="21"/>
+          <w:szCs w:val="21"/>
         </w:rPr>
         <w:t xml:space="preserve">Question </w:t>
       </w:r>
@@ -1213,6 +2566,8 @@
         <w:rPr>
           <w:b/>
           <w:bCs/>
+          <w:sz w:val="21"/>
+          <w:szCs w:val="21"/>
         </w:rPr>
         <w:t>8</w:t>
       </w:r>
@@ -1220,28 +2575,65 @@
         <w:rPr>
           <w:b/>
           <w:bCs/>
+          <w:sz w:val="21"/>
+          <w:szCs w:val="21"/>
         </w:rPr>
         <w:t>:</w:t>
       </w:r>
       <w:r>
+        <w:rPr>
+          <w:sz w:val="21"/>
+          <w:szCs w:val="21"/>
+        </w:rPr>
         <w:t xml:space="preserve"> </w:t>
       </w:r>
       <w:r>
+        <w:rPr>
+          <w:sz w:val="21"/>
+          <w:szCs w:val="21"/>
+        </w:rPr>
         <w:t>Which rule</w:t>
       </w:r>
       <w:r>
-        <w:t xml:space="preserve"> states</w:t>
-      </w:r>
-      <w:r>
-        <w:t xml:space="preserve"> that a saliency method should </w:t>
-      </w:r>
-      <w:r>
-        <w:t xml:space="preserve">replicate </w:t>
-      </w:r>
-      <w:r>
-        <w:t>the sensitivity of the model when the input is transformed by a constant shift</w:t>
-      </w:r>
-      <w:r>
+        <w:rPr>
+          <w:sz w:val="21"/>
+          <w:szCs w:val="21"/>
+        </w:rPr>
+        <w:t xml:space="preserve"> </w:t>
+      </w:r>
+      <w:r>
+        <w:rPr>
+          <w:sz w:val="21"/>
+          <w:szCs w:val="21"/>
+        </w:rPr>
+        <w:t>requires saliency to stay consistent if</w:t>
+      </w:r>
+      <w:r>
+        <w:rPr>
+          <w:sz w:val="21"/>
+          <w:szCs w:val="21"/>
+        </w:rPr>
+        <w:t xml:space="preserve"> the input is </w:t>
+      </w:r>
+      <w:r>
+        <w:rPr>
+          <w:sz w:val="21"/>
+          <w:szCs w:val="21"/>
+        </w:rPr>
+        <w:t>shifted</w:t>
+      </w:r>
+      <w:r>
+        <w:rPr>
+          <w:sz w:val="21"/>
+          <w:szCs w:val="21"/>
+        </w:rPr>
+        <w:t xml:space="preserve"> by a constant</w:t>
+      </w:r>
+      <w:r>
+        <w:rPr>
+          <w:sz w:val="21"/>
+          <w:szCs w:val="21"/>
+        </w:rPr>
         <w:t>?</w:t>
       </w:r>
     </w:p>
@@ -1256,19 +2648,43 @@
         <w:rPr>
           <w:i/>
           <w:iCs/>
-        </w:rPr>
-      </w:pPr>
-      <w:r>
-        <w:rPr>
-          <w:i/>
-          <w:iCs/>
-        </w:rPr>
-        <w:t>Input Invariance (Correct Answer)</w:t>
-      </w:r>
-      <w:r>
-        <w:rPr>
-          <w:i/>
-          <w:iCs/>
+          <w:sz w:val="21"/>
+          <w:szCs w:val="21"/>
+        </w:rPr>
+      </w:pPr>
+      <w:r>
+        <w:rPr>
+          <w:i/>
+          <w:iCs/>
+          <w:sz w:val="21"/>
+          <w:szCs w:val="21"/>
+        </w:rPr>
+        <w:t>Input Invariance (</w:t>
+      </w:r>
+      <w:r>
+        <w:rPr>
+          <w:i/>
+          <w:iCs/>
+          <w:sz w:val="21"/>
+          <w:szCs w:val="21"/>
+        </w:rPr>
+        <w:t>Key</w:t>
+      </w:r>
+      <w:r>
+        <w:rPr>
+          <w:i/>
+          <w:iCs/>
+          <w:sz w:val="21"/>
+          <w:szCs w:val="21"/>
+        </w:rPr>
+        <w:t>)</w:t>
+      </w:r>
+      <w:r>
+        <w:rPr>
+          <w:i/>
+          <w:iCs/>
+          <w:sz w:val="21"/>
+          <w:szCs w:val="21"/>
         </w:rPr>
         <w:t xml:space="preserve"> </w:t>
       </w:r>
@@ -1276,6 +2692,8 @@
         <w:rPr>
           <w:i/>
           <w:iCs/>
+          <w:sz w:val="21"/>
+          <w:szCs w:val="21"/>
         </w:rPr>
         <w:t>–</w:t>
       </w:r>
@@ -1283,6 +2701,8 @@
         <w:rPr>
           <w:i/>
           <w:iCs/>
+          <w:sz w:val="21"/>
+          <w:szCs w:val="21"/>
         </w:rPr>
         <w:t xml:space="preserve"> </w:t>
       </w:r>
@@ -1290,15 +2710,55 @@
         <w:rPr>
           <w:i/>
           <w:iCs/>
-        </w:rPr>
-        <w:t xml:space="preserve">This requirement states that </w:t>
-      </w:r>
-      <w:r>
-        <w:rPr>
-          <w:i/>
-          <w:iCs/>
-        </w:rPr>
-        <w:t>if a pre-processing step does not change the model’s output, it should not fundamentally change the attribution.</w:t>
+          <w:sz w:val="21"/>
+          <w:szCs w:val="21"/>
+        </w:rPr>
+        <w:t>P</w:t>
+      </w:r>
+      <w:r>
+        <w:rPr>
+          <w:i/>
+          <w:iCs/>
+          <w:sz w:val="21"/>
+          <w:szCs w:val="21"/>
+        </w:rPr>
+        <w:t xml:space="preserve">re-processing </w:t>
+      </w:r>
+      <w:r>
+        <w:rPr>
+          <w:i/>
+          <w:iCs/>
+          <w:sz w:val="21"/>
+          <w:szCs w:val="21"/>
+        </w:rPr>
+        <w:t xml:space="preserve">that </w:t>
+      </w:r>
+      <w:r>
+        <w:rPr>
+          <w:i/>
+          <w:iCs/>
+          <w:sz w:val="21"/>
+          <w:szCs w:val="21"/>
+        </w:rPr>
+        <w:t>does not change the model’s output</w:t>
+      </w:r>
+      <w:r>
+        <w:rPr>
+          <w:i/>
+          <w:iCs/>
+          <w:sz w:val="21"/>
+          <w:szCs w:val="21"/>
+        </w:rPr>
+        <w:t xml:space="preserve"> </w:t>
+      </w:r>
+      <w:r>
+        <w:rPr>
+          <w:i/>
+          <w:iCs/>
+          <w:sz w:val="21"/>
+          <w:szCs w:val="21"/>
+        </w:rPr>
+        <w:t>should not fundamentally change the attribution.</w:t>
       </w:r>
     </w:p>
     <w:p>
@@ -1309,18 +2769,45 @@
           <w:numId w:val="9"/>
         </w:numPr>
         <w:jc w:val="both"/>
-      </w:pPr>
-      <w:r>
+        <w:rPr>
+          <w:sz w:val="21"/>
+          <w:szCs w:val="21"/>
+        </w:rPr>
+      </w:pPr>
+      <w:r>
+        <w:rPr>
+          <w:sz w:val="21"/>
+          <w:szCs w:val="21"/>
+        </w:rPr>
         <w:t xml:space="preserve">Sensitivity </w:t>
       </w:r>
       <w:r>
-        <w:t xml:space="preserve">– This </w:t>
-      </w:r>
-      <w:r>
-        <w:t xml:space="preserve">relates to </w:t>
-      </w:r>
-      <w:r>
-        <w:t>non-zero attribution, not invariance</w:t>
+        <w:rPr>
+          <w:sz w:val="21"/>
+          <w:szCs w:val="21"/>
+        </w:rPr>
+        <w:t xml:space="preserve">– </w:t>
+      </w:r>
+      <w:r>
+        <w:rPr>
+          <w:sz w:val="21"/>
+          <w:szCs w:val="21"/>
+        </w:rPr>
+        <w:t>Relies on</w:t>
+      </w:r>
+      <w:r>
+        <w:rPr>
+          <w:sz w:val="21"/>
+          <w:szCs w:val="21"/>
+        </w:rPr>
+        <w:t xml:space="preserve"> non-zero attribution</w:t>
+      </w:r>
+      <w:r>
+        <w:rPr>
+          <w:sz w:val="21"/>
+          <w:szCs w:val="21"/>
+        </w:rPr>
+        <w:t xml:space="preserve"> for changes</w:t>
       </w:r>
     </w:p>
     <w:p>
@@ -1331,15 +2818,31 @@
           <w:numId w:val="9"/>
         </w:numPr>
         <w:jc w:val="both"/>
-      </w:pPr>
-      <w:r>
+        <w:rPr>
+          <w:sz w:val="21"/>
+          <w:szCs w:val="21"/>
+        </w:rPr>
+      </w:pPr>
+      <w:r>
+        <w:rPr>
+          <w:sz w:val="21"/>
+          <w:szCs w:val="21"/>
+        </w:rPr>
         <w:t xml:space="preserve">Implementation Invariance </w:t>
       </w:r>
       <w:r>
-        <w:t xml:space="preserve">– This </w:t>
-      </w:r>
-      <w:r>
-        <w:t>relates to whether two models function in the same way</w:t>
+        <w:rPr>
+          <w:sz w:val="21"/>
+          <w:szCs w:val="21"/>
+        </w:rPr>
+        <w:t xml:space="preserve">– </w:t>
+      </w:r>
+      <w:r>
+        <w:rPr>
+          <w:sz w:val="21"/>
+          <w:szCs w:val="21"/>
+        </w:rPr>
+        <w:t>Compares two different models</w:t>
       </w:r>
     </w:p>
     <w:p>
@@ -1350,59 +2853,143 @@
           <w:numId w:val="9"/>
         </w:numPr>
         <w:jc w:val="both"/>
-      </w:pPr>
-      <w:r>
+        <w:rPr>
+          <w:sz w:val="21"/>
+          <w:szCs w:val="21"/>
+        </w:rPr>
+      </w:pPr>
+      <w:r>
+        <w:rPr>
+          <w:sz w:val="21"/>
+          <w:szCs w:val="21"/>
+        </w:rPr>
         <w:t>Completeness</w:t>
       </w:r>
       <w:r>
+        <w:rPr>
+          <w:sz w:val="21"/>
+          <w:szCs w:val="21"/>
+        </w:rPr>
         <w:t xml:space="preserve"> </w:t>
       </w:r>
       <w:r>
+        <w:rPr>
+          <w:sz w:val="21"/>
+          <w:szCs w:val="21"/>
+        </w:rPr>
         <w:t>–</w:t>
       </w:r>
       <w:r>
+        <w:rPr>
+          <w:sz w:val="21"/>
+          <w:szCs w:val="21"/>
+        </w:rPr>
         <w:t xml:space="preserve"> </w:t>
       </w:r>
       <w:r>
+        <w:rPr>
+          <w:sz w:val="21"/>
+          <w:szCs w:val="21"/>
+        </w:rPr>
         <w:t>Relates to the attribution totals</w:t>
       </w:r>
     </w:p>
     <w:p>
       <w:pPr>
         <w:jc w:val="both"/>
+        <w:rPr>
+          <w:sz w:val="21"/>
+          <w:szCs w:val="21"/>
+        </w:rPr>
       </w:pPr>
       <w:r>
         <w:rPr>
           <w:b/>
           <w:bCs/>
+          <w:sz w:val="21"/>
+          <w:szCs w:val="21"/>
         </w:rPr>
         <w:t>Pitfall:</w:t>
       </w:r>
       <w:r>
-        <w:t xml:space="preserve"> </w:t>
-      </w:r>
-      <w:r>
-        <w:t>Mixing invariance with unrelated mathematical properties.</w:t>
-      </w:r>
-    </w:p>
-    <w:p>
-      <w:pPr>
-        <w:jc w:val="both"/>
+        <w:rPr>
+          <w:sz w:val="21"/>
+          <w:szCs w:val="21"/>
+        </w:rPr>
+        <w:t xml:space="preserve"> Mixing invariance with unrelated mathematical properties.</w:t>
+      </w:r>
+    </w:p>
+    <w:p>
+      <w:pPr>
+        <w:jc w:val="both"/>
+        <w:rPr>
+          <w:sz w:val="21"/>
+          <w:szCs w:val="21"/>
+        </w:rPr>
       </w:pPr>
       <w:r>
         <w:rPr>
           <w:b/>
           <w:bCs/>
+          <w:sz w:val="21"/>
+          <w:szCs w:val="21"/>
         </w:rPr>
         <w:t>Question 9:</w:t>
       </w:r>
       <w:r>
+        <w:rPr>
+          <w:sz w:val="21"/>
+          <w:szCs w:val="21"/>
+        </w:rPr>
         <w:t xml:space="preserve"> </w:t>
       </w:r>
       <w:r>
-        <w:t>Why can saliency maps sometimes highlight edges or textures even when the model is randomized</w:t>
-      </w:r>
-      <w:r>
+        <w:rPr>
+          <w:sz w:val="21"/>
+          <w:szCs w:val="21"/>
+        </w:rPr>
+        <w:t xml:space="preserve">Why </w:t>
+      </w:r>
+      <w:r>
+        <w:rPr>
+          <w:sz w:val="21"/>
+          <w:szCs w:val="21"/>
+        </w:rPr>
+        <w:t>do</w:t>
+      </w:r>
+      <w:r>
+        <w:rPr>
+          <w:sz w:val="21"/>
+          <w:szCs w:val="21"/>
+        </w:rPr>
+        <w:t xml:space="preserve"> saliency maps sometimes </w:t>
+      </w:r>
+      <w:r>
+        <w:rPr>
+          <w:sz w:val="21"/>
+          <w:szCs w:val="21"/>
+        </w:rPr>
+        <w:t xml:space="preserve">show </w:t>
+      </w:r>
+      <w:r>
+        <w:rPr>
+          <w:sz w:val="21"/>
+          <w:szCs w:val="21"/>
+        </w:rPr>
+        <w:t xml:space="preserve">edges </w:t>
+      </w:r>
+      <w:r>
+        <w:rPr>
+          <w:sz w:val="21"/>
+          <w:szCs w:val="21"/>
+        </w:rPr>
+        <w:t>on a randomized model</w:t>
+      </w:r>
+      <w:r>
+        <w:rPr>
+          <w:sz w:val="21"/>
+          <w:szCs w:val="21"/>
+        </w:rPr>
         <w:t>?</w:t>
       </w:r>
     </w:p>
@@ -1417,19 +3004,25 @@
         <w:rPr>
           <w:i/>
           <w:iCs/>
-        </w:rPr>
-      </w:pPr>
-      <w:r>
-        <w:rPr>
-          <w:i/>
-          <w:iCs/>
-        </w:rPr>
-        <w:t>Because they behave like edge detectors and may not depend on learned model parameters</w:t>
-      </w:r>
-      <w:r>
-        <w:rPr>
-          <w:i/>
-          <w:iCs/>
+          <w:sz w:val="21"/>
+          <w:szCs w:val="21"/>
+        </w:rPr>
+      </w:pPr>
+      <w:r>
+        <w:rPr>
+          <w:i/>
+          <w:iCs/>
+          <w:sz w:val="21"/>
+          <w:szCs w:val="21"/>
+        </w:rPr>
+        <w:t>Model-independent behaviour</w:t>
+      </w:r>
+      <w:r>
+        <w:rPr>
+          <w:i/>
+          <w:iCs/>
+          <w:sz w:val="21"/>
+          <w:szCs w:val="21"/>
         </w:rPr>
         <w:t>.</w:t>
       </w:r>
@@ -1437,13 +3030,35 @@
         <w:rPr>
           <w:i/>
           <w:iCs/>
-        </w:rPr>
-        <w:t xml:space="preserve"> (Correct Answer)</w:t>
-      </w:r>
-      <w:r>
-        <w:rPr>
-          <w:i/>
-          <w:iCs/>
+          <w:sz w:val="21"/>
+          <w:szCs w:val="21"/>
+        </w:rPr>
+        <w:t xml:space="preserve"> (</w:t>
+      </w:r>
+      <w:r>
+        <w:rPr>
+          <w:i/>
+          <w:iCs/>
+          <w:sz w:val="21"/>
+          <w:szCs w:val="21"/>
+        </w:rPr>
+        <w:t>Key</w:t>
+      </w:r>
+      <w:r>
+        <w:rPr>
+          <w:i/>
+          <w:iCs/>
+          <w:sz w:val="21"/>
+          <w:szCs w:val="21"/>
+        </w:rPr>
+        <w:t>)</w:t>
+      </w:r>
+      <w:r>
+        <w:rPr>
+          <w:i/>
+          <w:iCs/>
+          <w:sz w:val="21"/>
+          <w:szCs w:val="21"/>
         </w:rPr>
         <w:t xml:space="preserve"> </w:t>
       </w:r>
@@ -1451,6 +3066,8 @@
         <w:rPr>
           <w:i/>
           <w:iCs/>
+          <w:sz w:val="21"/>
+          <w:szCs w:val="21"/>
         </w:rPr>
         <w:t>–</w:t>
       </w:r>
@@ -1458,15 +3075,37 @@
         <w:rPr>
           <w:i/>
           <w:iCs/>
-        </w:rPr>
-        <w:t xml:space="preserve"> </w:t>
-      </w:r>
-      <w:r>
-        <w:rPr>
-          <w:i/>
-          <w:iCs/>
-        </w:rPr>
-        <w:t>As seen in the paper by Adebayo et. al, some saliency methods produce visually similar outputs even when the model is random.</w:t>
+          <w:sz w:val="21"/>
+          <w:szCs w:val="21"/>
+        </w:rPr>
+        <w:t xml:space="preserve"> S</w:t>
+      </w:r>
+      <w:r>
+        <w:rPr>
+          <w:i/>
+          <w:iCs/>
+          <w:sz w:val="21"/>
+          <w:szCs w:val="21"/>
+        </w:rPr>
+        <w:t xml:space="preserve">ome methods </w:t>
+      </w:r>
+      <w:r>
+        <w:rPr>
+          <w:i/>
+          <w:iCs/>
+          <w:sz w:val="21"/>
+          <w:szCs w:val="21"/>
+        </w:rPr>
+        <w:t>act like edge detectors rather than showing learned features</w:t>
+      </w:r>
+      <w:r>
+        <w:rPr>
+          <w:i/>
+          <w:iCs/>
+          <w:sz w:val="21"/>
+          <w:szCs w:val="21"/>
+        </w:rPr>
+        <w:t>.</w:t>
       </w:r>
     </w:p>
     <w:p>
@@ -1477,18 +3116,17 @@
           <w:numId w:val="10"/>
         </w:numPr>
         <w:jc w:val="both"/>
-      </w:pPr>
-      <w:r>
-        <w:t xml:space="preserve">Because gradients are only </w:t>
-      </w:r>
-      <w:r>
-        <w:t>computed at the output layer</w:t>
-      </w:r>
-      <w:r>
-        <w:t xml:space="preserve"> – This is </w:t>
-      </w:r>
-      <w:r>
-        <w:t>not true</w:t>
+        <w:rPr>
+          <w:sz w:val="21"/>
+          <w:szCs w:val="21"/>
+        </w:rPr>
+      </w:pPr>
+      <w:r>
+        <w:rPr>
+          <w:sz w:val="21"/>
+          <w:szCs w:val="21"/>
+        </w:rPr>
+        <w:t>Output-only computation: Gradients are back-propagated, not just at the output.</w:t>
       </w:r>
     </w:p>
     <w:p>
@@ -1499,9 +3137,17 @@
           <w:numId w:val="10"/>
         </w:numPr>
         <w:jc w:val="both"/>
-      </w:pPr>
-      <w:r>
-        <w:t>Because the model ignores pixel values during inference – This is false</w:t>
+        <w:rPr>
+          <w:sz w:val="21"/>
+          <w:szCs w:val="21"/>
+        </w:rPr>
+      </w:pPr>
+      <w:r>
+        <w:rPr>
+          <w:sz w:val="21"/>
+          <w:szCs w:val="21"/>
+        </w:rPr>
+        <w:t>Pixel ignoring: Models must process pixels to generate gradients.</w:t>
       </w:r>
     </w:p>
     <w:p>
@@ -1512,51 +3158,111 @@
           <w:numId w:val="10"/>
         </w:numPr>
         <w:jc w:val="both"/>
-      </w:pPr>
-      <w:r>
-        <w:t>Because saliency maps always use pre-trained feature extractors – Not necessarily true</w:t>
-      </w:r>
-    </w:p>
-    <w:p>
-      <w:pPr>
-        <w:jc w:val="both"/>
+        <w:rPr>
+          <w:sz w:val="21"/>
+          <w:szCs w:val="21"/>
+        </w:rPr>
+      </w:pPr>
+      <w:r>
+        <w:rPr>
+          <w:sz w:val="21"/>
+          <w:szCs w:val="21"/>
+        </w:rPr>
+        <w:t>P</w:t>
+      </w:r>
+      <w:r>
+        <w:rPr>
+          <w:sz w:val="21"/>
+          <w:szCs w:val="21"/>
+        </w:rPr>
+        <w:t xml:space="preserve">re-trained feature extractors – </w:t>
+      </w:r>
+      <w:r>
+        <w:rPr>
+          <w:sz w:val="21"/>
+          <w:szCs w:val="21"/>
+        </w:rPr>
+        <w:t>These issues occur even without pre-training.</w:t>
+      </w:r>
+    </w:p>
+    <w:p>
+      <w:pPr>
+        <w:jc w:val="both"/>
+        <w:rPr>
+          <w:sz w:val="21"/>
+          <w:szCs w:val="21"/>
+        </w:rPr>
       </w:pPr>
       <w:r>
         <w:rPr>
           <w:b/>
           <w:bCs/>
-        </w:rPr>
-        <w:lastRenderedPageBreak/>
+          <w:sz w:val="21"/>
+          <w:szCs w:val="21"/>
+        </w:rPr>
         <w:t>Pitfall:</w:t>
       </w:r>
       <w:r>
+        <w:rPr>
+          <w:sz w:val="21"/>
+          <w:szCs w:val="21"/>
+        </w:rPr>
         <w:t xml:space="preserve"> </w:t>
       </w:r>
       <w:r>
+        <w:rPr>
+          <w:sz w:val="21"/>
+          <w:szCs w:val="21"/>
+        </w:rPr>
         <w:t>Assuming visual quality implies meaningful explanation.</w:t>
       </w:r>
     </w:p>
     <w:p>
       <w:pPr>
         <w:jc w:val="both"/>
+        <w:rPr>
+          <w:sz w:val="21"/>
+          <w:szCs w:val="21"/>
+        </w:rPr>
       </w:pPr>
       <w:r>
         <w:rPr>
           <w:b/>
           <w:bCs/>
+          <w:sz w:val="21"/>
+          <w:szCs w:val="21"/>
         </w:rPr>
         <w:t>Question 10:</w:t>
       </w:r>
       <w:r>
-        <w:t xml:space="preserve"> What happens to the visual coherence of </w:t>
+        <w:rPr>
+          <w:sz w:val="21"/>
+          <w:szCs w:val="21"/>
+        </w:rPr>
+        <w:t xml:space="preserve"> What happens to the </w:t>
       </w:r>
       <w:proofErr w:type="spellStart"/>
       <w:r>
+        <w:rPr>
+          <w:sz w:val="21"/>
+          <w:szCs w:val="21"/>
+        </w:rPr>
         <w:t>SmoothGrad</w:t>
       </w:r>
       <w:proofErr w:type="spellEnd"/>
       <w:r>
-        <w:t xml:space="preserve"> sensitivity maps as the sample size n increases?</w:t>
+        <w:rPr>
+          <w:sz w:val="21"/>
+          <w:szCs w:val="21"/>
+        </w:rPr>
+        <w:t xml:space="preserve"> coherence </w:t>
+      </w:r>
+      <w:r>
+        <w:rPr>
+          <w:sz w:val="21"/>
+          <w:szCs w:val="21"/>
+        </w:rPr>
+        <w:t>as the sample size n increases?</w:t>
       </w:r>
     </w:p>
     <w:p>
@@ -1567,26 +3273,31 @@
           <w:numId w:val="11"/>
         </w:numPr>
         <w:jc w:val="both"/>
-      </w:pPr>
-      <w:r>
-        <w:t>The maps become increasingly noisy as more random perturbations are added.</w:t>
-      </w:r>
-      <w:r>
-        <w:t xml:space="preserve"> – This is not true as through </w:t>
-      </w:r>
-      <w:proofErr w:type="spellStart"/>
-      <w:r>
-        <w:t>SmoothGrad</w:t>
-      </w:r>
-      <w:proofErr w:type="spellEnd"/>
-      <w:r>
-        <w:t xml:space="preserve">, the process of averaging </w:t>
-      </w:r>
-      <w:r>
-        <w:t>sensitivity maps of an image</w:t>
-      </w:r>
-      <w:r>
-        <w:t>, reduces noise</w:t>
+        <w:rPr>
+          <w:sz w:val="21"/>
+          <w:szCs w:val="21"/>
+        </w:rPr>
+      </w:pPr>
+      <w:r>
+        <w:rPr>
+          <w:sz w:val="21"/>
+          <w:szCs w:val="21"/>
+        </w:rPr>
+        <w:t>Increased noise</w:t>
+      </w:r>
+      <w:r>
+        <w:rPr>
+          <w:sz w:val="21"/>
+          <w:szCs w:val="21"/>
+        </w:rPr>
+        <w:t xml:space="preserve"> – </w:t>
+      </w:r>
+      <w:r>
+        <w:rPr>
+          <w:sz w:val="21"/>
+          <w:szCs w:val="21"/>
+        </w:rPr>
+        <w:t>This is the opposite as more samples decrease noise through averaging</w:t>
       </w:r>
     </w:p>
     <w:p>
@@ -1597,12 +3308,45 @@
           <w:numId w:val="11"/>
         </w:numPr>
         <w:jc w:val="both"/>
-      </w:pPr>
-      <w:r>
-        <w:t>The maps eventually vanish to black because the average gradient becomes zero.</w:t>
-      </w:r>
-      <w:r>
-        <w:t xml:space="preserve"> – This is not expected mathematically</w:t>
+        <w:rPr>
+          <w:sz w:val="21"/>
+          <w:szCs w:val="21"/>
+        </w:rPr>
+      </w:pPr>
+      <w:r>
+        <w:rPr>
+          <w:sz w:val="21"/>
+          <w:szCs w:val="21"/>
+        </w:rPr>
+        <w:t>Vanish to black</w:t>
+      </w:r>
+      <w:r>
+        <w:rPr>
+          <w:sz w:val="21"/>
+          <w:szCs w:val="21"/>
+        </w:rPr>
+        <w:t xml:space="preserve"> – This </w:t>
+      </w:r>
+      <w:r>
+        <w:rPr>
+          <w:sz w:val="21"/>
+          <w:szCs w:val="21"/>
+        </w:rPr>
+        <w:t xml:space="preserve">is </w:t>
+      </w:r>
+      <w:r>
+        <w:rPr>
+          <w:sz w:val="21"/>
+          <w:szCs w:val="21"/>
+        </w:rPr>
+        <w:t>mathematically</w:t>
+      </w:r>
+      <w:r>
+        <w:rPr>
+          <w:sz w:val="21"/>
+          <w:szCs w:val="21"/>
+        </w:rPr>
+        <w:t xml:space="preserve"> incorrect for this process</w:t>
       </w:r>
     </w:p>
     <w:p>
@@ -1613,12 +3357,45 @@
           <w:numId w:val="11"/>
         </w:numPr>
         <w:jc w:val="both"/>
-      </w:pPr>
-      <w:r>
-        <w:t>They become sharper only if the noise level σ is also increased simultaneously.</w:t>
-      </w:r>
-      <w:r>
-        <w:t xml:space="preserve"> – This is incorrect due to independent hyperparameters</w:t>
+        <w:rPr>
+          <w:sz w:val="21"/>
+          <w:szCs w:val="21"/>
+        </w:rPr>
+      </w:pPr>
+      <w:r>
+        <w:rPr>
+          <w:sz w:val="21"/>
+          <w:szCs w:val="21"/>
+        </w:rPr>
+        <w:t xml:space="preserve">Sharpness vs </w:t>
+      </w:r>
+      <w:r>
+        <w:rPr>
+          <w:sz w:val="21"/>
+          <w:szCs w:val="21"/>
+        </w:rPr>
+        <w:t>noise level σ</w:t>
+      </w:r>
+      <w:r>
+        <w:rPr>
+          <w:sz w:val="21"/>
+          <w:szCs w:val="21"/>
+        </w:rPr>
+        <w:t xml:space="preserve"> </w:t>
+      </w:r>
+      <w:r>
+        <w:rPr>
+          <w:sz w:val="21"/>
+          <w:szCs w:val="21"/>
+        </w:rPr>
+        <w:t xml:space="preserve">– </w:t>
+      </w:r>
+      <w:r>
+        <w:rPr>
+          <w:sz w:val="21"/>
+          <w:szCs w:val="21"/>
+        </w:rPr>
+        <w:t>Sharpness is a result of averaging, not just scaling σ.</w:t>
       </w:r>
     </w:p>
     <w:p>
@@ -1630,46 +3407,111 @@
         </w:numPr>
         <w:jc w:val="both"/>
         <w:rPr>
-          <w:i/>
-          <w:iCs/>
-        </w:rPr>
-      </w:pPr>
-      <w:r>
-        <w:rPr>
-          <w:i/>
-          <w:iCs/>
-        </w:rPr>
-        <w:t>They become smoother and more coherent, but with diminishing returns after n &gt; 50. (Correct Answer)</w:t>
-      </w:r>
-      <w:r>
-        <w:rPr>
-          <w:i/>
-          <w:iCs/>
-        </w:rPr>
-        <w:t xml:space="preserve"> – As n increases, the approximation of the local average is improved but the visual improvement levels off after 50 samples.</w:t>
-      </w:r>
-    </w:p>
-    <w:p>
-      <w:pPr>
-        <w:jc w:val="both"/>
+          <w:sz w:val="21"/>
+          <w:szCs w:val="21"/>
+        </w:rPr>
+      </w:pPr>
+      <w:r>
+        <w:rPr>
+          <w:i/>
+          <w:iCs/>
+          <w:sz w:val="21"/>
+          <w:szCs w:val="21"/>
+        </w:rPr>
+        <w:t>D</w:t>
+      </w:r>
+      <w:r>
+        <w:rPr>
+          <w:i/>
+          <w:iCs/>
+          <w:sz w:val="21"/>
+          <w:szCs w:val="21"/>
+        </w:rPr>
+        <w:t>iminishing returns after n &gt; 50. (</w:t>
+      </w:r>
+      <w:r>
+        <w:rPr>
+          <w:i/>
+          <w:iCs/>
+          <w:sz w:val="21"/>
+          <w:szCs w:val="21"/>
+        </w:rPr>
+        <w:t>Key</w:t>
+      </w:r>
+      <w:r>
+        <w:rPr>
+          <w:i/>
+          <w:iCs/>
+          <w:sz w:val="21"/>
+          <w:szCs w:val="21"/>
+        </w:rPr>
+        <w:t>)</w:t>
+      </w:r>
+      <w:r>
+        <w:rPr>
+          <w:i/>
+          <w:iCs/>
+          <w:sz w:val="21"/>
+          <w:szCs w:val="21"/>
+        </w:rPr>
+        <w:t xml:space="preserve"> – </w:t>
+      </w:r>
+      <w:r>
+        <w:rPr>
+          <w:i/>
+          <w:iCs/>
+          <w:sz w:val="21"/>
+          <w:szCs w:val="21"/>
+        </w:rPr>
+        <w:t>Maps get clearer a</w:t>
+      </w:r>
+      <w:r>
+        <w:rPr>
+          <w:i/>
+          <w:iCs/>
+          <w:sz w:val="21"/>
+          <w:szCs w:val="21"/>
+        </w:rPr>
+        <w:t xml:space="preserve">s </w:t>
+      </w:r>
+      <w:r>
+        <w:rPr>
+          <w:i/>
+          <w:iCs/>
+          <w:sz w:val="21"/>
+          <w:szCs w:val="21"/>
+        </w:rPr>
+        <w:t>you average more trials, but the benefit levels off</w:t>
+      </w:r>
+    </w:p>
+    <w:p>
+      <w:pPr>
+        <w:jc w:val="both"/>
+        <w:rPr>
+          <w:sz w:val="21"/>
+          <w:szCs w:val="21"/>
+        </w:rPr>
       </w:pPr>
       <w:r>
         <w:rPr>
           <w:b/>
           <w:bCs/>
+          <w:sz w:val="21"/>
+          <w:szCs w:val="21"/>
         </w:rPr>
         <w:t>Pitfall:</w:t>
       </w:r>
       <w:r>
-        <w:t xml:space="preserve"> </w:t>
-      </w:r>
-      <w:r>
-        <w:t>Assuming “more noise inputs = noisier output” instead of averaging effect.</w:t>
+        <w:rPr>
+          <w:sz w:val="21"/>
+          <w:szCs w:val="21"/>
+        </w:rPr>
+        <w:t xml:space="preserve"> Assuming “more noise inputs = noisier output” instead of averaging effect.</w:t>
       </w:r>
     </w:p>
     <w:sectPr>
       <w:pgSz w:w="11906" w:h="16838"/>
-      <w:pgMar w:top="1440" w:right="1440" w:bottom="1440" w:left="1440" w:header="708" w:footer="708" w:gutter="0"/>
+      <w:pgMar w:top="964" w:right="1440" w:bottom="964" w:left="1440" w:header="709" w:footer="709" w:gutter="0"/>
       <w:cols w:space="708"/>
       <w:docGrid w:linePitch="360"/>
     </w:sectPr>
@@ -3298,7 +5140,6 @@
   <w:style w:type="character" w:default="1" w:styleId="DefaultParagraphFont">
     <w:name w:val="Default Paragraph Font"/>
     <w:uiPriority w:val="1"/>
-    <w:semiHidden/>
     <w:unhideWhenUsed/>
   </w:style>
   <w:style w:type="table" w:default="1" w:styleId="TableNormal">

</xml_diff>

<commit_message>
Added AI Usage Journal and Edited Study Notes and Quiz
</commit_message>
<xml_diff>
--- a/Quiz.docx
+++ b/Quiz.docx
@@ -345,21 +345,7 @@
           <w:sz w:val="21"/>
           <w:szCs w:val="21"/>
         </w:rPr>
-        <w:t xml:space="preserve">Confuses </w:t>
-      </w:r>
-      <w:r>
-        <w:rPr>
-          <w:sz w:val="21"/>
-          <w:szCs w:val="21"/>
-        </w:rPr>
-        <w:t xml:space="preserve">internal model structure with external input </w:t>
-      </w:r>
-      <w:r>
-        <w:rPr>
-          <w:sz w:val="21"/>
-          <w:szCs w:val="21"/>
-        </w:rPr>
-        <w:t>behaviour.</w:t>
+        <w:t>Confuses internal model structure with external input behaviour.</w:t>
       </w:r>
     </w:p>
     <w:p>
@@ -733,7 +719,14 @@
           <w:sz w:val="21"/>
           <w:szCs w:val="21"/>
         </w:rPr>
-        <w:t xml:space="preserve">Applying a </w:t>
+        <w:t>Placing</w:t>
+      </w:r>
+      <w:r>
+        <w:rPr>
+          <w:sz w:val="21"/>
+          <w:szCs w:val="21"/>
+        </w:rPr>
+        <w:t xml:space="preserve"> a </w:t>
       </w:r>
       <w:r>
         <w:rPr>
@@ -1529,7 +1522,21 @@
           <w:sz w:val="21"/>
           <w:szCs w:val="21"/>
         </w:rPr>
-        <w:t xml:space="preserve"> Which </w:t>
+        <w:t xml:space="preserve"> </w:t>
+      </w:r>
+      <w:r>
+        <w:rPr>
+          <w:sz w:val="21"/>
+          <w:szCs w:val="21"/>
+        </w:rPr>
+        <w:t xml:space="preserve">Which </w:t>
+      </w:r>
+      <w:r>
+        <w:rPr>
+          <w:sz w:val="21"/>
+          <w:szCs w:val="21"/>
+        </w:rPr>
+        <w:t xml:space="preserve">specific parameter handles the intensity of the Gaussian noise in </w:t>
       </w:r>
       <w:proofErr w:type="spellStart"/>
       <w:r>
@@ -1540,20 +1547,6 @@
         <w:t>SmoothGrad</w:t>
       </w:r>
       <w:proofErr w:type="spellEnd"/>
-      <w:r>
-        <w:rPr>
-          <w:sz w:val="21"/>
-          <w:szCs w:val="21"/>
-        </w:rPr>
-        <w:t xml:space="preserve"> </w:t>
-      </w:r>
-      <w:r>
-        <w:rPr>
-          <w:sz w:val="21"/>
-          <w:szCs w:val="21"/>
-        </w:rPr>
-        <w:t>parameter controls the noise intensity</w:t>
-      </w:r>
       <w:r>
         <w:rPr>
           <w:sz w:val="21"/>
@@ -1681,16 +1674,7 @@
           <w:sz w:val="21"/>
           <w:szCs w:val="21"/>
         </w:rPr>
-        <w:t>perturbatio</w:t>
-      </w:r>
-      <w:r>
-        <w:rPr>
-          <w:i/>
-          <w:iCs/>
-          <w:sz w:val="21"/>
-          <w:szCs w:val="21"/>
-        </w:rPr>
-        <w:t xml:space="preserve">n </w:t>
+        <w:t xml:space="preserve">perturbation </w:t>
       </w:r>
       <w:r>
         <w:rPr>

</xml_diff>